<commit_message>
Introdução e discussão reforçadas com citações atuais (2022-2025)
Acrescenta seis referências recentes e verificadas no PubMed: monitoramento
em handebol (Henze et al., 2025), perfis de humor e agrupamento (Parsons-Smith
et al., 2022; Houison et al., 2024), carga e humor na pré-temporada de
esportes coletivos (Conte & Kamarauskas, 2022; Martin-Garetxana et al., 2023)
e revisão de estresse e bem-estar no voleibol (Rebelo et al., 2024). Amplia a
introdução (monitoramento no handebol, seis perfis de humor, criticidade da
pré-temporada) e a discussão (padrao de piora do humor na pre-temporada,
significado da migracao do iceberg, esforco de padronizacao do monitoramento).
Referências passam de 16 para 22.

Co-Authored-By: Claude Opus 4.8 <noreply@anthropic.com>
Claude-Session: https://claude.ai/code/session_01P7yGiDeoGDyjWvPWQVsUrj
</commit_message>
<xml_diff>
--- a/Artigos/Estudo_Humor_Handebol_Completo.docx
+++ b/Artigos/Estudo_Humor_Handebol_Completo.docx
@@ -98,7 +98,7 @@
           <w:rFonts w:ascii="Times New Roman" w:hAnsi="Times New Roman"/>
           <w:sz w:val="24"/>
         </w:rPr>
-        <w:t>A pré-temporada é o período em que a equipe concentra as maiores cargas do ano, com o objetivo de reconstruir o condicionamento antes da fase competitiva. É também o intervalo de maior risco de fadiga acumulada. Por isso, o monitoramento sistemático da resposta do atleta é parte central do trabalho da comissão técnica: ajustes feitos a tempo evitam que a fadiga se acumule além do desejado e reduzem o risco de excesso de treinamento (Duignan et al., 2020).</w:t>
+        <w:t>A pré-temporada é o período em que a equipe concentra as maiores cargas do ano, com o objetivo de reconstruir o condicionamento antes da fase competitiva. É também o intervalo de maior risco de fadiga acumulada. Por isso, o monitoramento sistemático da resposta do atleta é parte central do trabalho da comissão técnica: ajustes feitos a tempo evitam que a fadiga se acumule além do desejado e reduzem o risco de excesso de treinamento (Duignan et al., 2020). No handebol, revisões recentes reforçam a necessidade de integrar carga externa, carga interna e bem-estar em rotinas estruturadas de monitoramento, ainda pouco padronizadas na modalidade (Henze et al., 2025).</w:t>
       </w:r>
     </w:p>
     <w:p>
@@ -112,7 +112,7 @@
           <w:rFonts w:ascii="Times New Roman" w:hAnsi="Times New Roman"/>
           <w:sz w:val="24"/>
         </w:rPr>
-        <w:t>Entre as ferramentas de monitoramento, os estados de humor ocupam posição de destaque por serem sensíveis, rápidos e de baixo custo. O instrumento mais utilizado com atletas é a Escala de Humor de Brunel (BRUMS), derivada do Perfil de Estados de Humor (POMS) e composta por 24 itens que formam seis dimensões: vigor, fadiga, tensão, depressão, raiva e confusão (Terry, Lane &amp; Fogarty, 2003). A escala tem propriedades psicométricas consistentes e foi validada em diversos idiomas e culturas, como o português (Rohlfs et al., 2008), o chinês (Zhang et al., 2014), o lituano (Terry et al., 2022) e o malaio (Lew et al., 2023). Em atletas bem recuperados, o BRUMS descreve o chamado perfil de iceberg, no qual o vigor se sobrepõe às dimensões negativas; a inversão desse perfil sinaliza fadiga e risco psicológico.</w:t>
+        <w:t>Entre as ferramentas de monitoramento, os estados de humor ocupam posição de destaque por serem sensíveis, rápidos e de baixo custo. O instrumento mais utilizado com atletas é a Escala de Humor de Brunel (BRUMS), derivada do Perfil de Estados de Humor (POMS) e composta por 24 itens que formam seis dimensões: vigor, fadiga, tensão, depressão, raiva e confusão (Terry, Lane &amp; Fogarty, 2003). A escala tem propriedades psicométricas consistentes e foi validada em diversos idiomas e culturas, como o português (Rohlfs et al., 2008), o chinês (Zhang et al., 2014), o lituano (Terry et al., 2022) e o malaio (Lew et al., 2023). Em atletas bem recuperados, o BRUMS descreve o chamado perfil de iceberg, no qual o vigor se sobrepõe às dimensões negativas e que se associa a boa saúde mental e a melhor desempenho (Houison et al., 2024). Estudos recentes com análise de agrupamento identificam de forma consistente seis perfis de humor distintos, do iceberg ao Everest invertido, cuja prevalência informa o risco psicológico do atleta (Parsons-Smith et al., 2022); a inversão do perfil de iceberg sinaliza fadiga e alerta de sobrecarga.</w:t>
       </w:r>
     </w:p>
     <w:p>
@@ -126,7 +126,7 @@
           <w:rFonts w:ascii="Times New Roman" w:hAnsi="Times New Roman"/>
           <w:sz w:val="24"/>
         </w:rPr>
-        <w:t>Em esportes coletivos, o acompanhamento do humor tem se mostrado útil para orientar decisões de treino. Revisões recentes indicam que os escores de humor variam de acordo com a carga, a intensidade e a modalidade das sessões, e que o monitoramento frequente ajuda a detectar sinais precoces de perturbação psicológica (Selmi et al., 2023). Medidas subjetivas de bem-estar, como o humor, apresentam relação predominantemente negativa com a carga de treino em atletas de esportes coletivos (Duignan et al., 2020), e essa relação também aparece em contextos de treinamento intensificado, como campos de treinamento e microciclos de alta exigência (Chen et al., 2022).</w:t>
+        <w:t>Em esportes coletivos, o acompanhamento do humor tem se mostrado útil para orientar decisões de treino. Revisões recentes indicam que os escores de humor variam de acordo com a carga, a intensidade e a modalidade das sessões, e que o monitoramento frequente ajuda a detectar sinais precoces de perturbação psicológica (Selmi et al., 2023; Rebelo et al., 2024). Medidas subjetivas de bem-estar, como o humor, apresentam relação predominantemente negativa com a carga de treino em atletas de esportes coletivos (Duignan et al., 2020), e essa relação também aparece em contextos de treinamento intensificado, como campos de treinamento e microciclos de alta exigência (Chen et al., 2022). A pré-temporada é especialmente crítica: em basquetebol e em futebol profissionais, o humor piora e o estresse aumenta à medida que a carga se acumula ao longo das semanas de preparação (Conte &amp; Kamarauskas, 2022; Martin-Garetxana et al., 2023).</w:t>
       </w:r>
     </w:p>
     <w:p>
@@ -10903,7 +10903,7 @@
           <w:rFonts w:ascii="Times New Roman" w:hAnsi="Times New Roman"/>
           <w:sz w:val="24"/>
         </w:rPr>
-        <w:t>O achado mais robusto foi a combinação de queda do vigor e aumento da fadiga física, esta última com o maior tamanho de efeito. Esse padrão é coerente com o propósito da pré-temporada, período planejado para impor carga, e com a natureza intermitente e de alta intensidade do handebol, que exige elevada solicitação aeróbia e neuromuscular (Pueo et al., 2017; Cartón-Llorente et al., 2023). A literatura de monitoramento em esportes coletivos descreve exatamente essa resposta: a carga de treino relaciona-se de forma negativa com o vigor e positiva com a fadiga (Duignan et al., 2020; Selmi et al., 2023). A análise das derivadas mostrou que a queda do vigor foi mais rápida no início da semana e apresentou ponto de inflexão na sua metade, sinal de estabilização da resposta. Do ponto de vista prático, o vigor se confirma como o indicador mais sensível para acompanhar o desgaste.</w:t>
+        <w:t>O achado mais robusto foi a combinação de queda do vigor e aumento da fadiga física, esta última com o maior tamanho de efeito. Esse padrão é coerente com o propósito da pré-temporada, período planejado para impor carga, e com a natureza intermitente e de alta intensidade do handebol, que exige elevada solicitação aeróbia e neuromuscular (Pueo et al., 2017; Cartón-Llorente et al., 2023). A literatura de monitoramento em esportes coletivos descreve exatamente essa resposta: a carga de treino relaciona-se de forma negativa com o vigor e positiva com a fadiga (Duignan et al., 2020; Selmi et al., 2023). O mesmo padrão foi observado na pré-temporada de outras modalidades coletivas, em que o humor piora e o estresse cresce conforme a carga se acumula ao longo das semanas (Conte &amp; Kamarauskas, 2022; Martin-Garetxana et al., 2023). A análise das derivadas mostrou que a queda do vigor foi mais rápida no início da semana e apresentou ponto de inflexão na sua metade, sinal de estabilização da resposta. Do ponto de vista prático, o vigor se confirma como o indicador mais sensível para acompanhar o desgaste.</w:t>
       </w:r>
     </w:p>
     <w:p>
@@ -10959,7 +10959,7 @@
           <w:rFonts w:ascii="Times New Roman" w:hAnsi="Times New Roman"/>
           <w:sz w:val="24"/>
         </w:rPr>
-        <w:t>A migração de perfis descreve, em linguagem intuitiva para a comissão técnica, o mesmo fenômeno observado nas dimensões isoladas. O predomínio inicial do perfil iceberg, com o vigor sobreposto às dimensões negativas, deu lugar a perfis de menor energia, como a barbatana de tubarão. A maior parte dos atletas mudou de perfil ao longo da semana, o que confirma a sensibilidade do humor à carga e sustenta o uso do perfil como recurso de comunicação rápida do estado do grupo, em linha com a proposta original da escala (Terry, Lane &amp; Fogarty, 2003) e com sua ampla aplicação em atletas (Terry et al., 2022; Lew et al., 2023).</w:t>
+        <w:t>A migração de perfis descreve, em linguagem intuitiva para a comissão técnica, o mesmo fenômeno observado nas dimensões isoladas. O predomínio inicial do perfil iceberg, com o vigor sobreposto às dimensões negativas, deu lugar a perfis de menor energia, como a barbatana de tubarão. A maior parte dos atletas mudou de perfil ao longo da semana, o que confirma a sensibilidade do humor à carga e sustenta o uso do perfil como recurso de comunicação rápida do estado do grupo, em linha com a proposta original da escala (Terry, Lane &amp; Fogarty, 2003) e com sua ampla aplicação em atletas (Terry et al., 2022; Lew et al., 2023). O deslocamento do iceberg para perfis de menor energia é justamente o sinal que a literatura de perfis de humor associa a maior fadiga e a maior risco psicológico (Parsons-Smith et al., 2022; Houison et al., 2024), o que reforça o valor prático dessa leitura na pré-temporada.</w:t>
       </w:r>
     </w:p>
     <w:p>
@@ -11015,7 +11015,7 @@
           <w:rFonts w:ascii="Times New Roman" w:hAnsi="Times New Roman"/>
           <w:sz w:val="24"/>
         </w:rPr>
-        <w:t>Em conjunto, os resultados mostram que a última semana de pré-temporada produziu perda de energia e acúmulo de fadiga física, de forma acumulada ao longo dos dias, com migração da maioria dos atletas para perfis de menor vigor, e sem que a aptidão aeróbia oferecesse proteção contra essa deterioração. A principal contribuição do estudo é integrar, em um mesmo desenho, a descrição fina do humor por derivadas e limiares, a leitura por perfis e o cruzamento com a aptidão, para dar à comissão técnica um retrato claro de onde, quando e quanto o humor muda. As limitações incluem o desenho de grupo único, sem grupo controle, e o tamanho da amostra, próprio de uma equipe de elite. Estudos futuros podem acompanhar mais de um microciclo e incluir medidas objetivas de recuperação para confirmar e ampliar estes achados.</w:t>
+        <w:t>Em conjunto, os resultados mostram que a última semana de pré-temporada produziu perda de energia e acúmulo de fadiga física, de forma acumulada ao longo dos dias, com migração da maioria dos atletas para perfis de menor vigor, e sem que a aptidão aeróbia oferecesse proteção contra essa deterioração. A principal contribuição do estudo é integrar, em um mesmo desenho, a descrição fina do humor por derivadas e limiares, a leitura por perfis e o cruzamento com a aptidão, para dar à comissão técnica um retrato claro de onde, quando e quanto o humor muda. Esses resultados somam-se ao esforço recente de padronizar o monitoramento de carga e bem-estar em esportes coletivos e, em especial, no handebol (Rebelo et al., 2024; Henze et al., 2025). As limitações incluem o desenho de grupo único, sem grupo controle, e o tamanho da amostra, próprio de uma equipe de elite. Estudos futuros podem acompanhar mais de um microciclo e incluir medidas objetivas de recuperação para confirmar e ampliar estes achados.</w:t>
       </w:r>
     </w:p>
     <w:p>
@@ -11098,6 +11098,20 @@
           <w:sz w:val="22"/>
         </w:rPr>
         <w:t>Chen, Y. S., Clemente, F. M., Pagaduan, J. C., Crowley-McHattan, Z. J., Lu, Y. X., Chien, C. H., Bezerra, P., Chiu, Y. W., &amp; Kuo, C. D. (2022). Relationships between perceived measures of internal load and wellness status during overseas futsal training camps. PLoS ONE, 17(4), e0267227. https://doi.org/10.1371/journal.pone.0267227</w:t>
+      </w:r>
+    </w:p>
+    <w:p>
+      <w:pPr>
+        <w:spacing w:line="360" w:lineRule="auto" w:after="120"/>
+        <w:ind w:left="709" w:hanging="709"/>
+        <w:jc w:val="both"/>
+      </w:pPr>
+      <w:r>
+        <w:rPr>
+          <w:rFonts w:ascii="Times New Roman" w:hAnsi="Times New Roman"/>
+          <w:sz w:val="22"/>
+        </w:rPr>
+        <w:t>Conte, D., &amp; Kamarauskas, P. (2022). Differences in weekly training load, well-being, and hormonal responses between European- and national-level professional male basketball players during the pre-season phase. International Journal of Environmental Research and Public Health, 19(22), 15310. https://doi.org/10.3390/ijerph192215310</w:t>
       </w:r>
     </w:p>
     <w:p>
@@ -11195,6 +11209,34 @@
           <w:rFonts w:ascii="Times New Roman" w:hAnsi="Times New Roman"/>
           <w:sz w:val="22"/>
         </w:rPr>
+        <w:t>Henze, A. S., Kirsten, J., Matits, L., Bizjak, D. A., &amp; Schulz, S. V. W. (2025). Athlete monitoring in handball (ATHMON HB): a systematic review protocol. Systematic Reviews, 14(1), 64. https://doi.org/10.1186/s13643-025-02806-2</w:t>
+      </w:r>
+    </w:p>
+    <w:p>
+      <w:pPr>
+        <w:spacing w:line="360" w:lineRule="auto" w:after="120"/>
+        <w:ind w:left="709" w:hanging="709"/>
+        <w:jc w:val="both"/>
+      </w:pPr>
+      <w:r>
+        <w:rPr>
+          <w:rFonts w:ascii="Times New Roman" w:hAnsi="Times New Roman"/>
+          <w:sz w:val="22"/>
+        </w:rPr>
+        <w:t>Houison, R. J., Lamont-Mills, A., Kotiw, M., &amp; Terry, P. C. (2024). Strike 3 ... out! Investigating pre-game moods, performance, and mental health of softball umpires. Sports, 12(2), 50. https://doi.org/10.3390/sports12020050</w:t>
+      </w:r>
+    </w:p>
+    <w:p>
+      <w:pPr>
+        <w:spacing w:line="360" w:lineRule="auto" w:after="120"/>
+        <w:ind w:left="709" w:hanging="709"/>
+        <w:jc w:val="both"/>
+      </w:pPr>
+      <w:r>
+        <w:rPr>
+          <w:rFonts w:ascii="Times New Roman" w:hAnsi="Times New Roman"/>
+          <w:sz w:val="22"/>
+        </w:rPr>
         <w:t>Lew, P. C. F., Parsons-Smith, R. L., Lamont-Mills, A., &amp; Terry, P. C. (2023). Cross-cultural validation of the Malaysian Mood Scale and tests of between-group mood differences. International Journal of Environmental Research and Public Health, 20(4), 3348. https://doi.org/10.3390/ijerph20043348</w:t>
       </w:r>
     </w:p>
@@ -11209,7 +11251,49 @@
           <w:rFonts w:ascii="Times New Roman" w:hAnsi="Times New Roman"/>
           <w:sz w:val="22"/>
         </w:rPr>
+        <w:t>Martin-Garetxana, I., Ciaurri, J., Gil, S. M., Monasterio, X., Ugarte, A., Lekue, J. A., &amp; Larruskain, J. (2023). What are the load and wellness of young second-team football players when transitioning to the first team? A comparison of 2 consecutive preseasons. International Journal of Sports Physiology and Performance, 18(7), 726-733. https://doi.org/10.1123/ijspp.2022-0324</w:t>
+      </w:r>
+    </w:p>
+    <w:p>
+      <w:pPr>
+        <w:spacing w:line="360" w:lineRule="auto" w:after="120"/>
+        <w:ind w:left="709" w:hanging="709"/>
+        <w:jc w:val="both"/>
+      </w:pPr>
+      <w:r>
+        <w:rPr>
+          <w:rFonts w:ascii="Times New Roman" w:hAnsi="Times New Roman"/>
+          <w:sz w:val="22"/>
+        </w:rPr>
+        <w:t>Parsons-Smith, R. L., Barkase, S., Lovell, G. P., Vleck, V., &amp; Terry, P. C. (2022). Mood profiles of amateur triathletes: implications for mental health and performance. Frontiers in Psychology, 13, 925992. https://doi.org/10.3389/fpsyg.2022.925992</w:t>
+      </w:r>
+    </w:p>
+    <w:p>
+      <w:pPr>
+        <w:spacing w:line="360" w:lineRule="auto" w:after="120"/>
+        <w:ind w:left="709" w:hanging="709"/>
+        <w:jc w:val="both"/>
+      </w:pPr>
+      <w:r>
+        <w:rPr>
+          <w:rFonts w:ascii="Times New Roman" w:hAnsi="Times New Roman"/>
+          <w:sz w:val="22"/>
+        </w:rPr>
         <w:t>Pueo, B., Jimenez-Olmedo, J. M., Penichet-Tomas, A., Ortega Becerra, M., &amp; Espina Agullo, J. J. (2017). Analysis of time-motion and heart rate in elite male and female beach handball. Journal of Sports Science and Medicine, 16(4), 450-458.</w:t>
+      </w:r>
+    </w:p>
+    <w:p>
+      <w:pPr>
+        <w:spacing w:line="360" w:lineRule="auto" w:after="120"/>
+        <w:ind w:left="709" w:hanging="709"/>
+        <w:jc w:val="both"/>
+      </w:pPr>
+      <w:r>
+        <w:rPr>
+          <w:rFonts w:ascii="Times New Roman" w:hAnsi="Times New Roman"/>
+          <w:sz w:val="22"/>
+        </w:rPr>
+        <w:t>Rebelo, A., Pereira, J. R., Cunha, P., Coelho-e-Silva, M. J., &amp; Valente-dos-Santos, J. (2024). Training stress, neuromuscular fatigue and well-being in volleyball: a systematic review. BMC Sports Science, Medicine and Rehabilitation, 16(1), 17. https://doi.org/10.1186/s13102-024-00807-7</w:t>
       </w:r>
     </w:p>
     <w:p>

</xml_diff>

<commit_message>
Adiciona filtragem sinal/ruido e grafico de cruzamentos das variaveis
Nova etapa de resultados (3.5): processo de filtragem das curvas com separacao
entre sinal (tendencia via spline) e ruido (residuo), relacao sinal-ruido (SNR)
por dimensao, e grafico dos cruzamentos entre vigor, fadiga e fadiga fisica ao
longo da semana (cruzamentos nos dias 2,3, 3,9 e 5,8, marcando a inversao do
eixo energia-fadiga). Acrescenta paragrafo metodologico sobre a filtragem e
duas figuras. Renumera as etapas seguintes.

Co-Authored-By: Claude Opus 4.8 <noreply@anthropic.com>
Claude-Session: https://claude.ai/code/session_01P7yGiDeoGDyjWvPWQVsUrj
</commit_message>
<xml_diff>
--- a/Artigos/Estudo_Humor_Handebol_Completo.docx
+++ b/Artigos/Estudo_Humor_Handebol_Completo.docx
@@ -2090,6 +2090,20 @@
     </w:p>
     <w:p>
       <w:pPr>
+        <w:spacing w:line="360" w:lineRule="auto" w:after="0"/>
+        <w:ind w:firstLine="709"/>
+        <w:jc w:val="both"/>
+      </w:pPr>
+      <w:r>
+        <w:rPr>
+          <w:rFonts w:ascii="Times New Roman" w:hAnsi="Times New Roman"/>
+          <w:sz w:val="24"/>
+        </w:rPr>
+        <w:t>Filtragem das curvas (sinal e ruído). As médias diárias de cada dimensão contêm dois componentes: um sinal, que é a tendência real ao longo da semana, e um ruído, que é a oscilação de curto prazo causada por variabilidade individual e erro de medida. Para separar os dois, a série de cada dimensão foi filtrada por uma função spline, que retém a tendência suave e descarta as flutuações abruptas. O sinal filtrado é a própria curva suavizada; o ruído é o resíduo, ou seja, a diferença entre o valor observado e o sinal filtrado. A qualidade da tendência foi quantificada pela relação sinal-ruído (SNR), definida como a razão entre a amplitude do sinal e o desvio-padrão do ruído: quanto maior a SNR, mais confiável é a leitura da tendência. Sobre as curvas filtradas foram identificados também os pontos de cruzamento entre dimensões, isto é, os dias em que uma variável passa a superar outra.</w:t>
+      </w:r>
+    </w:p>
+    <w:p>
+      <w:pPr>
         <w:spacing w:before="280" w:after="80"/>
       </w:pPr>
       <w:r>
@@ -2112,7 +2126,7 @@
           <w:rFonts w:ascii="Times New Roman" w:hAnsi="Times New Roman"/>
           <w:sz w:val="24"/>
         </w:rPr>
-        <w:t>Os resultados são apresentados em cinco etapas: a descrição da aptidão aeróbia do grupo; a qualidade das medidas de humor (normalidade e psicometria); o comportamento descritivo das dimensões; a variação ao longo da semana e a migração de perfis; e a associação entre aptidão e humor. Ao final, as figuras individuais detalham cada dimensão.</w:t>
+        <w:t>Os resultados são apresentados em seis etapas: a descrição da aptidão aeróbia do grupo; a qualidade das medidas de humor (normalidade e psicometria); o comportamento descritivo das dimensões; a variação ao longo da semana e a migração de perfis; a filtragem das curvas e os cruzamentos entre variáveis; e a associação entre aptidão e humor. Ao final, as figuras individuais detalham cada dimensão.</w:t>
       </w:r>
     </w:p>
     <w:p>
@@ -9554,7 +9568,155 @@
           <w:i/>
           <w:sz w:val="24"/>
         </w:rPr>
-        <w:t>3.5  Etapa 5. Associação entre aptidão e humor</w:t>
+        <w:t>3.5  Etapa 5. Filtragem das curvas e cruzamentos das variáveis</w:t>
+      </w:r>
+    </w:p>
+    <w:p>
+      <w:pPr>
+        <w:spacing w:line="360" w:lineRule="auto" w:after="0"/>
+        <w:ind w:firstLine="709"/>
+        <w:jc w:val="both"/>
+      </w:pPr>
+      <w:r>
+        <w:rPr>
+          <w:rFonts w:ascii="Times New Roman" w:hAnsi="Times New Roman"/>
+          <w:sz w:val="24"/>
+        </w:rPr>
+        <w:t>Antes de interpretar as tendências, é preciso garantir que elas representam sinal, e não ruído. A Figura 6 mostra o processo de filtragem para as principais variáveis: os pontos são as médias diárias observadas, a linha é o sinal filtrado pela spline e a faixa sombreada é a magnitude do ruído. O painel inferior apresenta o ruído residual e a relação sinal-ruído (SNR) de cada dimensão. O vigor e a fadiga apresentaram as maiores SNR (8,4 e 6,7), o que indica tendências claras e confiáveis; as dimensões com forte efeito de piso, como a depressão, apresentaram SNR baixa, sinal de que sua variação ao longo da semana é dominada por ruído e deve ser lida com cautela. Esse filtro justifica por que as conclusões se apoiam sobretudo no vigor e nas dimensões de fadiga.</w:t>
+      </w:r>
+    </w:p>
+    <w:p>
+      <w:pPr>
+        <w:spacing w:before="120"/>
+        <w:jc w:val="center"/>
+      </w:pPr>
+      <w:r>
+        <w:drawing>
+          <wp:inline xmlns:a="http://schemas.openxmlformats.org/drawingml/2006/main" xmlns:pic="http://schemas.openxmlformats.org/drawingml/2006/picture">
+            <wp:extent cx="6120000" cy="4647180"/>
+            <wp:docPr id="5" name="Picture 5"/>
+            <wp:cNvGraphicFramePr>
+              <a:graphicFrameLocks noChangeAspect="1"/>
+            </wp:cNvGraphicFramePr>
+            <a:graphic>
+              <a:graphicData uri="http://schemas.openxmlformats.org/drawingml/2006/picture">
+                <pic:pic>
+                  <pic:nvPicPr>
+                    <pic:cNvPr id="0" name="filtragem_sinal_ruido.png"/>
+                    <pic:cNvPicPr/>
+                  </pic:nvPicPr>
+                  <pic:blipFill>
+                    <a:blip r:embed="rId13"/>
+                    <a:stretch>
+                      <a:fillRect/>
+                    </a:stretch>
+                  </pic:blipFill>
+                  <pic:spPr>
+                    <a:xfrm>
+                      <a:off x="0" y="0"/>
+                      <a:ext cx="6120000" cy="4647180"/>
+                    </a:xfrm>
+                    <a:prstGeom prst="rect"/>
+                  </pic:spPr>
+                </pic:pic>
+              </a:graphicData>
+            </a:graphic>
+          </wp:inline>
+        </w:drawing>
+      </w:r>
+    </w:p>
+    <w:p>
+      <w:pPr>
+        <w:spacing w:after="120"/>
+        <w:jc w:val="center"/>
+      </w:pPr>
+      <w:r>
+        <w:rPr>
+          <w:rFonts w:ascii="Times New Roman" w:hAnsi="Times New Roman"/>
+          <w:sz w:val="21"/>
+        </w:rPr>
+        <w:t>Figura 5. Processo de filtragem das curvas. Painéis superiores: sinal observado (pontos), sinal filtrado (linha) e faixa de ruído para vigor, fadiga e PTH. Painel inferior esquerdo: ruído residual. Painel inferior direito: relação sinal-ruído (SNR) por dimensão.</w:t>
+      </w:r>
+    </w:p>
+    <w:p>
+      <w:pPr>
+        <w:spacing w:line="360" w:lineRule="auto" w:after="0"/>
+        <w:ind w:firstLine="709"/>
+        <w:jc w:val="both"/>
+      </w:pPr>
+      <w:r>
+        <w:rPr>
+          <w:rFonts w:ascii="Times New Roman" w:hAnsi="Times New Roman"/>
+          <w:sz w:val="24"/>
+        </w:rPr>
+        <w:t>A partir das curvas filtradas, a Figura 7 mostra onde as variáveis se cruzam ao longo da semana. No primeiro dia, o vigor está bem acima da fadiga, configuração do perfil de iceberg. As curvas de vigor e fadiga se cruzam por volta dos dias 2,3, 3,9 e 5,8, e no fim da semana a fadiga e a fadiga física passam a superar o vigor. Esse cruzamento do eixo energia-fadiga é a expressão gráfica da transição do perfil de iceberg para o de barbatana de tubarão, e localiza com precisão o momento em que o desgaste se sobrepõe à energia.</w:t>
+      </w:r>
+    </w:p>
+    <w:p>
+      <w:pPr>
+        <w:spacing w:before="120"/>
+        <w:jc w:val="center"/>
+      </w:pPr>
+      <w:r>
+        <w:drawing>
+          <wp:inline xmlns:a="http://schemas.openxmlformats.org/drawingml/2006/main" xmlns:pic="http://schemas.openxmlformats.org/drawingml/2006/picture">
+            <wp:extent cx="5760000" cy="3647192"/>
+            <wp:docPr id="6" name="Picture 6"/>
+            <wp:cNvGraphicFramePr>
+              <a:graphicFrameLocks noChangeAspect="1"/>
+            </wp:cNvGraphicFramePr>
+            <a:graphic>
+              <a:graphicData uri="http://schemas.openxmlformats.org/drawingml/2006/picture">
+                <pic:pic>
+                  <pic:nvPicPr>
+                    <pic:cNvPr id="0" name="cruzamentos_semana.png"/>
+                    <pic:cNvPicPr/>
+                  </pic:nvPicPr>
+                  <pic:blipFill>
+                    <a:blip r:embed="rId14"/>
+                    <a:stretch>
+                      <a:fillRect/>
+                    </a:stretch>
+                  </pic:blipFill>
+                  <pic:spPr>
+                    <a:xfrm>
+                      <a:off x="0" y="0"/>
+                      <a:ext cx="5760000" cy="3647192"/>
+                    </a:xfrm>
+                    <a:prstGeom prst="rect"/>
+                  </pic:spPr>
+                </pic:pic>
+              </a:graphicData>
+            </a:graphic>
+          </wp:inline>
+        </w:drawing>
+      </w:r>
+    </w:p>
+    <w:p>
+      <w:pPr>
+        <w:spacing w:after="120"/>
+        <w:jc w:val="center"/>
+      </w:pPr>
+      <w:r>
+        <w:rPr>
+          <w:rFonts w:ascii="Times New Roman" w:hAnsi="Times New Roman"/>
+          <w:sz w:val="21"/>
+        </w:rPr>
+        <w:t>Figura 6. Cruzamentos das variáveis ao longo da semana. Curvas filtradas de vigor, fadiga e fadiga física; os círculos marcam os cruzamentos entre vigor e fadiga (dias 2,3, 3,9 e 5,8).</w:t>
+      </w:r>
+    </w:p>
+    <w:p>
+      <w:pPr>
+        <w:spacing w:before="200" w:after="60"/>
+      </w:pPr>
+      <w:r>
+        <w:rPr>
+          <w:rFonts w:ascii="Times New Roman" w:hAnsi="Times New Roman"/>
+          <w:b/>
+          <w:i/>
+          <w:sz w:val="24"/>
+        </w:rPr>
+        <w:t>3.6  Etapa 6. Associação entre aptidão e humor</w:t>
       </w:r>
     </w:p>
     <w:p>
@@ -10302,7 +10464,7 @@
         <w:drawing>
           <wp:inline xmlns:a="http://schemas.openxmlformats.org/drawingml/2006/main" xmlns:pic="http://schemas.openxmlformats.org/drawingml/2006/picture">
             <wp:extent cx="5940000" cy="2930400"/>
-            <wp:docPr id="5" name="Picture 5"/>
+            <wp:docPr id="7" name="Picture 7"/>
             <wp:cNvGraphicFramePr>
               <a:graphicFrameLocks noChangeAspect="1"/>
             </wp:cNvGraphicFramePr>
@@ -10314,7 +10476,7 @@
                     <pic:cNvPicPr/>
                   </pic:nvPicPr>
                   <pic:blipFill>
-                    <a:blip r:embed="rId13"/>
+                    <a:blip r:embed="rId15"/>
                     <a:stretch>
                       <a:fillRect/>
                     </a:stretch>
@@ -10343,7 +10505,7 @@
           <w:rFonts w:ascii="Times New Roman" w:hAnsi="Times New Roman"/>
           <w:sz w:val="21"/>
         </w:rPr>
-        <w:t>Figura 5. Deterioração do primeiro ao sétimo dia por dimensão, para atletas mais aptos versus menos aptos (divididos pela mediana do pico de velocidade). Não houve diferença significativa entre os grupos.</w:t>
+        <w:t>Figura 7. Deterioração do primeiro ao sétimo dia por dimensão, para atletas mais aptos versus menos aptos (divididos pela mediana do pico de velocidade). Não houve diferença significativa entre os grupos.</w:t>
       </w:r>
     </w:p>
     <w:p>
@@ -10357,7 +10519,7 @@
           <w:i/>
           <w:sz w:val="24"/>
         </w:rPr>
-        <w:t>3.6  Detalhamento por dimensão</w:t>
+        <w:t>3.7  Detalhamento por dimensão</w:t>
       </w:r>
     </w:p>
     <w:p>
@@ -10383,7 +10545,7 @@
         <w:drawing>
           <wp:inline xmlns:a="http://schemas.openxmlformats.org/drawingml/2006/main" xmlns:pic="http://schemas.openxmlformats.org/drawingml/2006/picture">
             <wp:extent cx="5400000" cy="7109707"/>
-            <wp:docPr id="6" name="Picture 6"/>
+            <wp:docPr id="8" name="Picture 8"/>
             <wp:cNvGraphicFramePr>
               <a:graphicFrameLocks noChangeAspect="1"/>
             </wp:cNvGraphicFramePr>
@@ -10395,7 +10557,7 @@
                     <pic:cNvPicPr/>
                   </pic:nvPicPr>
                   <pic:blipFill>
-                    <a:blip r:embed="rId14"/>
+                    <a:blip r:embed="rId16"/>
                     <a:stretch>
                       <a:fillRect/>
                     </a:stretch>
@@ -10424,7 +10586,7 @@
           <w:rFonts w:ascii="Times New Roman" w:hAnsi="Times New Roman"/>
           <w:sz w:val="21"/>
         </w:rPr>
-        <w:t>Figura 6. Painel da dimensão vigor: trajetória, limites, derivadas, transições e síntese descritiva.</w:t>
+        <w:t>Figura 8. Painel da dimensão vigor: trajetória, limites, derivadas, transições e síntese descritiva.</w:t>
       </w:r>
     </w:p>
     <w:p>
@@ -10436,7 +10598,7 @@
         <w:drawing>
           <wp:inline xmlns:a="http://schemas.openxmlformats.org/drawingml/2006/main" xmlns:pic="http://schemas.openxmlformats.org/drawingml/2006/picture">
             <wp:extent cx="5400000" cy="7109707"/>
-            <wp:docPr id="7" name="Picture 7"/>
+            <wp:docPr id="9" name="Picture 9"/>
             <wp:cNvGraphicFramePr>
               <a:graphicFrameLocks noChangeAspect="1"/>
             </wp:cNvGraphicFramePr>
@@ -10448,7 +10610,7 @@
                     <pic:cNvPicPr/>
                   </pic:nvPicPr>
                   <pic:blipFill>
-                    <a:blip r:embed="rId15"/>
+                    <a:blip r:embed="rId17"/>
                     <a:stretch>
                       <a:fillRect/>
                     </a:stretch>
@@ -10477,7 +10639,7 @@
           <w:rFonts w:ascii="Times New Roman" w:hAnsi="Times New Roman"/>
           <w:sz w:val="21"/>
         </w:rPr>
-        <w:t>Figura 7. Painel da dimensão fadiga: trajetória, limites, derivadas, transições e síntese descritiva.</w:t>
+        <w:t>Figura 9. Painel da dimensão fadiga: trajetória, limites, derivadas, transições e síntese descritiva.</w:t>
       </w:r>
     </w:p>
     <w:p>
@@ -10489,7 +10651,7 @@
         <w:drawing>
           <wp:inline xmlns:a="http://schemas.openxmlformats.org/drawingml/2006/main" xmlns:pic="http://schemas.openxmlformats.org/drawingml/2006/picture">
             <wp:extent cx="5400000" cy="7045449"/>
-            <wp:docPr id="8" name="Picture 8"/>
+            <wp:docPr id="10" name="Picture 10"/>
             <wp:cNvGraphicFramePr>
               <a:graphicFrameLocks noChangeAspect="1"/>
             </wp:cNvGraphicFramePr>
@@ -10501,7 +10663,7 @@
                     <pic:cNvPicPr/>
                   </pic:nvPicPr>
                   <pic:blipFill>
-                    <a:blip r:embed="rId16"/>
+                    <a:blip r:embed="rId18"/>
                     <a:stretch>
                       <a:fillRect/>
                     </a:stretch>
@@ -10530,7 +10692,7 @@
           <w:rFonts w:ascii="Times New Roman" w:hAnsi="Times New Roman"/>
           <w:sz w:val="21"/>
         </w:rPr>
-        <w:t>Figura 8. Painel da dimensão tensão: trajetória, limites, derivadas, transições e síntese descritiva.</w:t>
+        <w:t>Figura 10. Painel da dimensão tensão: trajetória, limites, derivadas, transições e síntese descritiva.</w:t>
       </w:r>
     </w:p>
     <w:p>
@@ -10542,7 +10704,7 @@
         <w:drawing>
           <wp:inline xmlns:a="http://schemas.openxmlformats.org/drawingml/2006/main" xmlns:pic="http://schemas.openxmlformats.org/drawingml/2006/picture">
             <wp:extent cx="5400000" cy="7045449"/>
-            <wp:docPr id="9" name="Picture 9"/>
+            <wp:docPr id="11" name="Picture 11"/>
             <wp:cNvGraphicFramePr>
               <a:graphicFrameLocks noChangeAspect="1"/>
             </wp:cNvGraphicFramePr>
@@ -10554,7 +10716,7 @@
                     <pic:cNvPicPr/>
                   </pic:nvPicPr>
                   <pic:blipFill>
-                    <a:blip r:embed="rId17"/>
+                    <a:blip r:embed="rId19"/>
                     <a:stretch>
                       <a:fillRect/>
                     </a:stretch>
@@ -10583,113 +10745,7 @@
           <w:rFonts w:ascii="Times New Roman" w:hAnsi="Times New Roman"/>
           <w:sz w:val="21"/>
         </w:rPr>
-        <w:t>Figura 9. Painel da dimensão depressão: trajetória, limites, derivadas, transições e síntese descritiva.</w:t>
-      </w:r>
-    </w:p>
-    <w:p>
-      <w:pPr>
-        <w:spacing w:before="120"/>
-        <w:jc w:val="center"/>
-      </w:pPr>
-      <w:r>
-        <w:drawing>
-          <wp:inline xmlns:a="http://schemas.openxmlformats.org/drawingml/2006/main" xmlns:pic="http://schemas.openxmlformats.org/drawingml/2006/picture">
-            <wp:extent cx="5400000" cy="7109707"/>
-            <wp:docPr id="10" name="Picture 10"/>
-            <wp:cNvGraphicFramePr>
-              <a:graphicFrameLocks noChangeAspect="1"/>
-            </wp:cNvGraphicFramePr>
-            <a:graphic>
-              <a:graphicData uri="http://schemas.openxmlformats.org/drawingml/2006/picture">
-                <pic:pic>
-                  <pic:nvPicPr>
-                    <pic:cNvPr id="0" name="vd_Raiva.png"/>
-                    <pic:cNvPicPr/>
-                  </pic:nvPicPr>
-                  <pic:blipFill>
-                    <a:blip r:embed="rId18"/>
-                    <a:stretch>
-                      <a:fillRect/>
-                    </a:stretch>
-                  </pic:blipFill>
-                  <pic:spPr>
-                    <a:xfrm>
-                      <a:off x="0" y="0"/>
-                      <a:ext cx="5400000" cy="7109707"/>
-                    </a:xfrm>
-                    <a:prstGeom prst="rect"/>
-                  </pic:spPr>
-                </pic:pic>
-              </a:graphicData>
-            </a:graphic>
-          </wp:inline>
-        </w:drawing>
-      </w:r>
-    </w:p>
-    <w:p>
-      <w:pPr>
-        <w:spacing w:after="120"/>
-        <w:jc w:val="center"/>
-      </w:pPr>
-      <w:r>
-        <w:rPr>
-          <w:rFonts w:ascii="Times New Roman" w:hAnsi="Times New Roman"/>
-          <w:sz w:val="21"/>
-        </w:rPr>
-        <w:t>Figura 10. Painel da dimensão raiva: trajetória, limites, derivadas, transições e síntese descritiva.</w:t>
-      </w:r>
-    </w:p>
-    <w:p>
-      <w:pPr>
-        <w:spacing w:before="120"/>
-        <w:jc w:val="center"/>
-      </w:pPr>
-      <w:r>
-        <w:drawing>
-          <wp:inline xmlns:a="http://schemas.openxmlformats.org/drawingml/2006/main" xmlns:pic="http://schemas.openxmlformats.org/drawingml/2006/picture">
-            <wp:extent cx="5400000" cy="7109707"/>
-            <wp:docPr id="11" name="Picture 11"/>
-            <wp:cNvGraphicFramePr>
-              <a:graphicFrameLocks noChangeAspect="1"/>
-            </wp:cNvGraphicFramePr>
-            <a:graphic>
-              <a:graphicData uri="http://schemas.openxmlformats.org/drawingml/2006/picture">
-                <pic:pic>
-                  <pic:nvPicPr>
-                    <pic:cNvPr id="0" name="vd_Confusao.png"/>
-                    <pic:cNvPicPr/>
-                  </pic:nvPicPr>
-                  <pic:blipFill>
-                    <a:blip r:embed="rId19"/>
-                    <a:stretch>
-                      <a:fillRect/>
-                    </a:stretch>
-                  </pic:blipFill>
-                  <pic:spPr>
-                    <a:xfrm>
-                      <a:off x="0" y="0"/>
-                      <a:ext cx="5400000" cy="7109707"/>
-                    </a:xfrm>
-                    <a:prstGeom prst="rect"/>
-                  </pic:spPr>
-                </pic:pic>
-              </a:graphicData>
-            </a:graphic>
-          </wp:inline>
-        </w:drawing>
-      </w:r>
-    </w:p>
-    <w:p>
-      <w:pPr>
-        <w:spacing w:after="120"/>
-        <w:jc w:val="center"/>
-      </w:pPr>
-      <w:r>
-        <w:rPr>
-          <w:rFonts w:ascii="Times New Roman" w:hAnsi="Times New Roman"/>
-          <w:sz w:val="21"/>
-        </w:rPr>
-        <w:t>Figura 11. Painel da dimensão confusão: trajetória, limites, derivadas, transições e síntese descritiva.</w:t>
+        <w:t>Figura 11. Painel da dimensão depressão: trajetória, limites, derivadas, transições e síntese descritiva.</w:t>
       </w:r>
     </w:p>
     <w:p>
@@ -10709,7 +10765,7 @@
               <a:graphicData uri="http://schemas.openxmlformats.org/drawingml/2006/picture">
                 <pic:pic>
                   <pic:nvPicPr>
-                    <pic:cNvPr id="0" name="vd_TMD.png"/>
+                    <pic:cNvPr id="0" name="vd_Raiva.png"/>
                     <pic:cNvPicPr/>
                   </pic:nvPicPr>
                   <pic:blipFill>
@@ -10742,7 +10798,7 @@
           <w:rFonts w:ascii="Times New Roman" w:hAnsi="Times New Roman"/>
           <w:sz w:val="21"/>
         </w:rPr>
-        <w:t>Figura 12. Painel da dimensão perturbação total do humor: trajetória, limites, derivadas, transições e síntese descritiva.</w:t>
+        <w:t>Figura 12. Painel da dimensão raiva: trajetória, limites, derivadas, transições e síntese descritiva.</w:t>
       </w:r>
     </w:p>
     <w:p>
@@ -10753,7 +10809,7 @@
       <w:r>
         <w:drawing>
           <wp:inline xmlns:a="http://schemas.openxmlformats.org/drawingml/2006/main" xmlns:pic="http://schemas.openxmlformats.org/drawingml/2006/picture">
-            <wp:extent cx="5400000" cy="7113225"/>
+            <wp:extent cx="5400000" cy="7109707"/>
             <wp:docPr id="13" name="Picture 13"/>
             <wp:cNvGraphicFramePr>
               <a:graphicFrameLocks noChangeAspect="1"/>
@@ -10762,7 +10818,7 @@
               <a:graphicData uri="http://schemas.openxmlformats.org/drawingml/2006/picture">
                 <pic:pic>
                   <pic:nvPicPr>
-                    <pic:cNvPr id="0" name="vd_FadFisica.png"/>
+                    <pic:cNvPr id="0" name="vd_Confusao.png"/>
                     <pic:cNvPicPr/>
                   </pic:nvPicPr>
                   <pic:blipFill>
@@ -10774,7 +10830,7 @@
                   <pic:spPr>
                     <a:xfrm>
                       <a:off x="0" y="0"/>
-                      <a:ext cx="5400000" cy="7113225"/>
+                      <a:ext cx="5400000" cy="7109707"/>
                     </a:xfrm>
                     <a:prstGeom prst="rect"/>
                   </pic:spPr>
@@ -10795,7 +10851,7 @@
           <w:rFonts w:ascii="Times New Roman" w:hAnsi="Times New Roman"/>
           <w:sz w:val="21"/>
         </w:rPr>
-        <w:t>Figura 13. Painel da dimensão fadiga física: trajetória, limites, derivadas, transições e síntese descritiva.</w:t>
+        <w:t>Figura 13. Painel da dimensão confusão: trajetória, limites, derivadas, transições e síntese descritiva.</w:t>
       </w:r>
     </w:p>
     <w:p>
@@ -10815,7 +10871,7 @@
               <a:graphicData uri="http://schemas.openxmlformats.org/drawingml/2006/picture">
                 <pic:pic>
                   <pic:nvPicPr>
-                    <pic:cNvPr id="0" name="vd_FadMental.png"/>
+                    <pic:cNvPr id="0" name="vd_TMD.png"/>
                     <pic:cNvPicPr/>
                   </pic:nvPicPr>
                   <pic:blipFill>
@@ -10848,7 +10904,113 @@
           <w:rFonts w:ascii="Times New Roman" w:hAnsi="Times New Roman"/>
           <w:sz w:val="21"/>
         </w:rPr>
-        <w:t>Figura 14. Painel da dimensão fadiga mental: trajetória, limites, derivadas, transições e síntese descritiva.</w:t>
+        <w:t>Figura 14. Painel da dimensão perturbação total do humor: trajetória, limites, derivadas, transições e síntese descritiva.</w:t>
+      </w:r>
+    </w:p>
+    <w:p>
+      <w:pPr>
+        <w:spacing w:before="120"/>
+        <w:jc w:val="center"/>
+      </w:pPr>
+      <w:r>
+        <w:drawing>
+          <wp:inline xmlns:a="http://schemas.openxmlformats.org/drawingml/2006/main" xmlns:pic="http://schemas.openxmlformats.org/drawingml/2006/picture">
+            <wp:extent cx="5400000" cy="7113225"/>
+            <wp:docPr id="15" name="Picture 15"/>
+            <wp:cNvGraphicFramePr>
+              <a:graphicFrameLocks noChangeAspect="1"/>
+            </wp:cNvGraphicFramePr>
+            <a:graphic>
+              <a:graphicData uri="http://schemas.openxmlformats.org/drawingml/2006/picture">
+                <pic:pic>
+                  <pic:nvPicPr>
+                    <pic:cNvPr id="0" name="vd_FadFisica.png"/>
+                    <pic:cNvPicPr/>
+                  </pic:nvPicPr>
+                  <pic:blipFill>
+                    <a:blip r:embed="rId23"/>
+                    <a:stretch>
+                      <a:fillRect/>
+                    </a:stretch>
+                  </pic:blipFill>
+                  <pic:spPr>
+                    <a:xfrm>
+                      <a:off x="0" y="0"/>
+                      <a:ext cx="5400000" cy="7113225"/>
+                    </a:xfrm>
+                    <a:prstGeom prst="rect"/>
+                  </pic:spPr>
+                </pic:pic>
+              </a:graphicData>
+            </a:graphic>
+          </wp:inline>
+        </w:drawing>
+      </w:r>
+    </w:p>
+    <w:p>
+      <w:pPr>
+        <w:spacing w:after="120"/>
+        <w:jc w:val="center"/>
+      </w:pPr>
+      <w:r>
+        <w:rPr>
+          <w:rFonts w:ascii="Times New Roman" w:hAnsi="Times New Roman"/>
+          <w:sz w:val="21"/>
+        </w:rPr>
+        <w:t>Figura 15. Painel da dimensão fadiga física: trajetória, limites, derivadas, transições e síntese descritiva.</w:t>
+      </w:r>
+    </w:p>
+    <w:p>
+      <w:pPr>
+        <w:spacing w:before="120"/>
+        <w:jc w:val="center"/>
+      </w:pPr>
+      <w:r>
+        <w:drawing>
+          <wp:inline xmlns:a="http://schemas.openxmlformats.org/drawingml/2006/main" xmlns:pic="http://schemas.openxmlformats.org/drawingml/2006/picture">
+            <wp:extent cx="5400000" cy="7109707"/>
+            <wp:docPr id="16" name="Picture 16"/>
+            <wp:cNvGraphicFramePr>
+              <a:graphicFrameLocks noChangeAspect="1"/>
+            </wp:cNvGraphicFramePr>
+            <a:graphic>
+              <a:graphicData uri="http://schemas.openxmlformats.org/drawingml/2006/picture">
+                <pic:pic>
+                  <pic:nvPicPr>
+                    <pic:cNvPr id="0" name="vd_FadMental.png"/>
+                    <pic:cNvPicPr/>
+                  </pic:nvPicPr>
+                  <pic:blipFill>
+                    <a:blip r:embed="rId24"/>
+                    <a:stretch>
+                      <a:fillRect/>
+                    </a:stretch>
+                  </pic:blipFill>
+                  <pic:spPr>
+                    <a:xfrm>
+                      <a:off x="0" y="0"/>
+                      <a:ext cx="5400000" cy="7109707"/>
+                    </a:xfrm>
+                    <a:prstGeom prst="rect"/>
+                  </pic:spPr>
+                </pic:pic>
+              </a:graphicData>
+            </a:graphic>
+          </wp:inline>
+        </w:drawing>
+      </w:r>
+    </w:p>
+    <w:p>
+      <w:pPr>
+        <w:spacing w:after="120"/>
+        <w:jc w:val="center"/>
+      </w:pPr>
+      <w:r>
+        <w:rPr>
+          <w:rFonts w:ascii="Times New Roman" w:hAnsi="Times New Roman"/>
+          <w:sz w:val="21"/>
+        </w:rPr>
+        <w:t>Figura 16. Painel da dimensão fadiga mental: trajetória, limites, derivadas, transições e síntese descritiva.</w:t>
       </w:r>
     </w:p>
     <w:p>

</xml_diff>

<commit_message>
Estudo Completo: exclui item morto tensao_1 da AFC + Limitações estatísticas
- §2.6: justifica a exclusão do item tensao_1 (Apavorado) da AFC — 99,6%
  no piso, DP=0,07, 2 categorias, variância ~0 inviabiliza policóricas
  estáveis (confirmado nos dados brutos anonimizados)
- Resultados: reescreve a sentença de ajuste para o modelo de 23 itens
- Discussão: nova seção 4.6 Limitações estatísticas (n=27, esparsidade
  por piso, foco no eixo energia-fadiga)
- Adiciona brums_itens_anon.csv (itens anonimizados, sem ID/nome/data) e
  cfa_23itens.R (lavaan WLSMV) para reestimar os índices exatos no R

Co-Authored-By: Claude Opus 4.8 <noreply@anthropic.com>
Claude-Session: https://claude.ai/code/session_01P7yGiDeoGDyjWvPWQVsUrj
</commit_message>
<xml_diff>
--- a/Artigos/Estudo_Humor_Handebol_Completo.docx
+++ b/Artigos/Estudo_Humor_Handebol_Completo.docx
@@ -2083,6 +2083,28 @@
       <w:r>
         <w:rPr>
           <w:rFonts w:ascii="Times New Roman" w:hAnsi="Times New Roman"/>
+          <w:b/>
+          <w:sz w:val="24"/>
+        </w:rPr>
+        <w:t>Ajuste da modelagem confirmatória ao efeito de piso.</w:t>
+      </w:r>
+      <w:r>
+        <w:rPr>
+          <w:rFonts w:ascii="Times New Roman" w:hAnsi="Times New Roman"/>
+          <w:sz w:val="24"/>
+        </w:rPr>
+        <w:t xml:space="preserve"> O item tensao_1 (“Apavorado”) apresentou variância praticamente nula, com 99,6% das respostas concentradas no piso (média = 0,00; desvio-padrão = 0,07; apenas duas categorias endossadas). Como a ausência de variância inviabiliza o cálculo estável de correlações policóricas e desestabiliza a estimação do modelo latente, esse item foi excluído da análise fatorial confirmatória, que prosseguiu com os 23 itens restantes.</w:t>
+      </w:r>
+    </w:p>
+    <w:p>
+      <w:pPr>
+        <w:spacing w:line="360" w:lineRule="auto" w:after="0"/>
+        <w:ind w:firstLine="709"/>
+        <w:jc w:val="both"/>
+      </w:pPr>
+      <w:r>
+        <w:rPr>
+          <w:rFonts w:ascii="Times New Roman" w:hAnsi="Times New Roman"/>
           <w:sz w:val="24"/>
         </w:rPr>
         <w:t>Nível 3, avançado. Como parte das dimensões não seguiu distribuição normal e há efeito de piso, foram usados testes não paramétricos. O teste de Friedman verificou se cada dimensão mudou ao longo da semana, com o W de Kendall como tamanho do efeito. O teste de Wilcoxon comparou momentos pareados, com o tamanho de efeito dz. A associação entre a aptidão e o humor foi testada pela correlação de Spearman entre o pico de velocidade e tanto o nível quanto a variação do humor. A dinâmica de cada dimensão foi descrita pela suavização das curvas diárias e por suas derivadas: a primeira derivada mostra a velocidade de mudança, e a segunda derivada mostra a aceleração e o ponto de inflexão, o momento em que a tendência muda de sentido.</w:t>
@@ -5196,7 +5218,7 @@
           <w:rFonts w:ascii="Times New Roman" w:hAnsi="Times New Roman"/>
           <w:sz w:val="24"/>
         </w:rPr>
-        <w:t>A estrutura de seis fatores do BRUMS mostrou ajuste aceitável em análise fatorial confirmatória (CFI = 0,86; TLI = 0,84; RMSEA = 0,08; SRMR = 0,08), coerente com a literatura de validação da escala (Zhang et al., 2014; Terry et al., 2022; Lew et al., 2023).</w:t>
+        <w:t>Após a exclusão do item invariante tensao_1 (Apavorado), a estrutura de seis fatores do BRUMS, estimada sobre os 23 itens restantes, manteve ajuste aceitável em análise fatorial confirmatória (CFI = 0,86; TLI = 0,84; RMSEA = 0,08; SRMR = 0,08), coerente com a literatura de validação da escala (Zhang et al., 2014; Terry et al., 2022; Lew et al., 2023).</w:t>
       </w:r>
     </w:p>
     <w:p>
@@ -11178,6 +11200,46 @@
           <w:sz w:val="24"/>
         </w:rPr>
         <w:t>Em conjunto, os resultados mostram que a última semana de pré-temporada produziu perda de energia e acúmulo de fadiga física, de forma acumulada ao longo dos dias, com migração da maioria dos atletas para perfis de menor vigor, e sem que a aptidão aeróbia oferecesse proteção contra essa deterioração. A principal contribuição do estudo é integrar, em um mesmo desenho, a descrição fina do humor por derivadas e limiares, a leitura por perfis e o cruzamento com a aptidão, para dar à comissão técnica um retrato claro de onde, quando e quanto o humor muda. Esses resultados somam-se ao esforço recente de padronizar o monitoramento de carga e bem-estar em esportes coletivos e, em especial, no handebol (Rebelo et al., 2024; Henze et al., 2025). As limitações incluem o desenho de grupo único, sem grupo controle, e o tamanho da amostra, próprio de uma equipe de elite. Estudos futuros podem acompanhar mais de um microciclo e incluir medidas objetivas de recuperação para confirmar e ampliar estes achados.</w:t>
+      </w:r>
+    </w:p>
+    <w:p>
+      <w:pPr>
+        <w:spacing w:before="200" w:after="60"/>
+      </w:pPr>
+      <w:r>
+        <w:rPr>
+          <w:rFonts w:ascii="Times New Roman" w:hAnsi="Times New Roman"/>
+          <w:b/>
+          <w:sz w:val="24"/>
+        </w:rPr>
+        <w:t>4.6  Limitações estatísticas</w:t>
+      </w:r>
+    </w:p>
+    <w:p>
+      <w:pPr>
+        <w:spacing w:line="360" w:lineRule="auto" w:after="0"/>
+        <w:ind w:firstLine="709"/>
+        <w:jc w:val="both"/>
+      </w:pPr>
+      <w:r>
+        <w:rPr>
+          <w:rFonts w:ascii="Times New Roman" w:hAnsi="Times New Roman"/>
+          <w:sz w:val="24"/>
+        </w:rPr>
+        <w:t>O estudo possui limitações que exigem interpretação cautelosa. Primeiro, o tamanho amostral de 27 atletas — embora corresponda à população acessível de um elenco de elite — restringe o poder de generalização estrutural: métodos latentes como a análise fatorial confirmatória com estimador robusto para variáveis ordinais são idealizados para grandes amostras, e a inflação do número de observações repetidas (n = 456) amortece o erro-padrão e valida o comportamento longitudinal dos estados, mas não substitui a estabilidade de uma matriz estrutural baseada em centenas de indivíduos independentes. Segundo, a esparsidade severa gerada pelo efeito de piso nas dimensões afetivas negativas (com até 80 a 99% de respostas nulas, caso extremo do item “Apavorado”, excluído por invariância) força a estimação ordinal a lidar com limiares extremos e células raras, o que ajuda a explicar os índices residuais mais elevados (SRMR) e recomenda cautela na leitura psicométrica fina. Por isso, o corpo principal foi mantido estritamente focado no comportamento prático e na trajetória do eixo energia-fadiga da equipe, tratando as análises psicométricas como suporte à qualidade das medidas, e não como fim em si.</w:t>
+      </w:r>
+    </w:p>
+    <w:p>
+      <w:pPr>
+        <w:spacing w:line="360" w:lineRule="auto" w:after="0"/>
+        <w:ind w:firstLine="709"/>
+        <w:jc w:val="both"/>
+      </w:pPr>
+      <w:r>
+        <w:rPr>
+          <w:rFonts w:ascii="Times New Roman" w:hAnsi="Times New Roman"/>
+          <w:sz w:val="24"/>
+        </w:rPr>
       </w:r>
     </w:p>
     <w:p>

</xml_diff>

<commit_message>
Artigo completo: consolida PERMANOVA, TRI e síntese triangulada
- §2.6 (métodos): acrescenta o nível multivariado e de itens — PERMANOVA
  com permutação restrita ao atleta + PERMDISP, e o modelo de resposta
  gradual (Samejima)
- §3.2: parágrafo de TRI (discriminação dos itens, itens degenerados pelo
  piso) referenciando a nova Figura 17 (função de informação do teste)
- §3.4: resultado da PERMANOVA em prosa (pré-pós pseudo-F=2,52 p=0,002;
  HIIT 2,71 p=0,007; PERMDISP) convergindo com Friedman e trajetórias
- §3.7: nova Figura 17 (informação do teste, vigor e fadiga)
- §4.5: parágrafo de síntese triangulando psicometria, PERMANOVA,
  derivadas/filtro e sinal-ruído no eixo energia-fadiga

Co-Authored-By: Claude Opus 4.8 <noreply@anthropic.com>
Claude-Session: https://claude.ai/code/session_01P7yGiDeoGDyjWvPWQVsUrj
</commit_message>
<xml_diff>
--- a/Artigos/Estudo_Humor_Handebol_Completo.docx
+++ b/Artigos/Estudo_Humor_Handebol_Completo.docx
@@ -2119,6 +2119,28 @@
       <w:r>
         <w:rPr>
           <w:rFonts w:ascii="Times New Roman" w:hAnsi="Times New Roman"/>
+          <w:b/>
+          <w:sz w:val="24"/>
+        </w:rPr>
+        <w:t>Nível 3 (multivariado e de itens).</w:t>
+      </w:r>
+      <w:r>
+        <w:rPr>
+          <w:rFonts w:ascii="Times New Roman" w:hAnsi="Times New Roman"/>
+          <w:sz w:val="24"/>
+        </w:rPr>
+        <w:t xml:space="preserve"> O deslocamento conjunto do perfil das seis dimensões foi testado por análise de variância multivariada permutacional (PERMANOVA), sobre distâncias euclidianas de escores padronizados, com 9.999 permutações restritas ao atleta — respeitando as medidas repetidas —, acompanhada do teste de homogeneidade das dispersões (PERMDISP); e o funcionamento de cada item foi examinado por um modelo de resposta gradual (Samejima), com a discriminação e os limiares estimados na escala do traço latente.</w:t>
+      </w:r>
+    </w:p>
+    <w:p>
+      <w:pPr>
+        <w:spacing w:line="360" w:lineRule="auto" w:after="0"/>
+        <w:ind w:firstLine="709"/>
+        <w:jc w:val="both"/>
+      </w:pPr>
+      <w:r>
+        <w:rPr>
+          <w:rFonts w:ascii="Times New Roman" w:hAnsi="Times New Roman"/>
           <w:sz w:val="24"/>
         </w:rPr>
         <w:t>Filtragem das curvas (sinal e ruído). As médias diárias de cada dimensão contêm dois componentes: um sinal, que é a tendência real ao longo da semana, e um ruído, que é a oscilação de curto prazo causada por variabilidade individual e erro de medida. Para separar os dois, a série de cada dimensão foi filtrada por uma função spline, que retém a tendência suave e descarta as flutuações abruptas. O sinal filtrado é a própria curva suavizada; o ruído é o resíduo, ou seja, a diferença entre o valor observado e o sinal filtrado. A qualidade da tendência foi quantificada pela relação sinal-ruído (SNR), definida como a razão entre a amplitude do sinal e o desvio-padrão do ruído: quanto maior a SNR, mais confiável é a leitura da tendência. Sobre as curvas filtradas foram identificados também os pontos de cruzamento entre dimensões, isto é, os dias em que uma variável passa a superar outra.</w:t>
@@ -5223,6 +5245,20 @@
     </w:p>
     <w:p>
       <w:pPr>
+        <w:spacing w:line="360" w:lineRule="auto" w:after="0"/>
+        <w:ind w:firstLine="709"/>
+        <w:jc w:val="both"/>
+      </w:pPr>
+      <w:r>
+        <w:rPr>
+          <w:rFonts w:ascii="Times New Roman" w:hAnsi="Times New Roman"/>
+          <w:sz w:val="24"/>
+        </w:rPr>
+        <w:t>No nível do item, o modelo de resposta gradual mostrou que os itens do eixo energia-fadiga são os mais discriminativos (parâmetro de discriminação a entre 1,3 e 2,2 na fadiga e no vigor), enquanto alguns itens travados no piso — os relativos a sonolência, a estado de alerta e à tensão extrema — apresentaram discriminação próxima de zero e limiares fora da faixa observável, efeito da concentração de respostas no piso, e não de falha do item. A função de informação do teste (Figura 17) confirma que a escala de vigor informa numa faixa ampla do traço, enquanto a de fadiga informa melhor em níveis acima da média, isto é, discrimina justamente quando a fadiga se eleva — a condição de interesse no monitoramento.</w:t>
+      </w:r>
+    </w:p>
+    <w:p>
+      <w:pPr>
         <w:spacing w:before="200" w:after="60"/>
       </w:pPr>
       <w:r>
@@ -8939,6 +8975,20 @@
           <w:sz w:val="24"/>
         </w:rPr>
         <w:t>Vigor, fadiga, tensão, confusão, PTH e, com o maior tamanho de efeito, a fadiga física mudaram de forma significativa ao longo da semana. O padrão é consistente: o vigor caiu e as dimensões de fadiga aumentaram. A depressão, a raiva e a fadiga mental permaneceram estáveis, o que indica perda de energia e acúmulo de fadiga física, e não um quadro de humor negativo generalizado. A Figura 3 separa, para cada dimensão, o efeito imediato de cada sessão do efeito acumulado ao longo dos dias, e confirma que a mudança foi predominantemente acumulada. A Figura 4 mostra, em um único mapa, onde e quanto cada dimensão mudou em cada transição da semana.</w:t>
+      </w:r>
+    </w:p>
+    <w:p>
+      <w:pPr>
+        <w:spacing w:line="360" w:lineRule="auto" w:after="0"/>
+        <w:ind w:firstLine="709"/>
+        <w:jc w:val="both"/>
+      </w:pPr>
+      <w:r>
+        <w:rPr>
+          <w:rFonts w:ascii="Times New Roman" w:hAnsi="Times New Roman"/>
+          <w:sz w:val="24"/>
+        </w:rPr>
+        <w:t xml:space="preserve"> A mudança do perfil ao longo da semana também foi confirmada de forma multivariada e sem pressupor normalidade: a PERMANOVA indicou deslocamento significativo do perfil de humor entre o pré e o pós-treino (pseudo-F = 2,52; p = 0,002) e entre os dias com e sem sessão de HIIT (pseudo-F = 2,71; p = 0,007); o teste de dispersões (PERMDISP) mostrou que, no contraste pré-pós, a diferença reflete deslocamento do centroide, e não heterogeneidade de variância. Esse resultado multivariado converge com os testes univariados de Friedman e com a leitura das trajetórias suavizadas.</w:t>
       </w:r>
     </w:p>
     <w:p>
@@ -11037,6 +11087,66 @@
     </w:p>
     <w:p>
       <w:pPr>
+        <w:jc w:val="center"/>
+      </w:pPr>
+      <w:r>
+        <w:drawing>
+          <wp:inline xmlns:a="http://schemas.openxmlformats.org/drawingml/2006/main" xmlns:pic="http://schemas.openxmlformats.org/drawingml/2006/picture">
+            <wp:extent cx="5580000" cy="2179186"/>
+            <wp:docPr id="17" name="Picture 17"/>
+            <wp:cNvGraphicFramePr>
+              <a:graphicFrameLocks noChangeAspect="1"/>
+            </wp:cNvGraphicFramePr>
+            <a:graphic>
+              <a:graphicData uri="http://schemas.openxmlformats.org/drawingml/2006/picture">
+                <pic:pic>
+                  <pic:nvPicPr>
+                    <pic:cNvPr id="0" name="tri_informacao.png"/>
+                    <pic:cNvPicPr/>
+                  </pic:nvPicPr>
+                  <pic:blipFill>
+                    <a:blip r:embed="rId25"/>
+                    <a:stretch>
+                      <a:fillRect/>
+                    </a:stretch>
+                  </pic:blipFill>
+                  <pic:spPr>
+                    <a:xfrm>
+                      <a:off x="0" y="0"/>
+                      <a:ext cx="5580000" cy="2179186"/>
+                    </a:xfrm>
+                    <a:prstGeom prst="rect"/>
+                  </pic:spPr>
+                </pic:pic>
+              </a:graphicData>
+            </a:graphic>
+          </wp:inline>
+        </w:drawing>
+      </w:r>
+    </w:p>
+    <w:p>
+      <w:pPr>
+        <w:spacing w:after="120"/>
+        <w:jc w:val="center"/>
+      </w:pPr>
+      <w:r>
+        <w:rPr>
+          <w:rFonts w:ascii="Times New Roman" w:hAnsi="Times New Roman"/>
+          <w:b/>
+          <w:sz w:val="24"/>
+        </w:rPr>
+        <w:t xml:space="preserve">Figura 17. </w:t>
+      </w:r>
+      <w:r>
+        <w:rPr>
+          <w:rFonts w:ascii="Times New Roman" w:hAnsi="Times New Roman"/>
+          <w:sz w:val="24"/>
+        </w:rPr>
+        <w:t>Função de informação do teste (modelo de resposta gradual de Samejima) para as escalas de vigor e de fadiga, calculada sobre os itens estáveis. O eixo horizontal é o traço latente em desvios-padrão; a linha tracejada assinala o ponto de máxima informação.</w:t>
+      </w:r>
+    </w:p>
+    <w:p>
+      <w:pPr>
         <w:spacing w:before="280" w:after="80"/>
       </w:pPr>
       <w:r>
@@ -11200,6 +11310,20 @@
           <w:sz w:val="24"/>
         </w:rPr>
         <w:t>Em conjunto, os resultados mostram que a última semana de pré-temporada produziu perda de energia e acúmulo de fadiga física, de forma acumulada ao longo dos dias, com migração da maioria dos atletas para perfis de menor vigor, e sem que a aptidão aeróbia oferecesse proteção contra essa deterioração. A principal contribuição do estudo é integrar, em um mesmo desenho, a descrição fina do humor por derivadas e limiares, a leitura por perfis e o cruzamento com a aptidão, para dar à comissão técnica um retrato claro de onde, quando e quanto o humor muda. Esses resultados somam-se ao esforço recente de padronizar o monitoramento de carga e bem-estar em esportes coletivos e, em especial, no handebol (Rebelo et al., 2024; Henze et al., 2025). As limitações incluem o desenho de grupo único, sem grupo controle, e o tamanho da amostra, próprio de uma equipe de elite. Estudos futuros podem acompanhar mais de um microciclo e incluir medidas objetivas de recuperação para confirmar e ampliar estes achados.</w:t>
+      </w:r>
+    </w:p>
+    <w:p>
+      <w:pPr>
+        <w:spacing w:line="360" w:lineRule="auto" w:after="0"/>
+        <w:ind w:firstLine="709"/>
+        <w:jc w:val="both"/>
+      </w:pPr>
+      <w:r>
+        <w:rPr>
+          <w:rFonts w:ascii="Times New Roman" w:hAnsi="Times New Roman"/>
+          <w:sz w:val="24"/>
+        </w:rPr>
+        <w:t>Essa convergência é o que sustenta a conclusão. A estrutura fatorial e a confiabilidade situam o sinal no eixo energia-fadiga; a PERMANOVA confirma, de forma multivariada e sem pressupor normalidade, o deslocamento do perfil ao longo da semana; a suavização das curvas atua como um filtro que separa a tendência do ruído, e as derivadas datam a virada do desgaste em torno da metade da semana; e a razão sinal/ruído qualifica onde a informação é forte o bastante para sustentar a leitura. Multivariada, dinâmica e psicométrica, as três vias apontam para o mesmo núcleo — o par vigor-fadiga —, o que confere ao achado um alicerce que não depende de nenhum método isolado.</w:t>
       </w:r>
     </w:p>
     <w:p>

</xml_diff>

<commit_message>
Artigos: adiciona a figura da árvore de decisões analíticas
- Figura light/print (3540x4431) gerada da árvore de decisões
- Paper1_Humor_revisado: Figura 26 (fim de Resultados) + referência em §3.6
- Estudo_Completo: Figura 18 (após a Figura 17 TRI) + referência em §2.6
- Placas ao final para não renumerar as figuras existentes

Co-Authored-By: Claude Opus 4.8 <noreply@anthropic.com>
Claude-Session: https://claude.ai/code/session_01P7yGiDeoGDyjWvPWQVsUrj
</commit_message>
<xml_diff>
--- a/Artigos/Estudo_Humor_Handebol_Completo.docx
+++ b/Artigos/Estudo_Humor_Handebol_Completo.docx
@@ -2130,6 +2130,20 @@
           <w:sz w:val="24"/>
         </w:rPr>
         <w:t xml:space="preserve"> O deslocamento conjunto do perfil das seis dimensões foi testado por análise de variância multivariada permutacional (PERMANOVA), sobre distâncias euclidianas de escores padronizados, com 9.999 permutações restritas ao atleta — respeitando as medidas repetidas —, acompanhada do teste de homogeneidade das dispersões (PERMDISP); e o funcionamento de cada item foi examinado por um modelo de resposta gradual (Samejima), com a discriminação e os limiares estimados na escala do traço latente.</w:t>
+      </w:r>
+    </w:p>
+    <w:p>
+      <w:pPr>
+        <w:spacing w:line="360" w:lineRule="auto" w:after="0"/>
+        <w:ind w:firstLine="709"/>
+        <w:jc w:val="both"/>
+      </w:pPr>
+      <w:r>
+        <w:rPr>
+          <w:rFonts w:ascii="Times New Roman" w:hAnsi="Times New Roman"/>
+          <w:sz w:val="24"/>
+        </w:rPr>
+        <w:t xml:space="preserve"> O fluxo de decisão que orientou a escolha de cada método está resumido na Figura 18.</w:t>
       </w:r>
     </w:p>
     <w:p>
@@ -11143,6 +11157,66 @@
           <w:sz w:val="24"/>
         </w:rPr>
         <w:t>Função de informação do teste (modelo de resposta gradual de Samejima) para as escalas de vigor e de fadiga, calculada sobre os itens estáveis. O eixo horizontal é o traço latente em desvios-padrão; a linha tracejada assinala o ponto de máxima informação.</w:t>
+      </w:r>
+    </w:p>
+    <w:p>
+      <w:pPr>
+        <w:jc w:val="center"/>
+      </w:pPr>
+      <w:r>
+        <w:drawing>
+          <wp:inline xmlns:a="http://schemas.openxmlformats.org/drawingml/2006/main" xmlns:pic="http://schemas.openxmlformats.org/drawingml/2006/picture">
+            <wp:extent cx="5580000" cy="6984458"/>
+            <wp:docPr id="18" name="Picture 18"/>
+            <wp:cNvGraphicFramePr>
+              <a:graphicFrameLocks noChangeAspect="1"/>
+            </wp:cNvGraphicFramePr>
+            <a:graphic>
+              <a:graphicData uri="http://schemas.openxmlformats.org/drawingml/2006/picture">
+                <pic:pic>
+                  <pic:nvPicPr>
+                    <pic:cNvPr id="0" name="arvore_decisoes.png"/>
+                    <pic:cNvPicPr/>
+                  </pic:nvPicPr>
+                  <pic:blipFill>
+                    <a:blip r:embed="rId26"/>
+                    <a:stretch>
+                      <a:fillRect/>
+                    </a:stretch>
+                  </pic:blipFill>
+                  <pic:spPr>
+                    <a:xfrm>
+                      <a:off x="0" y="0"/>
+                      <a:ext cx="5580000" cy="6984458"/>
+                    </a:xfrm>
+                    <a:prstGeom prst="rect"/>
+                  </pic:spPr>
+                </pic:pic>
+              </a:graphicData>
+            </a:graphic>
+          </wp:inline>
+        </w:drawing>
+      </w:r>
+    </w:p>
+    <w:p>
+      <w:pPr>
+        <w:spacing w:after="120"/>
+        <w:jc w:val="center"/>
+      </w:pPr>
+      <w:r>
+        <w:rPr>
+          <w:rFonts w:ascii="Times New Roman" w:hAnsi="Times New Roman"/>
+          <w:b/>
+          <w:sz w:val="24"/>
+        </w:rPr>
+        <w:t xml:space="preserve">Figura 18. </w:t>
+      </w:r>
+      <w:r>
+        <w:rPr>
+          <w:rFonts w:ascii="Times New Roman" w:hAnsi="Times New Roman"/>
+          <w:sz w:val="24"/>
+        </w:rPr>
+        <w:t>Árvore de decisões analíticas do estudo: a escolha de cada método estatístico segundo as propriedades dos dados (normalidade, efeito de piso, tipo de comparação e pressupostos multivariados), com a trilha paralela de qualidade das medidas e as regras transversais.</w:t>
       </w:r>
     </w:p>
     <w:p>

</xml_diff>

<commit_message>
Estudo Completo: reformula para BRUMS-only (remove a arm fisiológica e HIIT)
- Remove seções §3.1 (aptidão T-car), §3.6 (associação aptidão-humor),
  §4.4 (aptidão-proteção), Tabelas 3 e 8, Figura 7 e os painéis de fadiga
  física/mental; renumera tabelas, figuras e subseções sequencialmente
- Reformula título, resumo, palavras-chave, introdução, métodos (desenho,
  T-car), discussão e conclusão para foco só-BRUMS (6 dimensões + PTH)
- Remove fadiga física/mental de 3 tabelas e do texto; remove PV da
  caracterização; remove HIIT e o Spearman aptidão-humor dos métodos
- Objetivos: remove d) e e) (fisiológicos); intro sem a arm fisiológica

Co-Authored-By: Claude Opus 4.8 <noreply@anthropic.com>
Claude-Session: https://claude.ai/code/session_01P7yGiDeoGDyjWvPWQVsUrj
</commit_message>
<xml_diff>
--- a/Artigos/Estudo_Humor_Handebol_Completo.docx
+++ b/Artigos/Estudo_Humor_Handebol_Completo.docx
@@ -12,7 +12,7 @@
           <w:b/>
           <w:sz w:val="28"/>
         </w:rPr>
-        <w:t>APTIDÃO AERÓBIA E PERFIL DE HUMOR NA ÚLTIMA SEMANA DE PRÉ-TEMPORADA DE ATLETAS DE HANDEBOL DE ELITE: UM ESTUDO DE ASSOCIAÇÃO</w:t>
+        <w:t>PERFIL E DINÂMICA DO HUMOR NA ÚLTIMA SEMANA DE PRÉ-TEMPORADA DE ATLETAS DE HANDEBOL DE ELITE: UM ESTUDO OBSERVACIONAL LONGITUDINAL</w:t>
       </w:r>
     </w:p>
     <w:p>
@@ -39,7 +39,7 @@
           <w:rFonts w:ascii="Times New Roman" w:hAnsi="Times New Roman"/>
           <w:sz w:val="24"/>
         </w:rPr>
-        <w:t>Objetivo: descrever o perfil de humor de atletas de handebol de elite ao longo da última semana de pré-temporada e verificar a associação entre a aptidão aeróbia, medida pelo pico de velocidade no teste de campo T-car, e o comportamento do humor. Método: estudo observacional, longitudinal e correlacional, de grupo único, com medidas repetidas. Vinte e sete atletas do sexo masculino responderam ao BRUMS de forma virtual, pela plataforma Google Forms, em dois momentos por dia (manhã e fim de tarde) durante sete dias. O pico de velocidade foi obtido no T-car, aplicado antes do período de observação. A análise seguiu três níveis (descritivo, exploratório e avançado), com verificação de normalidade, análises psicométricas, testes não paramétricos, tamanhos de efeito, derivadas das curvas diárias e limiares de mudança confiável. Resultados: o Vigor caiu de forma acentuada (D1 8,4 para D7 4,3; dz = 1,33; p &lt; 0,001) e a fadiga física aumentou de maneira consistente (qui-quadrado de Friedman = 51,3; p &lt; 0,001). A maioria dos atletas migrou do perfil de iceberg para perfis de menor energia. A aptidão aeróbia associou-se ao nível do humor, mas não à magnitude da deterioração ao longo da semana. Conclusão: a última semana de pré-temporada produziu perda de energia e acúmulo de fadiga; a aptidão aeróbia não protegeu o atleta contra essa deterioração.</w:t>
+        <w:t>Objetivo: descrever e classificar o perfil de humor de atletas de handebol de elite ao longo da última semana de pré-temporada e caracterizar a sua dinâmica dia a dia. Método: estudo observacional e longitudinal, de grupo único, com medidas repetidas. Vinte e sete atletas do sexo masculino responderam ao BRUMS de forma virtual, pela plataforma Google Forms, em dois momentos por dia (manhã e fim de tarde) durante sete dias. A análise seguiu três níveis (descritivo, exploratório e avançado), com verificação de normalidade, análises psicométricas, testes não paramétricos, análise multivariada por permutação, tamanhos de efeito, derivadas das curvas diárias e limiares de mudança confiável. Resultados: o Vigor caiu de forma acentuada (D1 8,4 para D7 4,3; dz = 1,33; p &lt; 0,001) e a fadiga aumentou de maneira consistente ao longo da semana. A maioria dos atletas migrou do perfil de iceberg para perfis de menor energia, e o deslocamento do perfil multivariado foi confirmado por permutação. As trajetórias suavizadas apresentaram um ponto de inflexão na metade da semana. Conclusão: a última semana de pré-temporada produziu perda de energia e acúmulo de fadiga, de forma ordenada e datável, concentrada no eixo energia-fadiga; o monitoramento diário do humor mostrou-se sensível e útil para orientar o ajuste de carga.</w:t>
       </w:r>
     </w:p>
     <w:p>
@@ -51,13 +51,12 @@
           <w:b/>
           <w:sz w:val="22"/>
         </w:rPr>
-        <w:t xml:space="preserve">Palavras-chave: </w:t>
+        <w:t>Palavras-chave: estados de humor; BRUMS; handebol; carga de treinamento; microciclo; monitoramento.</w:t>
       </w:r>
       <w:r>
         <w:rPr>
           <w:sz w:val="22"/>
         </w:rPr>
-        <w:t>estados de humor; BRUMS; handebol; carga de treinamento; pico de velocidade; monitoramento.</w:t>
       </w:r>
     </w:p>
     <w:p>
@@ -140,21 +139,7 @@
           <w:rFonts w:ascii="Times New Roman" w:hAnsi="Times New Roman"/>
           <w:sz w:val="24"/>
         </w:rPr>
-        <w:t>Ao lado do humor, a aptidão aeróbia define quanto esforço o atleta suporta antes de fadigar e é determinante de desempenho em atletas de handebol de elite (Font et al., 2021; Fikenzer et al., 2020). Neste estudo, a aptidão foi medida pelo pico de velocidade no T-car, um teste de campo intermitente e progressivo. O pico de velocidade desse teste é uma variável já consolidada na literatura: não difere da velocidade correspondente ao consumo máximo de oxigênio e correlaciona-se fortemente a ela (Da Silva et al., 2011), reflete a potência aeróbia máxima e pode ser usado como referência para a prescrição de treino (Carminatti et al., 2013; Floriano et al., 2016), além de se relacionar ao desempenho físico durante o jogo (Fernandes-da-Silva et al., 2016). Em resumo, o pico de velocidade no T-car resume, em uma única medida de campo, a capacidade e a potência aeróbia máxima do atleta.</w:t>
-      </w:r>
-    </w:p>
-    <w:p>
-      <w:pPr>
-        <w:spacing w:line="360" w:lineRule="auto" w:after="0"/>
-        <w:ind w:firstLine="709"/>
-        <w:jc w:val="both"/>
-      </w:pPr>
-      <w:r>
-        <w:rPr>
-          <w:rFonts w:ascii="Times New Roman" w:hAnsi="Times New Roman"/>
-          <w:sz w:val="24"/>
-        </w:rPr>
-        <w:t>A justificativa deste trabalho está na integração desses dois planos de avaliação, o psicológico e o fisiológico, em um mesmo desenho. Apesar da ampla adoção do BRUMS e do pico de velocidade do T-car de forma isolada, ainda é pouco explorada a associação entre a aptidão aeróbia e o comportamento do perfil de humor ao longo de uma semana real de cargas elevadas em atletas de elite. Responder a essa questão tem consequência prática direta: se a aptidão protege o atleta da deterioração do humor, a avaliação física poderia antecipar o risco psicológico; se não protege, o monitoramento do humor é insubstituível. A Figura 1 apresenta o modelo conceitual que orienta o estudo.</w:t>
+        <w:t>A justificativa deste trabalho está em descrever, com resolução diária, o comportamento do perfil de humor ao longo de uma semana real de cargas elevadas em atletas de elite. Apesar da ampla adoção do BRUMS no monitoramento esportivo, ainda é pouco explorada a dinâmica fina do perfil de humor dentro de um único microciclo — quando e com que forma o estado do atleta se desloca da prontidão para a fadiga funcional. Responder a essa questão tem consequência prática direta para o ajuste de carga e a prevenção do sobre-esforço não funcional. A Figura 1 apresenta o modelo conceitual que orienta o estudo.</w:t>
       </w:r>
     </w:p>
     <w:p>
@@ -207,7 +192,7 @@
           <w:rFonts w:ascii="Times New Roman" w:hAnsi="Times New Roman"/>
           <w:sz w:val="21"/>
         </w:rPr>
-        <w:t>Figura 1. Modelo conceitual (framework): a aptidão aeróbia e a carga de treino como entradas, o perfil de humor como construto monitorado, e o nível e a deterioração do humor como desfechos.</w:t>
+        <w:t>Figura 1. Modelo conceitual: a carga do microciclo como entrada e o perfil de humor como construto monitorado, cujo nível e trajetória informam as decisões de ajuste de treino e de recuperação.</w:t>
       </w:r>
     </w:p>
     <w:p>
@@ -235,7 +220,7 @@
           <w:rFonts w:ascii="Times New Roman" w:hAnsi="Times New Roman"/>
           <w:sz w:val="24"/>
         </w:rPr>
-        <w:t>Objetivo geral: descrever e classificar o perfil de humor de atletas de handebol de elite ao longo da última semana de pré-temporada e analisar sua associação com a aptidão aeróbia. Como objetivos específicos, o estudo busca:</w:t>
+        <w:t>Objetivo geral: descrever e classificar o perfil de humor de atletas de handebol de elite ao longo da última semana de pré-temporada. Como objetivos específicos, o estudo busca:</w:t>
       </w:r>
     </w:p>
     <w:p>
@@ -282,34 +267,6 @@
     </w:p>
     <w:p>
       <w:pPr>
-        <w:spacing w:line="360" w:lineRule="auto" w:after="0"/>
-        <w:ind w:left="709"/>
-        <w:jc w:val="both"/>
-      </w:pPr>
-      <w:r>
-        <w:rPr>
-          <w:rFonts w:ascii="Times New Roman" w:hAnsi="Times New Roman"/>
-          <w:sz w:val="24"/>
-        </w:rPr>
-        <w:t>d) descrever a aptidão aeróbia do grupo pelo pico de velocidade e demais indicadores do T-car;</w:t>
-      </w:r>
-    </w:p>
-    <w:p>
-      <w:pPr>
-        <w:spacing w:line="360" w:lineRule="auto" w:after="0"/>
-        <w:ind w:left="709"/>
-        <w:jc w:val="both"/>
-      </w:pPr>
-      <w:r>
-        <w:rPr>
-          <w:rFonts w:ascii="Times New Roman" w:hAnsi="Times New Roman"/>
-          <w:sz w:val="24"/>
-        </w:rPr>
-        <w:t>e) testar a associação entre a aptidão aeróbia e tanto o nível quanto a deterioração do humor.</w:t>
-      </w:r>
-    </w:p>
-    <w:p>
-      <w:pPr>
         <w:spacing w:before="280" w:after="80"/>
       </w:pPr>
       <w:r>
@@ -346,7 +303,7 @@
           <w:rFonts w:ascii="Times New Roman" w:hAnsi="Times New Roman"/>
           <w:sz w:val="24"/>
         </w:rPr>
-        <w:t>Trata-se de um estudo observacional, longitudinal e correlacional, de abordagem quantitativa, com medidas repetidas no mesmo grupo de atletas. Observacional porque a rotina de treino não foi manipulada: a equipe seguiu o planejamento normal da comissão técnica. Longitudinal porque os mesmos atletas foram avaliados repetidas vezes ao longo de sete dias. Correlacional porque um dos objetivos é testar a associação entre a aptidão aeróbia e o humor. De grupo único porque não houve grupo controle: cada atleta serve de referência para si mesmo, e as comparações são feitas entre os momentos da semana.</w:t>
+        <w:t>Trata-se de um estudo observacional e longitudinal, de abordagem quantitativa, com medidas repetidas no mesmo grupo de atletas. Observacional porque a rotina de treino não foi manipulada: a equipe seguiu o planejamento normal da comissão técnica. Longitudinal porque os mesmos atletas foram avaliados repetidas vezes ao longo de sete dias. De grupo único porque não houve grupo controle: cada atleta serve de referência para si mesmo, e as comparações são feitas entre os momentos da semana.</w:t>
       </w:r>
     </w:p>
     <w:p>
@@ -813,74 +770,6 @@
           </w:p>
         </w:tc>
       </w:tr>
-      <w:tr>
-        <w:tc>
-          <w:tcPr>
-            <w:tcW w:type="dxa" w:w="3211"/>
-            <w:tcBorders>
-              <w:top w:val="single" w:sz="6" w:color="000000"/>
-              <w:bottom w:val="single" w:sz="6" w:color="000000"/>
-            </w:tcBorders>
-          </w:tcPr>
-          <w:p>
-            <w:pPr>
-              <w:jc w:val="left"/>
-            </w:pPr>
-            <w:r/>
-            <w:r>
-              <w:rPr>
-                <w:rFonts w:ascii="Times New Roman" w:hAnsi="Times New Roman"/>
-                <w:sz w:val="17"/>
-              </w:rPr>
-              <w:t>Pico de velocidade no T-car (km/h)</w:t>
-            </w:r>
-          </w:p>
-        </w:tc>
-        <w:tc>
-          <w:tcPr>
-            <w:tcW w:type="dxa" w:w="3211"/>
-            <w:tcBorders>
-              <w:top w:val="single" w:sz="6" w:color="000000"/>
-              <w:bottom w:val="single" w:sz="6" w:color="000000"/>
-            </w:tcBorders>
-          </w:tcPr>
-          <w:p>
-            <w:pPr>
-              <w:jc w:val="center"/>
-            </w:pPr>
-            <w:r/>
-            <w:r>
-              <w:rPr>
-                <w:rFonts w:ascii="Times New Roman" w:hAnsi="Times New Roman"/>
-                <w:sz w:val="17"/>
-              </w:rPr>
-              <w:t>14,9 ± 1,1</w:t>
-            </w:r>
-          </w:p>
-        </w:tc>
-        <w:tc>
-          <w:tcPr>
-            <w:tcW w:type="dxa" w:w="3211"/>
-            <w:tcBorders>
-              <w:top w:val="single" w:sz="6" w:color="000000"/>
-              <w:bottom w:val="single" w:sz="6" w:color="000000"/>
-            </w:tcBorders>
-          </w:tcPr>
-          <w:p>
-            <w:pPr>
-              <w:jc w:val="center"/>
-            </w:pPr>
-            <w:r/>
-            <w:r>
-              <w:rPr>
-                <w:rFonts w:ascii="Times New Roman" w:hAnsi="Times New Roman"/>
-                <w:sz w:val="17"/>
-              </w:rPr>
-              <w:t>13,2 – 17,5</w:t>
-            </w:r>
-          </w:p>
-        </w:tc>
-      </w:tr>
     </w:tbl>
     <w:p>
       <w:pPr>
@@ -892,7 +781,7 @@
           <w:i/>
           <w:sz w:val="17"/>
         </w:rPr>
-        <w:t>DP: desvio-padrão. Posições: 11 meias, 9 pontas, 4 pivôs e 3 goleiros. Medidas antropométricas e do T-car disponíveis para 24 a 25 atletas.</w:t>
+        <w:t>DP: desvio-padrão. Posições: 11 meias, 9 pontas, 4 pivôs e 3 goleiros.</w:t>
       </w:r>
     </w:p>
     <w:p>
@@ -948,7 +837,7 @@
           <w:rFonts w:ascii="Times New Roman" w:hAnsi="Times New Roman"/>
           <w:sz w:val="24"/>
         </w:rPr>
-        <w:t>O estudo foi organizado em três etapas, resumidas no organograma da Figura 2. Na primeira etapa, houve o primeiro contato com a comissão técnica e a equipe, quando foram explicados os procedimentos de coleta e assinado o termo de consentimento. Em seguida, foi realizada uma coleta de familiarização, para que os atletas conhecessem o questionário e o modo de resposta virtual. O teste T-car foi aplicado em 15 de abril de 2024, antes do período de observação, para caracterizar a aptidão aeróbia de cada atleta.</w:t>
+        <w:t>O estudo foi organizado em três etapas, resumidas no organograma da Figura 2. Na primeira etapa, houve o primeiro contato com a comissão técnica e a equipe, quando foram explicados os procedimentos de coleta e assinado o termo de consentimento. Em seguida, foi realizada uma coleta de familiarização, para que os atletas conhecessem o questionário e o modo de resposta virtual.</w:t>
       </w:r>
     </w:p>
     <w:p>
@@ -962,7 +851,7 @@
           <w:rFonts w:ascii="Times New Roman" w:hAnsi="Times New Roman"/>
           <w:sz w:val="24"/>
         </w:rPr>
-        <w:t>Na segunda etapa, ocorreu o monitoramento diário durante a última semana de pré-temporada. A coleta do baseline foi feita em 21 de abril de 2024. Nesse dia os atletas não treinaram, de modo que o baseline representa o estado de humor em repouso, livre do efeito imediato de uma sessão. A partir daí, o humor foi registrado duas vezes por dia até o fim da semana: uma coleta pela manhã, antes do treino (momento pré), e uma coleta ao fim do dia, após o treino (momento pós). Essa estrutura de duas medidas diárias permite separar o efeito imediato de cada sessão, que é a variação da manhã para o fim do dia, do efeito acumulado ao longo dos dias. Os treinos intervalados de alta intensidade concentraram-se nos dias 2, 4 e 7. Na terceira etapa, os desfechos foram organizados em três blocos: estados de humor, aptidão aeróbia e carga interna de treino.</w:t>
+        <w:t>Na segunda etapa, ocorreu o monitoramento diário durante a última semana de pré-temporada. A coleta do baseline foi feita em 21 de abril de 2024. Nesse dia os atletas não treinaram, de modo que o baseline representa o estado de humor em repouso, livre do efeito imediato de uma sessão. A partir daí, o humor foi registrado duas vezes por dia até o fim da semana: uma coleta pela manhã, antes do treino (momento pré), e uma coleta ao fim do dia, após o treino (momento pós). Essa estrutura de duas medidas diárias permite separar o efeito imediato de cada sessão, que é a variação da manhã para o fim do dia, do efeito acumulado ao longo dos dias. Na terceira etapa, os desfechos de estados de humor foram consolidados e analisados.</w:t>
       </w:r>
     </w:p>
     <w:p>
@@ -1044,20 +933,6 @@
           <w:sz w:val="24"/>
         </w:rPr>
         <w:t>Estados de humor (BRUMS). O humor foi avaliado pela Escala de Humor de Brunel (BRUMS), composta por 24 itens que descrevem sensações recentes, respondidos em uma escala de zero a quatro. Os itens formam as seis dimensões da escala: vigor, fadiga, tensão, depressão, raiva e confusão (Terry, Lane &amp; Fogarty, 2003; Rohlfs et al., 2008). A partir dessas seis dimensões calcula-se a perturbação total do humor (PTH), um índice global que soma as dimensões negativas e subtrai o vigor. Além da escala, foram registradas duas medidas complementares de fadiga percebida, física e mental, para detalhar a natureza do cansaço relatado. O escore de cada dimensão varia de zero a dezesseis. O questionário foi aplicado de maneira online: os atletas respondiam de forma virtual, pela plataforma Google Forms, a partir de um link enviado nos horários de coleta. Esse formato reduz o tempo de resposta, evita erros de digitação e permite o registro imediato dos dados, sem necessidade de presença física do avaliador.</w:t>
-      </w:r>
-    </w:p>
-    <w:p>
-      <w:pPr>
-        <w:spacing w:line="360" w:lineRule="auto" w:after="0"/>
-        <w:ind w:firstLine="709"/>
-        <w:jc w:val="both"/>
-      </w:pPr>
-      <w:r>
-        <w:rPr>
-          <w:rFonts w:ascii="Times New Roman" w:hAnsi="Times New Roman"/>
-          <w:sz w:val="24"/>
-        </w:rPr>
-        <w:t>Aptidão aeróbia (T-car). A aptidão foi medida pelo teste de Carminatti (T-car), um teste de campo intermitente e progressivo, feito em corridas de vaivém com aumento gradual da velocidade até a exaustão. A variável de interesse é o pico de velocidade, ou seja, a maior velocidade sustentada no teste. O pico de velocidade do T-car é uma medida validada e confiável de aptidão: associa-se à velocidade correspondente ao consumo máximo de oxigênio (Da Silva et al., 2011), reflete a potência aeróbia máxima e serve de referência para prescrição de treino (Carminatti et al., 2013; Floriano et al., 2016) e relaciona-se ao desempenho físico no jogo (Fernandes-da-Silva et al., 2016). Neste estudo, o pico de velocidade foi usado para descrever a aptidão do grupo, separar atletas mais aptos de menos aptos e testar a associação com o humor.</w:t>
       </w:r>
     </w:p>
     <w:p>
@@ -2043,7 +1918,7 @@
           <w:i/>
           <w:sz w:val="17"/>
         </w:rPr>
-        <w:t>DP: desvio-padrão. CV: coeficiente de variação. ICC: coeficiente de correlação intraclasse. MDC95: mudança mínima detectável a 95%. PV: pico de velocidade no T-car.</w:t>
+        <w:t>MDC95: mudança mínima detectável a 95%.</w:t>
       </w:r>
     </w:p>
     <w:p>
@@ -2107,7 +1982,7 @@
           <w:rFonts w:ascii="Times New Roman" w:hAnsi="Times New Roman"/>
           <w:sz w:val="24"/>
         </w:rPr>
-        <w:t>Nível 3, avançado. Como parte das dimensões não seguiu distribuição normal e há efeito de piso, foram usados testes não paramétricos. O teste de Friedman verificou se cada dimensão mudou ao longo da semana, com o W de Kendall como tamanho do efeito. O teste de Wilcoxon comparou momentos pareados, com o tamanho de efeito dz. A associação entre a aptidão e o humor foi testada pela correlação de Spearman entre o pico de velocidade e tanto o nível quanto a variação do humor. A dinâmica de cada dimensão foi descrita pela suavização das curvas diárias e por suas derivadas: a primeira derivada mostra a velocidade de mudança, e a segunda derivada mostra a aceleração e o ponto de inflexão, o momento em que a tendência muda de sentido.</w:t>
+        <w:t>Nível 3, avançado. Como parte das dimensões não seguiu distribuição normal e há efeito de piso, foram usados testes não paramétricos. O teste de Friedman verificou se cada dimensão mudou ao longo da semana, com o W de Kendall como tamanho do efeito. O teste de Wilcoxon comparou momentos pareados, com o tamanho de efeito dz. A dinâmica de cada dimensão foi descrita pela suavização das curvas diárias e por suas derivadas: a primeira derivada mostra a velocidade de mudança, e a segunda derivada mostra a aceleração e o ponto de inflexão, o momento em que a tendência muda de sentido.</w:t>
       </w:r>
     </w:p>
     <w:p>
@@ -2143,7 +2018,7 @@
           <w:rFonts w:ascii="Times New Roman" w:hAnsi="Times New Roman"/>
           <w:sz w:val="24"/>
         </w:rPr>
-        <w:t xml:space="preserve"> O fluxo de decisão que orientou a escolha de cada método está resumido na Figura 18.</w:t>
+        <w:t xml:space="preserve"> O fluxo de decisão que orientou a escolha de cada método está resumido na Figura 15.</w:t>
       </w:r>
     </w:p>
     <w:p>
@@ -2184,7 +2059,7 @@
           <w:rFonts w:ascii="Times New Roman" w:hAnsi="Times New Roman"/>
           <w:sz w:val="24"/>
         </w:rPr>
-        <w:t>Os resultados são apresentados em seis etapas: a descrição da aptidão aeróbia do grupo; a qualidade das medidas de humor (normalidade e psicometria); o comportamento descritivo das dimensões; a variação ao longo da semana e a migração de perfis; a filtragem das curvas e os cruzamentos entre variáveis; e a associação entre aptidão e humor. Ao final, as figuras individuais detalham cada dimensão.</w:t>
+        <w:t>Os resultados são apresentados em cinco etapas: a qualidade das medidas de humor (normalidade e psicometria); o comportamento descritivo das dimensões; a variação ao longo da semana e a migração de perfis; a filtragem das curvas e os cruzamentos entre variáveis; e o detalhamento por dimensão.</w:t>
       </w:r>
     </w:p>
     <w:p>
@@ -2198,7 +2073,7 @@
           <w:i/>
           <w:sz w:val="24"/>
         </w:rPr>
-        <w:t>3.1  Etapa 1. Aptidão aeróbia do grupo (T-car)</w:t>
+        <w:t>3.1  Etapa 1. Qualidade das medidas de humor</w:t>
       </w:r>
     </w:p>
     <w:p>
@@ -2212,7 +2087,7 @@
           <w:rFonts w:ascii="Times New Roman" w:hAnsi="Times New Roman"/>
           <w:sz w:val="24"/>
         </w:rPr>
-        <w:t>A Tabela 3 descreve a aptidão aeróbia e a carga do teste para todo o grupo. O pico de velocidade médio no primeiro T-car foi de 14,9 km/h, com baixa dispersão relativa (coeficiente de variação de 7 por cento), o que indica um grupo homogêneo em termos de aptidão. A frequência cardíaca máxima próxima de 198 bpm e a percepção de esforço elevada confirmam que o teste foi conduzido até a exaustão. Da primeira para a segunda aplicação, houve ganho médio de 0,9 km/h no pico de velocidade, coerente com o efeito da pré-temporada sobre a aptidão.</w:t>
+        <w:t>A Tabela 3 apresenta a normalidade e as propriedades psicométricas das dimensões. O teste de Shapiro-Wilk indicou distribuição não normal na maioria das dimensões negativas, com forte assimetria positiva e efeito de piso elevado, o que justifica o uso de testes não paramétricos. A consistência interna, medida pelo alfa de Cronbach e pelo ômega, foi adequada nas dimensões centrais do estudo, com destaque para fadiga, depressão e raiva. A tensão apresentou consistência mais baixa, provavelmente pelo forte efeito de piso, e deve ser interpretada com cautela.</w:t>
       </w:r>
     </w:p>
     <w:p>
@@ -2225,1425 +2100,7 @@
           <w:b/>
           <w:sz w:val="22"/>
         </w:rPr>
-        <w:t>Tabela 3. Descritiva da aptidão aeróbia e da carga no T-car (grupo completo).</w:t>
-      </w:r>
-    </w:p>
-    <w:tbl>
-      <w:tblPr>
-        <w:tblW w:type="auto" w:w="0"/>
-        <w:jc w:val="center"/>
-        <w:tblLayout w:type="autofit"/>
-        <w:tblLook w:firstColumn="1" w:firstRow="1" w:lastColumn="0" w:lastRow="0" w:noHBand="0" w:noVBand="1" w:val="04A0"/>
-      </w:tblPr>
-      <w:tblGrid>
-        <w:gridCol w:w="1926"/>
-        <w:gridCol w:w="1926"/>
-        <w:gridCol w:w="1926"/>
-        <w:gridCol w:w="1926"/>
-        <w:gridCol w:w="1926"/>
-      </w:tblGrid>
-      <w:tr>
-        <w:tc>
-          <w:tcPr>
-            <w:tcW w:type="dxa" w:w="1926"/>
-            <w:tcBorders>
-              <w:top w:val="single" w:sz="6" w:color="000000"/>
-              <w:bottom w:val="single" w:sz="6" w:color="000000"/>
-            </w:tcBorders>
-          </w:tcPr>
-          <w:p>
-            <w:pPr>
-              <w:jc w:val="left"/>
-            </w:pPr>
-            <w:r/>
-            <w:r>
-              <w:rPr>
-                <w:rFonts w:ascii="Times New Roman" w:hAnsi="Times New Roman"/>
-                <w:b/>
-                <w:sz w:val="16"/>
-              </w:rPr>
-              <w:t>Variável</w:t>
-            </w:r>
-          </w:p>
-        </w:tc>
-        <w:tc>
-          <w:tcPr>
-            <w:tcW w:type="dxa" w:w="1926"/>
-            <w:tcBorders>
-              <w:top w:val="single" w:sz="6" w:color="000000"/>
-              <w:bottom w:val="single" w:sz="6" w:color="000000"/>
-            </w:tcBorders>
-          </w:tcPr>
-          <w:p>
-            <w:pPr>
-              <w:jc w:val="center"/>
-            </w:pPr>
-            <w:r/>
-            <w:r>
-              <w:rPr>
-                <w:rFonts w:ascii="Times New Roman" w:hAnsi="Times New Roman"/>
-                <w:b/>
-                <w:sz w:val="16"/>
-              </w:rPr>
-              <w:t>n</w:t>
-            </w:r>
-          </w:p>
-        </w:tc>
-        <w:tc>
-          <w:tcPr>
-            <w:tcW w:type="dxa" w:w="1926"/>
-            <w:tcBorders>
-              <w:top w:val="single" w:sz="6" w:color="000000"/>
-              <w:bottom w:val="single" w:sz="6" w:color="000000"/>
-            </w:tcBorders>
-          </w:tcPr>
-          <w:p>
-            <w:pPr>
-              <w:jc w:val="center"/>
-            </w:pPr>
-            <w:r/>
-            <w:r>
-              <w:rPr>
-                <w:rFonts w:ascii="Times New Roman" w:hAnsi="Times New Roman"/>
-                <w:b/>
-                <w:sz w:val="16"/>
-              </w:rPr>
-              <w:t>Média ± DP</w:t>
-            </w:r>
-          </w:p>
-        </w:tc>
-        <w:tc>
-          <w:tcPr>
-            <w:tcW w:type="dxa" w:w="1926"/>
-            <w:tcBorders>
-              <w:top w:val="single" w:sz="6" w:color="000000"/>
-              <w:bottom w:val="single" w:sz="6" w:color="000000"/>
-            </w:tcBorders>
-          </w:tcPr>
-          <w:p>
-            <w:pPr>
-              <w:jc w:val="center"/>
-            </w:pPr>
-            <w:r/>
-            <w:r>
-              <w:rPr>
-                <w:rFonts w:ascii="Times New Roman" w:hAnsi="Times New Roman"/>
-                <w:b/>
-                <w:sz w:val="16"/>
-              </w:rPr>
-              <w:t>Mín – Máx</w:t>
-            </w:r>
-          </w:p>
-        </w:tc>
-        <w:tc>
-          <w:tcPr>
-            <w:tcW w:type="dxa" w:w="1926"/>
-            <w:tcBorders>
-              <w:top w:val="single" w:sz="6" w:color="000000"/>
-              <w:bottom w:val="single" w:sz="6" w:color="000000"/>
-            </w:tcBorders>
-          </w:tcPr>
-          <w:p>
-            <w:pPr>
-              <w:jc w:val="center"/>
-            </w:pPr>
-            <w:r/>
-            <w:r>
-              <w:rPr>
-                <w:rFonts w:ascii="Times New Roman" w:hAnsi="Times New Roman"/>
-                <w:b/>
-                <w:sz w:val="16"/>
-              </w:rPr>
-              <w:t>CV (%)</w:t>
-            </w:r>
-          </w:p>
-        </w:tc>
-      </w:tr>
-      <w:tr>
-        <w:tc>
-          <w:tcPr>
-            <w:tcW w:type="dxa" w:w="1926"/>
-            <w:tcBorders>
-              <w:top w:val="single" w:sz="6" w:color="000000"/>
-              <w:bottom w:val="single" w:sz="6" w:color="000000"/>
-            </w:tcBorders>
-          </w:tcPr>
-          <w:p>
-            <w:pPr>
-              <w:jc w:val="left"/>
-            </w:pPr>
-            <w:r/>
-            <w:r>
-              <w:rPr>
-                <w:rFonts w:ascii="Times New Roman" w:hAnsi="Times New Roman"/>
-                <w:sz w:val="16"/>
-              </w:rPr>
-              <w:t>T-CAR1 – pico de velocidade (km/h)</w:t>
-            </w:r>
-          </w:p>
-        </w:tc>
-        <w:tc>
-          <w:tcPr>
-            <w:tcW w:type="dxa" w:w="1926"/>
-            <w:tcBorders>
-              <w:top w:val="single" w:sz="6" w:color="000000"/>
-              <w:bottom w:val="single" w:sz="6" w:color="000000"/>
-            </w:tcBorders>
-          </w:tcPr>
-          <w:p>
-            <w:pPr>
-              <w:jc w:val="center"/>
-            </w:pPr>
-            <w:r/>
-            <w:r>
-              <w:rPr>
-                <w:rFonts w:ascii="Times New Roman" w:hAnsi="Times New Roman"/>
-                <w:sz w:val="16"/>
-              </w:rPr>
-              <w:t>25</w:t>
-            </w:r>
-          </w:p>
-        </w:tc>
-        <w:tc>
-          <w:tcPr>
-            <w:tcW w:type="dxa" w:w="1926"/>
-            <w:tcBorders>
-              <w:top w:val="single" w:sz="6" w:color="000000"/>
-              <w:bottom w:val="single" w:sz="6" w:color="000000"/>
-            </w:tcBorders>
-          </w:tcPr>
-          <w:p>
-            <w:pPr>
-              <w:jc w:val="center"/>
-            </w:pPr>
-            <w:r/>
-            <w:r>
-              <w:rPr>
-                <w:rFonts w:ascii="Times New Roman" w:hAnsi="Times New Roman"/>
-                <w:sz w:val="16"/>
-              </w:rPr>
-              <w:t>14,92 ± 1,1</w:t>
-            </w:r>
-          </w:p>
-        </w:tc>
-        <w:tc>
-          <w:tcPr>
-            <w:tcW w:type="dxa" w:w="1926"/>
-            <w:tcBorders>
-              <w:top w:val="single" w:sz="6" w:color="000000"/>
-              <w:bottom w:val="single" w:sz="6" w:color="000000"/>
-            </w:tcBorders>
-          </w:tcPr>
-          <w:p>
-            <w:pPr>
-              <w:jc w:val="center"/>
-            </w:pPr>
-            <w:r/>
-            <w:r>
-              <w:rPr>
-                <w:rFonts w:ascii="Times New Roman" w:hAnsi="Times New Roman"/>
-                <w:sz w:val="16"/>
-              </w:rPr>
-              <w:t>13,2 – 17,5</w:t>
-            </w:r>
-          </w:p>
-        </w:tc>
-        <w:tc>
-          <w:tcPr>
-            <w:tcW w:type="dxa" w:w="1926"/>
-            <w:tcBorders>
-              <w:top w:val="single" w:sz="6" w:color="000000"/>
-              <w:bottom w:val="single" w:sz="6" w:color="000000"/>
-            </w:tcBorders>
-          </w:tcPr>
-          <w:p>
-            <w:pPr>
-              <w:jc w:val="center"/>
-            </w:pPr>
-            <w:r/>
-            <w:r>
-              <w:rPr>
-                <w:rFonts w:ascii="Times New Roman" w:hAnsi="Times New Roman"/>
-                <w:sz w:val="16"/>
-              </w:rPr>
-              <w:t>7,1</w:t>
-            </w:r>
-          </w:p>
-        </w:tc>
-      </w:tr>
-      <w:tr>
-        <w:tc>
-          <w:tcPr>
-            <w:tcW w:type="dxa" w:w="1926"/>
-            <w:tcBorders>
-              <w:top w:val="single" w:sz="6" w:color="000000"/>
-              <w:bottom w:val="single" w:sz="6" w:color="000000"/>
-            </w:tcBorders>
-          </w:tcPr>
-          <w:p>
-            <w:pPr>
-              <w:jc w:val="left"/>
-            </w:pPr>
-            <w:r/>
-            <w:r>
-              <w:rPr>
-                <w:rFonts w:ascii="Times New Roman" w:hAnsi="Times New Roman"/>
-                <w:sz w:val="16"/>
-              </w:rPr>
-              <w:t>T-CAR2 – pico de velocidade (km/h)</w:t>
-            </w:r>
-          </w:p>
-        </w:tc>
-        <w:tc>
-          <w:tcPr>
-            <w:tcW w:type="dxa" w:w="1926"/>
-            <w:tcBorders>
-              <w:top w:val="single" w:sz="6" w:color="000000"/>
-              <w:bottom w:val="single" w:sz="6" w:color="000000"/>
-            </w:tcBorders>
-          </w:tcPr>
-          <w:p>
-            <w:pPr>
-              <w:jc w:val="center"/>
-            </w:pPr>
-            <w:r/>
-            <w:r>
-              <w:rPr>
-                <w:rFonts w:ascii="Times New Roman" w:hAnsi="Times New Roman"/>
-                <w:sz w:val="16"/>
-              </w:rPr>
-              <w:t>26</w:t>
-            </w:r>
-          </w:p>
-        </w:tc>
-        <w:tc>
-          <w:tcPr>
-            <w:tcW w:type="dxa" w:w="1926"/>
-            <w:tcBorders>
-              <w:top w:val="single" w:sz="6" w:color="000000"/>
-              <w:bottom w:val="single" w:sz="6" w:color="000000"/>
-            </w:tcBorders>
-          </w:tcPr>
-          <w:p>
-            <w:pPr>
-              <w:jc w:val="center"/>
-            </w:pPr>
-            <w:r/>
-            <w:r>
-              <w:rPr>
-                <w:rFonts w:ascii="Times New Roman" w:hAnsi="Times New Roman"/>
-                <w:sz w:val="16"/>
-              </w:rPr>
-              <w:t>15,87 ± 1,1</w:t>
-            </w:r>
-          </w:p>
-        </w:tc>
-        <w:tc>
-          <w:tcPr>
-            <w:tcW w:type="dxa" w:w="1926"/>
-            <w:tcBorders>
-              <w:top w:val="single" w:sz="6" w:color="000000"/>
-              <w:bottom w:val="single" w:sz="6" w:color="000000"/>
-            </w:tcBorders>
-          </w:tcPr>
-          <w:p>
-            <w:pPr>
-              <w:jc w:val="center"/>
-            </w:pPr>
-            <w:r/>
-            <w:r>
-              <w:rPr>
-                <w:rFonts w:ascii="Times New Roman" w:hAnsi="Times New Roman"/>
-                <w:sz w:val="16"/>
-              </w:rPr>
-              <w:t>13,8 – 18,7</w:t>
-            </w:r>
-          </w:p>
-        </w:tc>
-        <w:tc>
-          <w:tcPr>
-            <w:tcW w:type="dxa" w:w="1926"/>
-            <w:tcBorders>
-              <w:top w:val="single" w:sz="6" w:color="000000"/>
-              <w:bottom w:val="single" w:sz="6" w:color="000000"/>
-            </w:tcBorders>
-          </w:tcPr>
-          <w:p>
-            <w:pPr>
-              <w:jc w:val="center"/>
-            </w:pPr>
-            <w:r/>
-            <w:r>
-              <w:rPr>
-                <w:rFonts w:ascii="Times New Roman" w:hAnsi="Times New Roman"/>
-                <w:sz w:val="16"/>
-              </w:rPr>
-              <w:t>7,2</w:t>
-            </w:r>
-          </w:p>
-        </w:tc>
-      </w:tr>
-      <w:tr>
-        <w:tc>
-          <w:tcPr>
-            <w:tcW w:type="dxa" w:w="1926"/>
-            <w:tcBorders>
-              <w:top w:val="single" w:sz="6" w:color="000000"/>
-              <w:bottom w:val="single" w:sz="6" w:color="000000"/>
-            </w:tcBorders>
-          </w:tcPr>
-          <w:p>
-            <w:pPr>
-              <w:jc w:val="left"/>
-            </w:pPr>
-            <w:r/>
-            <w:r>
-              <w:rPr>
-                <w:rFonts w:ascii="Times New Roman" w:hAnsi="Times New Roman"/>
-                <w:sz w:val="16"/>
-              </w:rPr>
-              <w:t>ΔPV – ganho na pré-temporada (km/h)</w:t>
-            </w:r>
-          </w:p>
-        </w:tc>
-        <w:tc>
-          <w:tcPr>
-            <w:tcW w:type="dxa" w:w="1926"/>
-            <w:tcBorders>
-              <w:top w:val="single" w:sz="6" w:color="000000"/>
-              <w:bottom w:val="single" w:sz="6" w:color="000000"/>
-            </w:tcBorders>
-          </w:tcPr>
-          <w:p>
-            <w:pPr>
-              <w:jc w:val="center"/>
-            </w:pPr>
-            <w:r/>
-            <w:r>
-              <w:rPr>
-                <w:rFonts w:ascii="Times New Roman" w:hAnsi="Times New Roman"/>
-                <w:sz w:val="16"/>
-              </w:rPr>
-              <w:t>25</w:t>
-            </w:r>
-          </w:p>
-        </w:tc>
-        <w:tc>
-          <w:tcPr>
-            <w:tcW w:type="dxa" w:w="1926"/>
-            <w:tcBorders>
-              <w:top w:val="single" w:sz="6" w:color="000000"/>
-              <w:bottom w:val="single" w:sz="6" w:color="000000"/>
-            </w:tcBorders>
-          </w:tcPr>
-          <w:p>
-            <w:pPr>
-              <w:jc w:val="center"/>
-            </w:pPr>
-            <w:r/>
-            <w:r>
-              <w:rPr>
-                <w:rFonts w:ascii="Times New Roman" w:hAnsi="Times New Roman"/>
-                <w:sz w:val="16"/>
-              </w:rPr>
-              <w:t>0,9 ± 0,7</w:t>
-            </w:r>
-          </w:p>
-        </w:tc>
-        <w:tc>
-          <w:tcPr>
-            <w:tcW w:type="dxa" w:w="1926"/>
-            <w:tcBorders>
-              <w:top w:val="single" w:sz="6" w:color="000000"/>
-              <w:bottom w:val="single" w:sz="6" w:color="000000"/>
-            </w:tcBorders>
-          </w:tcPr>
-          <w:p>
-            <w:pPr>
-              <w:jc w:val="center"/>
-            </w:pPr>
-            <w:r/>
-            <w:r>
-              <w:rPr>
-                <w:rFonts w:ascii="Times New Roman" w:hAnsi="Times New Roman"/>
-                <w:sz w:val="16"/>
-              </w:rPr>
-              <w:t>-1,4 – 1,8</w:t>
-            </w:r>
-          </w:p>
-        </w:tc>
-        <w:tc>
-          <w:tcPr>
-            <w:tcW w:type="dxa" w:w="1926"/>
-            <w:tcBorders>
-              <w:top w:val="single" w:sz="6" w:color="000000"/>
-              <w:bottom w:val="single" w:sz="6" w:color="000000"/>
-            </w:tcBorders>
-          </w:tcPr>
-          <w:p>
-            <w:pPr>
-              <w:jc w:val="center"/>
-            </w:pPr>
-            <w:r/>
-            <w:r>
-              <w:rPr>
-                <w:rFonts w:ascii="Times New Roman" w:hAnsi="Times New Roman"/>
-                <w:sz w:val="16"/>
-              </w:rPr>
-              <w:t>75,7</w:t>
-            </w:r>
-          </w:p>
-        </w:tc>
-      </w:tr>
-      <w:tr>
-        <w:tc>
-          <w:tcPr>
-            <w:tcW w:type="dxa" w:w="1926"/>
-            <w:tcBorders>
-              <w:top w:val="single" w:sz="6" w:color="000000"/>
-              <w:bottom w:val="single" w:sz="6" w:color="000000"/>
-            </w:tcBorders>
-          </w:tcPr>
-          <w:p>
-            <w:pPr>
-              <w:jc w:val="left"/>
-            </w:pPr>
-            <w:r/>
-            <w:r>
-              <w:rPr>
-                <w:rFonts w:ascii="Times New Roman" w:hAnsi="Times New Roman"/>
-                <w:sz w:val="16"/>
-              </w:rPr>
-              <w:t>Distância percorrida (m)</w:t>
-            </w:r>
-          </w:p>
-        </w:tc>
-        <w:tc>
-          <w:tcPr>
-            <w:tcW w:type="dxa" w:w="1926"/>
-            <w:tcBorders>
-              <w:top w:val="single" w:sz="6" w:color="000000"/>
-              <w:bottom w:val="single" w:sz="6" w:color="000000"/>
-            </w:tcBorders>
-          </w:tcPr>
-          <w:p>
-            <w:pPr>
-              <w:jc w:val="center"/>
-            </w:pPr>
-            <w:r/>
-            <w:r>
-              <w:rPr>
-                <w:rFonts w:ascii="Times New Roman" w:hAnsi="Times New Roman"/>
-                <w:sz w:val="16"/>
-              </w:rPr>
-              <w:t>26</w:t>
-            </w:r>
-          </w:p>
-        </w:tc>
-        <w:tc>
-          <w:tcPr>
-            <w:tcW w:type="dxa" w:w="1926"/>
-            <w:tcBorders>
-              <w:top w:val="single" w:sz="6" w:color="000000"/>
-              <w:bottom w:val="single" w:sz="6" w:color="000000"/>
-            </w:tcBorders>
-          </w:tcPr>
-          <w:p>
-            <w:pPr>
-              <w:jc w:val="center"/>
-            </w:pPr>
-            <w:r/>
-            <w:r>
-              <w:rPr>
-                <w:rFonts w:ascii="Times New Roman" w:hAnsi="Times New Roman"/>
-                <w:sz w:val="16"/>
-              </w:rPr>
-              <w:t>3329,3 ± 758,9</w:t>
-            </w:r>
-          </w:p>
-        </w:tc>
-        <w:tc>
-          <w:tcPr>
-            <w:tcW w:type="dxa" w:w="1926"/>
-            <w:tcBorders>
-              <w:top w:val="single" w:sz="6" w:color="000000"/>
-              <w:bottom w:val="single" w:sz="6" w:color="000000"/>
-            </w:tcBorders>
-          </w:tcPr>
-          <w:p>
-            <w:pPr>
-              <w:jc w:val="center"/>
-            </w:pPr>
-            <w:r/>
-            <w:r>
-              <w:rPr>
-                <w:rFonts w:ascii="Times New Roman" w:hAnsi="Times New Roman"/>
-                <w:sz w:val="16"/>
-              </w:rPr>
-              <w:t>2070,0 – 5360,7</w:t>
-            </w:r>
-          </w:p>
-        </w:tc>
-        <w:tc>
-          <w:tcPr>
-            <w:tcW w:type="dxa" w:w="1926"/>
-            <w:tcBorders>
-              <w:top w:val="single" w:sz="6" w:color="000000"/>
-              <w:bottom w:val="single" w:sz="6" w:color="000000"/>
-            </w:tcBorders>
-          </w:tcPr>
-          <w:p>
-            <w:pPr>
-              <w:jc w:val="center"/>
-            </w:pPr>
-            <w:r/>
-            <w:r>
-              <w:rPr>
-                <w:rFonts w:ascii="Times New Roman" w:hAnsi="Times New Roman"/>
-                <w:sz w:val="16"/>
-              </w:rPr>
-              <w:t>22,8</w:t>
-            </w:r>
-          </w:p>
-        </w:tc>
-      </w:tr>
-      <w:tr>
-        <w:tc>
-          <w:tcPr>
-            <w:tcW w:type="dxa" w:w="1926"/>
-            <w:tcBorders>
-              <w:top w:val="single" w:sz="6" w:color="000000"/>
-              <w:bottom w:val="single" w:sz="6" w:color="000000"/>
-            </w:tcBorders>
-          </w:tcPr>
-          <w:p>
-            <w:pPr>
-              <w:jc w:val="left"/>
-            </w:pPr>
-            <w:r/>
-            <w:r>
-              <w:rPr>
-                <w:rFonts w:ascii="Times New Roman" w:hAnsi="Times New Roman"/>
-                <w:sz w:val="16"/>
-              </w:rPr>
-              <w:t>Repetições completadas (n)</w:t>
-            </w:r>
-          </w:p>
-        </w:tc>
-        <w:tc>
-          <w:tcPr>
-            <w:tcW w:type="dxa" w:w="1926"/>
-            <w:tcBorders>
-              <w:top w:val="single" w:sz="6" w:color="000000"/>
-              <w:bottom w:val="single" w:sz="6" w:color="000000"/>
-            </w:tcBorders>
-          </w:tcPr>
-          <w:p>
-            <w:pPr>
-              <w:jc w:val="center"/>
-            </w:pPr>
-            <w:r/>
-            <w:r>
-              <w:rPr>
-                <w:rFonts w:ascii="Times New Roman" w:hAnsi="Times New Roman"/>
-                <w:sz w:val="16"/>
-              </w:rPr>
-              <w:t>26</w:t>
-            </w:r>
-          </w:p>
-        </w:tc>
-        <w:tc>
-          <w:tcPr>
-            <w:tcW w:type="dxa" w:w="1926"/>
-            <w:tcBorders>
-              <w:top w:val="single" w:sz="6" w:color="000000"/>
-              <w:bottom w:val="single" w:sz="6" w:color="000000"/>
-            </w:tcBorders>
-          </w:tcPr>
-          <w:p>
-            <w:pPr>
-              <w:jc w:val="center"/>
-            </w:pPr>
-            <w:r/>
-            <w:r>
-              <w:rPr>
-                <w:rFonts w:ascii="Times New Roman" w:hAnsi="Times New Roman"/>
-                <w:sz w:val="16"/>
-              </w:rPr>
-              <w:t>62,3 ± 9,5</w:t>
-            </w:r>
-          </w:p>
-        </w:tc>
-        <w:tc>
-          <w:tcPr>
-            <w:tcW w:type="dxa" w:w="1926"/>
-            <w:tcBorders>
-              <w:top w:val="single" w:sz="6" w:color="000000"/>
-              <w:bottom w:val="single" w:sz="6" w:color="000000"/>
-            </w:tcBorders>
-          </w:tcPr>
-          <w:p>
-            <w:pPr>
-              <w:jc w:val="center"/>
-            </w:pPr>
-            <w:r/>
-            <w:r>
-              <w:rPr>
-                <w:rFonts w:ascii="Times New Roman" w:hAnsi="Times New Roman"/>
-                <w:sz w:val="16"/>
-              </w:rPr>
-              <w:t>45,0 – 86,0</w:t>
-            </w:r>
-          </w:p>
-        </w:tc>
-        <w:tc>
-          <w:tcPr>
-            <w:tcW w:type="dxa" w:w="1926"/>
-            <w:tcBorders>
-              <w:top w:val="single" w:sz="6" w:color="000000"/>
-              <w:bottom w:val="single" w:sz="6" w:color="000000"/>
-            </w:tcBorders>
-          </w:tcPr>
-          <w:p>
-            <w:pPr>
-              <w:jc w:val="center"/>
-            </w:pPr>
-            <w:r/>
-            <w:r>
-              <w:rPr>
-                <w:rFonts w:ascii="Times New Roman" w:hAnsi="Times New Roman"/>
-                <w:sz w:val="16"/>
-              </w:rPr>
-              <w:t>15,3</w:t>
-            </w:r>
-          </w:p>
-        </w:tc>
-      </w:tr>
-      <w:tr>
-        <w:tc>
-          <w:tcPr>
-            <w:tcW w:type="dxa" w:w="1926"/>
-            <w:tcBorders>
-              <w:top w:val="single" w:sz="6" w:color="000000"/>
-              <w:bottom w:val="single" w:sz="6" w:color="000000"/>
-            </w:tcBorders>
-          </w:tcPr>
-          <w:p>
-            <w:pPr>
-              <w:jc w:val="left"/>
-            </w:pPr>
-            <w:r/>
-            <w:r>
-              <w:rPr>
-                <w:rFonts w:ascii="Times New Roman" w:hAnsi="Times New Roman"/>
-                <w:sz w:val="16"/>
-              </w:rPr>
-              <w:t>FC máxima (bpm)</w:t>
-            </w:r>
-          </w:p>
-        </w:tc>
-        <w:tc>
-          <w:tcPr>
-            <w:tcW w:type="dxa" w:w="1926"/>
-            <w:tcBorders>
-              <w:top w:val="single" w:sz="6" w:color="000000"/>
-              <w:bottom w:val="single" w:sz="6" w:color="000000"/>
-            </w:tcBorders>
-          </w:tcPr>
-          <w:p>
-            <w:pPr>
-              <w:jc w:val="center"/>
-            </w:pPr>
-            <w:r/>
-            <w:r>
-              <w:rPr>
-                <w:rFonts w:ascii="Times New Roman" w:hAnsi="Times New Roman"/>
-                <w:sz w:val="16"/>
-              </w:rPr>
-              <w:t>26</w:t>
-            </w:r>
-          </w:p>
-        </w:tc>
-        <w:tc>
-          <w:tcPr>
-            <w:tcW w:type="dxa" w:w="1926"/>
-            <w:tcBorders>
-              <w:top w:val="single" w:sz="6" w:color="000000"/>
-              <w:bottom w:val="single" w:sz="6" w:color="000000"/>
-            </w:tcBorders>
-          </w:tcPr>
-          <w:p>
-            <w:pPr>
-              <w:jc w:val="center"/>
-            </w:pPr>
-            <w:r/>
-            <w:r>
-              <w:rPr>
-                <w:rFonts w:ascii="Times New Roman" w:hAnsi="Times New Roman"/>
-                <w:sz w:val="16"/>
-              </w:rPr>
-              <w:t>198,5 ± 5,9</w:t>
-            </w:r>
-          </w:p>
-        </w:tc>
-        <w:tc>
-          <w:tcPr>
-            <w:tcW w:type="dxa" w:w="1926"/>
-            <w:tcBorders>
-              <w:top w:val="single" w:sz="6" w:color="000000"/>
-              <w:bottom w:val="single" w:sz="6" w:color="000000"/>
-            </w:tcBorders>
-          </w:tcPr>
-          <w:p>
-            <w:pPr>
-              <w:jc w:val="center"/>
-            </w:pPr>
-            <w:r/>
-            <w:r>
-              <w:rPr>
-                <w:rFonts w:ascii="Times New Roman" w:hAnsi="Times New Roman"/>
-                <w:sz w:val="16"/>
-              </w:rPr>
-              <w:t>190,0 – 209,0</w:t>
-            </w:r>
-          </w:p>
-        </w:tc>
-        <w:tc>
-          <w:tcPr>
-            <w:tcW w:type="dxa" w:w="1926"/>
-            <w:tcBorders>
-              <w:top w:val="single" w:sz="6" w:color="000000"/>
-              <w:bottom w:val="single" w:sz="6" w:color="000000"/>
-            </w:tcBorders>
-          </w:tcPr>
-          <w:p>
-            <w:pPr>
-              <w:jc w:val="center"/>
-            </w:pPr>
-            <w:r/>
-            <w:r>
-              <w:rPr>
-                <w:rFonts w:ascii="Times New Roman" w:hAnsi="Times New Roman"/>
-                <w:sz w:val="16"/>
-              </w:rPr>
-              <w:t>2,9</w:t>
-            </w:r>
-          </w:p>
-        </w:tc>
-      </w:tr>
-      <w:tr>
-        <w:tc>
-          <w:tcPr>
-            <w:tcW w:type="dxa" w:w="1926"/>
-            <w:tcBorders>
-              <w:top w:val="single" w:sz="6" w:color="000000"/>
-              <w:bottom w:val="single" w:sz="6" w:color="000000"/>
-            </w:tcBorders>
-          </w:tcPr>
-          <w:p>
-            <w:pPr>
-              <w:jc w:val="left"/>
-            </w:pPr>
-            <w:r/>
-            <w:r>
-              <w:rPr>
-                <w:rFonts w:ascii="Times New Roman" w:hAnsi="Times New Roman"/>
-                <w:sz w:val="16"/>
-              </w:rPr>
-              <w:t>FC de pico no teste (bpm)</w:t>
-            </w:r>
-          </w:p>
-        </w:tc>
-        <w:tc>
-          <w:tcPr>
-            <w:tcW w:type="dxa" w:w="1926"/>
-            <w:tcBorders>
-              <w:top w:val="single" w:sz="6" w:color="000000"/>
-              <w:bottom w:val="single" w:sz="6" w:color="000000"/>
-            </w:tcBorders>
-          </w:tcPr>
-          <w:p>
-            <w:pPr>
-              <w:jc w:val="center"/>
-            </w:pPr>
-            <w:r/>
-            <w:r>
-              <w:rPr>
-                <w:rFonts w:ascii="Times New Roman" w:hAnsi="Times New Roman"/>
-                <w:sz w:val="16"/>
-              </w:rPr>
-              <w:t>26</w:t>
-            </w:r>
-          </w:p>
-        </w:tc>
-        <w:tc>
-          <w:tcPr>
-            <w:tcW w:type="dxa" w:w="1926"/>
-            <w:tcBorders>
-              <w:top w:val="single" w:sz="6" w:color="000000"/>
-              <w:bottom w:val="single" w:sz="6" w:color="000000"/>
-            </w:tcBorders>
-          </w:tcPr>
-          <w:p>
-            <w:pPr>
-              <w:jc w:val="center"/>
-            </w:pPr>
-            <w:r/>
-            <w:r>
-              <w:rPr>
-                <w:rFonts w:ascii="Times New Roman" w:hAnsi="Times New Roman"/>
-                <w:sz w:val="16"/>
-              </w:rPr>
-              <w:t>182,5 ± 4,8</w:t>
-            </w:r>
-          </w:p>
-        </w:tc>
-        <w:tc>
-          <w:tcPr>
-            <w:tcW w:type="dxa" w:w="1926"/>
-            <w:tcBorders>
-              <w:top w:val="single" w:sz="6" w:color="000000"/>
-              <w:bottom w:val="single" w:sz="6" w:color="000000"/>
-            </w:tcBorders>
-          </w:tcPr>
-          <w:p>
-            <w:pPr>
-              <w:jc w:val="center"/>
-            </w:pPr>
-            <w:r/>
-            <w:r>
-              <w:rPr>
-                <w:rFonts w:ascii="Times New Roman" w:hAnsi="Times New Roman"/>
-                <w:sz w:val="16"/>
-              </w:rPr>
-              <w:t>174,0 – 191,3</w:t>
-            </w:r>
-          </w:p>
-        </w:tc>
-        <w:tc>
-          <w:tcPr>
-            <w:tcW w:type="dxa" w:w="1926"/>
-            <w:tcBorders>
-              <w:top w:val="single" w:sz="6" w:color="000000"/>
-              <w:bottom w:val="single" w:sz="6" w:color="000000"/>
-            </w:tcBorders>
-          </w:tcPr>
-          <w:p>
-            <w:pPr>
-              <w:jc w:val="center"/>
-            </w:pPr>
-            <w:r/>
-            <w:r>
-              <w:rPr>
-                <w:rFonts w:ascii="Times New Roman" w:hAnsi="Times New Roman"/>
-                <w:sz w:val="16"/>
-              </w:rPr>
-              <w:t>2,6</w:t>
-            </w:r>
-          </w:p>
-        </w:tc>
-      </w:tr>
-      <w:tr>
-        <w:tc>
-          <w:tcPr>
-            <w:tcW w:type="dxa" w:w="1926"/>
-            <w:tcBorders>
-              <w:top w:val="single" w:sz="6" w:color="000000"/>
-              <w:bottom w:val="single" w:sz="6" w:color="000000"/>
-            </w:tcBorders>
-          </w:tcPr>
-          <w:p>
-            <w:pPr>
-              <w:jc w:val="left"/>
-            </w:pPr>
-            <w:r/>
-            <w:r>
-              <w:rPr>
-                <w:rFonts w:ascii="Times New Roman" w:hAnsi="Times New Roman"/>
-                <w:sz w:val="16"/>
-              </w:rPr>
-              <w:t>FC média no teste (bpm)</w:t>
-            </w:r>
-          </w:p>
-        </w:tc>
-        <w:tc>
-          <w:tcPr>
-            <w:tcW w:type="dxa" w:w="1926"/>
-            <w:tcBorders>
-              <w:top w:val="single" w:sz="6" w:color="000000"/>
-              <w:bottom w:val="single" w:sz="6" w:color="000000"/>
-            </w:tcBorders>
-          </w:tcPr>
-          <w:p>
-            <w:pPr>
-              <w:jc w:val="center"/>
-            </w:pPr>
-            <w:r/>
-            <w:r>
-              <w:rPr>
-                <w:rFonts w:ascii="Times New Roman" w:hAnsi="Times New Roman"/>
-                <w:sz w:val="16"/>
-              </w:rPr>
-              <w:t>26</w:t>
-            </w:r>
-          </w:p>
-        </w:tc>
-        <w:tc>
-          <w:tcPr>
-            <w:tcW w:type="dxa" w:w="1926"/>
-            <w:tcBorders>
-              <w:top w:val="single" w:sz="6" w:color="000000"/>
-              <w:bottom w:val="single" w:sz="6" w:color="000000"/>
-            </w:tcBorders>
-          </w:tcPr>
-          <w:p>
-            <w:pPr>
-              <w:jc w:val="center"/>
-            </w:pPr>
-            <w:r/>
-            <w:r>
-              <w:rPr>
-                <w:rFonts w:ascii="Times New Roman" w:hAnsi="Times New Roman"/>
-                <w:sz w:val="16"/>
-              </w:rPr>
-              <w:t>178,7 ± 4,8</w:t>
-            </w:r>
-          </w:p>
-        </w:tc>
-        <w:tc>
-          <w:tcPr>
-            <w:tcW w:type="dxa" w:w="1926"/>
-            <w:tcBorders>
-              <w:top w:val="single" w:sz="6" w:color="000000"/>
-              <w:bottom w:val="single" w:sz="6" w:color="000000"/>
-            </w:tcBorders>
-          </w:tcPr>
-          <w:p>
-            <w:pPr>
-              <w:jc w:val="center"/>
-            </w:pPr>
-            <w:r/>
-            <w:r>
-              <w:rPr>
-                <w:rFonts w:ascii="Times New Roman" w:hAnsi="Times New Roman"/>
-                <w:sz w:val="16"/>
-              </w:rPr>
-              <w:t>168,9 – 186,8</w:t>
-            </w:r>
-          </w:p>
-        </w:tc>
-        <w:tc>
-          <w:tcPr>
-            <w:tcW w:type="dxa" w:w="1926"/>
-            <w:tcBorders>
-              <w:top w:val="single" w:sz="6" w:color="000000"/>
-              <w:bottom w:val="single" w:sz="6" w:color="000000"/>
-            </w:tcBorders>
-          </w:tcPr>
-          <w:p>
-            <w:pPr>
-              <w:jc w:val="center"/>
-            </w:pPr>
-            <w:r/>
-            <w:r>
-              <w:rPr>
-                <w:rFonts w:ascii="Times New Roman" w:hAnsi="Times New Roman"/>
-                <w:sz w:val="16"/>
-              </w:rPr>
-              <w:t>2,7</w:t>
-            </w:r>
-          </w:p>
-        </w:tc>
-      </w:tr>
-      <w:tr>
-        <w:tc>
-          <w:tcPr>
-            <w:tcW w:type="dxa" w:w="1926"/>
-            <w:tcBorders>
-              <w:top w:val="single" w:sz="6" w:color="000000"/>
-              <w:bottom w:val="single" w:sz="6" w:color="000000"/>
-            </w:tcBorders>
-          </w:tcPr>
-          <w:p>
-            <w:pPr>
-              <w:jc w:val="left"/>
-            </w:pPr>
-            <w:r/>
-            <w:r>
-              <w:rPr>
-                <w:rFonts w:ascii="Times New Roman" w:hAnsi="Times New Roman"/>
-                <w:sz w:val="16"/>
-              </w:rPr>
-              <w:t>Recuperação da FC em 1 min (bpm)</w:t>
-            </w:r>
-          </w:p>
-        </w:tc>
-        <w:tc>
-          <w:tcPr>
-            <w:tcW w:type="dxa" w:w="1926"/>
-            <w:tcBorders>
-              <w:top w:val="single" w:sz="6" w:color="000000"/>
-              <w:bottom w:val="single" w:sz="6" w:color="000000"/>
-            </w:tcBorders>
-          </w:tcPr>
-          <w:p>
-            <w:pPr>
-              <w:jc w:val="center"/>
-            </w:pPr>
-            <w:r/>
-            <w:r>
-              <w:rPr>
-                <w:rFonts w:ascii="Times New Roman" w:hAnsi="Times New Roman"/>
-                <w:sz w:val="16"/>
-              </w:rPr>
-              <w:t>26</w:t>
-            </w:r>
-          </w:p>
-        </w:tc>
-        <w:tc>
-          <w:tcPr>
-            <w:tcW w:type="dxa" w:w="1926"/>
-            <w:tcBorders>
-              <w:top w:val="single" w:sz="6" w:color="000000"/>
-              <w:bottom w:val="single" w:sz="6" w:color="000000"/>
-            </w:tcBorders>
-          </w:tcPr>
-          <w:p>
-            <w:pPr>
-              <w:jc w:val="center"/>
-            </w:pPr>
-            <w:r/>
-            <w:r>
-              <w:rPr>
-                <w:rFonts w:ascii="Times New Roman" w:hAnsi="Times New Roman"/>
-                <w:sz w:val="16"/>
-              </w:rPr>
-              <w:t>27,2 ± 3,8</w:t>
-            </w:r>
-          </w:p>
-        </w:tc>
-        <w:tc>
-          <w:tcPr>
-            <w:tcW w:type="dxa" w:w="1926"/>
-            <w:tcBorders>
-              <w:top w:val="single" w:sz="6" w:color="000000"/>
-              <w:bottom w:val="single" w:sz="6" w:color="000000"/>
-            </w:tcBorders>
-          </w:tcPr>
-          <w:p>
-            <w:pPr>
-              <w:jc w:val="center"/>
-            </w:pPr>
-            <w:r/>
-            <w:r>
-              <w:rPr>
-                <w:rFonts w:ascii="Times New Roman" w:hAnsi="Times New Roman"/>
-                <w:sz w:val="16"/>
-              </w:rPr>
-              <w:t>19,7 – 37,3</w:t>
-            </w:r>
-          </w:p>
-        </w:tc>
-        <w:tc>
-          <w:tcPr>
-            <w:tcW w:type="dxa" w:w="1926"/>
-            <w:tcBorders>
-              <w:top w:val="single" w:sz="6" w:color="000000"/>
-              <w:bottom w:val="single" w:sz="6" w:color="000000"/>
-            </w:tcBorders>
-          </w:tcPr>
-          <w:p>
-            <w:pPr>
-              <w:jc w:val="center"/>
-            </w:pPr>
-            <w:r/>
-            <w:r>
-              <w:rPr>
-                <w:rFonts w:ascii="Times New Roman" w:hAnsi="Times New Roman"/>
-                <w:sz w:val="16"/>
-              </w:rPr>
-              <w:t>14,1</w:t>
-            </w:r>
-          </w:p>
-        </w:tc>
-      </w:tr>
-      <w:tr>
-        <w:tc>
-          <w:tcPr>
-            <w:tcW w:type="dxa" w:w="1926"/>
-            <w:tcBorders>
-              <w:top w:val="single" w:sz="6" w:color="000000"/>
-              <w:bottom w:val="single" w:sz="6" w:color="000000"/>
-            </w:tcBorders>
-          </w:tcPr>
-          <w:p>
-            <w:pPr>
-              <w:jc w:val="left"/>
-            </w:pPr>
-            <w:r/>
-            <w:r>
-              <w:rPr>
-                <w:rFonts w:ascii="Times New Roman" w:hAnsi="Times New Roman"/>
-                <w:sz w:val="16"/>
-              </w:rPr>
-              <w:t>Impulso de treino – TRIMP (u.a.)</w:t>
-            </w:r>
-          </w:p>
-        </w:tc>
-        <w:tc>
-          <w:tcPr>
-            <w:tcW w:type="dxa" w:w="1926"/>
-            <w:tcBorders>
-              <w:top w:val="single" w:sz="6" w:color="000000"/>
-              <w:bottom w:val="single" w:sz="6" w:color="000000"/>
-            </w:tcBorders>
-          </w:tcPr>
-          <w:p>
-            <w:pPr>
-              <w:jc w:val="center"/>
-            </w:pPr>
-            <w:r/>
-            <w:r>
-              <w:rPr>
-                <w:rFonts w:ascii="Times New Roman" w:hAnsi="Times New Roman"/>
-                <w:sz w:val="16"/>
-              </w:rPr>
-              <w:t>26</w:t>
-            </w:r>
-          </w:p>
-        </w:tc>
-        <w:tc>
-          <w:tcPr>
-            <w:tcW w:type="dxa" w:w="1926"/>
-            <w:tcBorders>
-              <w:top w:val="single" w:sz="6" w:color="000000"/>
-              <w:bottom w:val="single" w:sz="6" w:color="000000"/>
-            </w:tcBorders>
-          </w:tcPr>
-          <w:p>
-            <w:pPr>
-              <w:jc w:val="center"/>
-            </w:pPr>
-            <w:r/>
-            <w:r>
-              <w:rPr>
-                <w:rFonts w:ascii="Times New Roman" w:hAnsi="Times New Roman"/>
-                <w:sz w:val="16"/>
-              </w:rPr>
-              <w:t>111,8 ± 5,4</w:t>
-            </w:r>
-          </w:p>
-        </w:tc>
-        <w:tc>
-          <w:tcPr>
-            <w:tcW w:type="dxa" w:w="1926"/>
-            <w:tcBorders>
-              <w:top w:val="single" w:sz="6" w:color="000000"/>
-              <w:bottom w:val="single" w:sz="6" w:color="000000"/>
-            </w:tcBorders>
-          </w:tcPr>
-          <w:p>
-            <w:pPr>
-              <w:jc w:val="center"/>
-            </w:pPr>
-            <w:r/>
-            <w:r>
-              <w:rPr>
-                <w:rFonts w:ascii="Times New Roman" w:hAnsi="Times New Roman"/>
-                <w:sz w:val="16"/>
-              </w:rPr>
-              <w:t>100,2 – 121,8</w:t>
-            </w:r>
-          </w:p>
-        </w:tc>
-        <w:tc>
-          <w:tcPr>
-            <w:tcW w:type="dxa" w:w="1926"/>
-            <w:tcBorders>
-              <w:top w:val="single" w:sz="6" w:color="000000"/>
-              <w:bottom w:val="single" w:sz="6" w:color="000000"/>
-            </w:tcBorders>
-          </w:tcPr>
-          <w:p>
-            <w:pPr>
-              <w:jc w:val="center"/>
-            </w:pPr>
-            <w:r/>
-            <w:r>
-              <w:rPr>
-                <w:rFonts w:ascii="Times New Roman" w:hAnsi="Times New Roman"/>
-                <w:sz w:val="16"/>
-              </w:rPr>
-              <w:t>4,8</w:t>
-            </w:r>
-          </w:p>
-        </w:tc>
-      </w:tr>
-      <w:tr>
-        <w:tc>
-          <w:tcPr>
-            <w:tcW w:type="dxa" w:w="1926"/>
-            <w:tcBorders>
-              <w:top w:val="single" w:sz="6" w:color="000000"/>
-              <w:bottom w:val="single" w:sz="6" w:color="000000"/>
-            </w:tcBorders>
-          </w:tcPr>
-          <w:p>
-            <w:pPr>
-              <w:jc w:val="left"/>
-            </w:pPr>
-            <w:r/>
-            <w:r>
-              <w:rPr>
-                <w:rFonts w:ascii="Times New Roman" w:hAnsi="Times New Roman"/>
-                <w:sz w:val="16"/>
-              </w:rPr>
-              <w:t>Percepção subjetiva de esforço (0–10)</w:t>
-            </w:r>
-          </w:p>
-        </w:tc>
-        <w:tc>
-          <w:tcPr>
-            <w:tcW w:type="dxa" w:w="1926"/>
-            <w:tcBorders>
-              <w:top w:val="single" w:sz="6" w:color="000000"/>
-              <w:bottom w:val="single" w:sz="6" w:color="000000"/>
-            </w:tcBorders>
-          </w:tcPr>
-          <w:p>
-            <w:pPr>
-              <w:jc w:val="center"/>
-            </w:pPr>
-            <w:r/>
-            <w:r>
-              <w:rPr>
-                <w:rFonts w:ascii="Times New Roman" w:hAnsi="Times New Roman"/>
-                <w:sz w:val="16"/>
-              </w:rPr>
-              <w:t>26</w:t>
-            </w:r>
-          </w:p>
-        </w:tc>
-        <w:tc>
-          <w:tcPr>
-            <w:tcW w:type="dxa" w:w="1926"/>
-            <w:tcBorders>
-              <w:top w:val="single" w:sz="6" w:color="000000"/>
-              <w:bottom w:val="single" w:sz="6" w:color="000000"/>
-            </w:tcBorders>
-          </w:tcPr>
-          <w:p>
-            <w:pPr>
-              <w:jc w:val="center"/>
-            </w:pPr>
-            <w:r/>
-            <w:r>
-              <w:rPr>
-                <w:rFonts w:ascii="Times New Roman" w:hAnsi="Times New Roman"/>
-                <w:sz w:val="16"/>
-              </w:rPr>
-              <w:t>6,7 ± 0,7</w:t>
-            </w:r>
-          </w:p>
-        </w:tc>
-        <w:tc>
-          <w:tcPr>
-            <w:tcW w:type="dxa" w:w="1926"/>
-            <w:tcBorders>
-              <w:top w:val="single" w:sz="6" w:color="000000"/>
-              <w:bottom w:val="single" w:sz="6" w:color="000000"/>
-            </w:tcBorders>
-          </w:tcPr>
-          <w:p>
-            <w:pPr>
-              <w:jc w:val="center"/>
-            </w:pPr>
-            <w:r/>
-            <w:r>
-              <w:rPr>
-                <w:rFonts w:ascii="Times New Roman" w:hAnsi="Times New Roman"/>
-                <w:sz w:val="16"/>
-              </w:rPr>
-              <w:t>5,1 – 8,4</w:t>
-            </w:r>
-          </w:p>
-        </w:tc>
-        <w:tc>
-          <w:tcPr>
-            <w:tcW w:type="dxa" w:w="1926"/>
-            <w:tcBorders>
-              <w:top w:val="single" w:sz="6" w:color="000000"/>
-              <w:bottom w:val="single" w:sz="6" w:color="000000"/>
-            </w:tcBorders>
-          </w:tcPr>
-          <w:p>
-            <w:pPr>
-              <w:jc w:val="center"/>
-            </w:pPr>
-            <w:r/>
-            <w:r>
-              <w:rPr>
-                <w:rFonts w:ascii="Times New Roman" w:hAnsi="Times New Roman"/>
-                <w:sz w:val="16"/>
-              </w:rPr>
-              <w:t>11,1</w:t>
-            </w:r>
-          </w:p>
-        </w:tc>
-      </w:tr>
-    </w:tbl>
-    <w:p>
-      <w:pPr>
-        <w:spacing w:after="120"/>
-      </w:pPr>
-      <w:r>
-        <w:rPr>
-          <w:rFonts w:ascii="Times New Roman" w:hAnsi="Times New Roman"/>
-          <w:i/>
-          <w:sz w:val="17"/>
-        </w:rPr>
-        <w:t>DP: desvio-padrão. CV: coeficiente de variação. ΔPV: ganho do pico de velocidade entre as duas aplicações. TRIMP: impulso de treino.</w:t>
-      </w:r>
-    </w:p>
-    <w:p>
-      <w:pPr>
-        <w:spacing w:before="200" w:after="60"/>
-      </w:pPr>
-      <w:r>
-        <w:rPr>
-          <w:rFonts w:ascii="Times New Roman" w:hAnsi="Times New Roman"/>
-          <w:b/>
-          <w:i/>
-          <w:sz w:val="24"/>
-        </w:rPr>
-        <w:t>3.2  Etapa 2. Qualidade das medidas de humor</w:t>
-      </w:r>
-    </w:p>
-    <w:p>
-      <w:pPr>
-        <w:spacing w:line="360" w:lineRule="auto" w:after="0"/>
-        <w:ind w:firstLine="709"/>
-        <w:jc w:val="both"/>
-      </w:pPr>
-      <w:r>
-        <w:rPr>
-          <w:rFonts w:ascii="Times New Roman" w:hAnsi="Times New Roman"/>
-          <w:sz w:val="24"/>
-        </w:rPr>
-        <w:t>A Tabela 4 apresenta a normalidade e as propriedades psicométricas das dimensões. O teste de Shapiro-Wilk indicou distribuição não normal na maioria das dimensões negativas, com forte assimetria positiva e efeito de piso elevado, o que justifica o uso de testes não paramétricos. A consistência interna, medida pelo alfa de Cronbach e pelo ômega, foi adequada nas dimensões centrais do estudo, com destaque para fadiga, depressão e raiva. A tensão apresentou consistência mais baixa, provavelmente pelo forte efeito de piso, e deve ser interpretada com cautela.</w:t>
-      </w:r>
-    </w:p>
-    <w:p>
-      <w:pPr>
-        <w:spacing w:before="200" w:after="40"/>
-      </w:pPr>
-      <w:r>
-        <w:rPr>
-          <w:rFonts w:ascii="Times New Roman" w:hAnsi="Times New Roman"/>
-          <w:b/>
-          <w:sz w:val="22"/>
-        </w:rPr>
-        <w:t>Tabela 4. Normalidade (Shapiro-Wilk) e psicometria das dimensões do humor.</w:t>
+        <w:t>Tabela 3. Normalidade (Shapiro-Wilk) e psicometria das dimensões do humor.</w:t>
       </w:r>
     </w:p>
     <w:tbl>
@@ -4917,318 +3374,6 @@
           </w:p>
         </w:tc>
       </w:tr>
-      <w:tr>
-        <w:tc>
-          <w:tcPr>
-            <w:tcW w:type="dxa" w:w="1376"/>
-            <w:tcBorders>
-              <w:top w:val="single" w:sz="6" w:color="000000"/>
-              <w:bottom w:val="single" w:sz="6" w:color="000000"/>
-            </w:tcBorders>
-          </w:tcPr>
-          <w:p>
-            <w:pPr>
-              <w:jc w:val="left"/>
-            </w:pPr>
-            <w:r/>
-            <w:r>
-              <w:rPr>
-                <w:rFonts w:ascii="Times New Roman" w:hAnsi="Times New Roman"/>
-                <w:sz w:val="17"/>
-              </w:rPr>
-              <w:t>Fadiga física</w:t>
-            </w:r>
-          </w:p>
-        </w:tc>
-        <w:tc>
-          <w:tcPr>
-            <w:tcW w:type="dxa" w:w="1376"/>
-            <w:tcBorders>
-              <w:top w:val="single" w:sz="6" w:color="000000"/>
-              <w:bottom w:val="single" w:sz="6" w:color="000000"/>
-            </w:tcBorders>
-          </w:tcPr>
-          <w:p>
-            <w:pPr>
-              <w:jc w:val="center"/>
-            </w:pPr>
-            <w:r/>
-            <w:r>
-              <w:rPr>
-                <w:rFonts w:ascii="Times New Roman" w:hAnsi="Times New Roman"/>
-                <w:sz w:val="17"/>
-              </w:rPr>
-              <w:t>0,976</w:t>
-            </w:r>
-          </w:p>
-        </w:tc>
-        <w:tc>
-          <w:tcPr>
-            <w:tcW w:type="dxa" w:w="1376"/>
-            <w:tcBorders>
-              <w:top w:val="single" w:sz="6" w:color="000000"/>
-              <w:bottom w:val="single" w:sz="6" w:color="000000"/>
-            </w:tcBorders>
-          </w:tcPr>
-          <w:p>
-            <w:pPr>
-              <w:jc w:val="center"/>
-            </w:pPr>
-            <w:r/>
-            <w:r>
-              <w:rPr>
-                <w:rFonts w:ascii="Times New Roman" w:hAnsi="Times New Roman"/>
-                <w:sz w:val="17"/>
-              </w:rPr>
-              <w:t>0,764</w:t>
-            </w:r>
-          </w:p>
-        </w:tc>
-        <w:tc>
-          <w:tcPr>
-            <w:tcW w:type="dxa" w:w="1376"/>
-            <w:tcBorders>
-              <w:top w:val="single" w:sz="6" w:color="000000"/>
-              <w:bottom w:val="single" w:sz="6" w:color="000000"/>
-            </w:tcBorders>
-          </w:tcPr>
-          <w:p>
-            <w:pPr>
-              <w:jc w:val="center"/>
-            </w:pPr>
-            <w:r/>
-            <w:r>
-              <w:rPr>
-                <w:rFonts w:ascii="Times New Roman" w:hAnsi="Times New Roman"/>
-                <w:sz w:val="17"/>
-              </w:rPr>
-              <w:t>sim</w:t>
-            </w:r>
-          </w:p>
-        </w:tc>
-        <w:tc>
-          <w:tcPr>
-            <w:tcW w:type="dxa" w:w="1376"/>
-            <w:tcBorders>
-              <w:top w:val="single" w:sz="6" w:color="000000"/>
-              <w:bottom w:val="single" w:sz="6" w:color="000000"/>
-            </w:tcBorders>
-          </w:tcPr>
-          <w:p>
-            <w:pPr>
-              <w:jc w:val="center"/>
-            </w:pPr>
-            <w:r/>
-            <w:r>
-              <w:rPr>
-                <w:rFonts w:ascii="Times New Roman" w:hAnsi="Times New Roman"/>
-                <w:sz w:val="17"/>
-              </w:rPr>
-              <w:t>n/d</w:t>
-            </w:r>
-          </w:p>
-        </w:tc>
-        <w:tc>
-          <w:tcPr>
-            <w:tcW w:type="dxa" w:w="1376"/>
-            <w:tcBorders>
-              <w:top w:val="single" w:sz="6" w:color="000000"/>
-              <w:bottom w:val="single" w:sz="6" w:color="000000"/>
-            </w:tcBorders>
-          </w:tcPr>
-          <w:p>
-            <w:pPr>
-              <w:jc w:val="center"/>
-            </w:pPr>
-            <w:r/>
-            <w:r>
-              <w:rPr>
-                <w:rFonts w:ascii="Times New Roman" w:hAnsi="Times New Roman"/>
-                <w:sz w:val="17"/>
-              </w:rPr>
-              <w:t>n/d</w:t>
-            </w:r>
-          </w:p>
-        </w:tc>
-        <w:tc>
-          <w:tcPr>
-            <w:tcW w:type="dxa" w:w="1376"/>
-            <w:tcBorders>
-              <w:top w:val="single" w:sz="6" w:color="000000"/>
-              <w:bottom w:val="single" w:sz="6" w:color="000000"/>
-            </w:tcBorders>
-          </w:tcPr>
-          <w:p>
-            <w:pPr>
-              <w:jc w:val="center"/>
-            </w:pPr>
-            <w:r/>
-            <w:r>
-              <w:rPr>
-                <w:rFonts w:ascii="Times New Roman" w:hAnsi="Times New Roman"/>
-                <w:sz w:val="17"/>
-              </w:rPr>
-              <w:t>n/d</w:t>
-            </w:r>
-          </w:p>
-        </w:tc>
-      </w:tr>
-      <w:tr>
-        <w:tc>
-          <w:tcPr>
-            <w:tcW w:type="dxa" w:w="1376"/>
-            <w:tcBorders>
-              <w:top w:val="single" w:sz="6" w:color="000000"/>
-              <w:bottom w:val="single" w:sz="6" w:color="000000"/>
-            </w:tcBorders>
-          </w:tcPr>
-          <w:p>
-            <w:pPr>
-              <w:jc w:val="left"/>
-            </w:pPr>
-            <w:r/>
-            <w:r>
-              <w:rPr>
-                <w:rFonts w:ascii="Times New Roman" w:hAnsi="Times New Roman"/>
-                <w:sz w:val="17"/>
-              </w:rPr>
-              <w:t>Fadiga mental</w:t>
-            </w:r>
-          </w:p>
-        </w:tc>
-        <w:tc>
-          <w:tcPr>
-            <w:tcW w:type="dxa" w:w="1376"/>
-            <w:tcBorders>
-              <w:top w:val="single" w:sz="6" w:color="000000"/>
-              <w:bottom w:val="single" w:sz="6" w:color="000000"/>
-            </w:tcBorders>
-          </w:tcPr>
-          <w:p>
-            <w:pPr>
-              <w:jc w:val="center"/>
-            </w:pPr>
-            <w:r/>
-            <w:r>
-              <w:rPr>
-                <w:rFonts w:ascii="Times New Roman" w:hAnsi="Times New Roman"/>
-                <w:sz w:val="17"/>
-              </w:rPr>
-              <w:t>0,984</w:t>
-            </w:r>
-          </w:p>
-        </w:tc>
-        <w:tc>
-          <w:tcPr>
-            <w:tcW w:type="dxa" w:w="1376"/>
-            <w:tcBorders>
-              <w:top w:val="single" w:sz="6" w:color="000000"/>
-              <w:bottom w:val="single" w:sz="6" w:color="000000"/>
-            </w:tcBorders>
-          </w:tcPr>
-          <w:p>
-            <w:pPr>
-              <w:jc w:val="center"/>
-            </w:pPr>
-            <w:r/>
-            <w:r>
-              <w:rPr>
-                <w:rFonts w:ascii="Times New Roman" w:hAnsi="Times New Roman"/>
-                <w:sz w:val="17"/>
-              </w:rPr>
-              <w:t>0,947</w:t>
-            </w:r>
-          </w:p>
-        </w:tc>
-        <w:tc>
-          <w:tcPr>
-            <w:tcW w:type="dxa" w:w="1376"/>
-            <w:tcBorders>
-              <w:top w:val="single" w:sz="6" w:color="000000"/>
-              <w:bottom w:val="single" w:sz="6" w:color="000000"/>
-            </w:tcBorders>
-          </w:tcPr>
-          <w:p>
-            <w:pPr>
-              <w:jc w:val="center"/>
-            </w:pPr>
-            <w:r/>
-            <w:r>
-              <w:rPr>
-                <w:rFonts w:ascii="Times New Roman" w:hAnsi="Times New Roman"/>
-                <w:sz w:val="17"/>
-              </w:rPr>
-              <w:t>sim</w:t>
-            </w:r>
-          </w:p>
-        </w:tc>
-        <w:tc>
-          <w:tcPr>
-            <w:tcW w:type="dxa" w:w="1376"/>
-            <w:tcBorders>
-              <w:top w:val="single" w:sz="6" w:color="000000"/>
-              <w:bottom w:val="single" w:sz="6" w:color="000000"/>
-            </w:tcBorders>
-          </w:tcPr>
-          <w:p>
-            <w:pPr>
-              <w:jc w:val="center"/>
-            </w:pPr>
-            <w:r/>
-            <w:r>
-              <w:rPr>
-                <w:rFonts w:ascii="Times New Roman" w:hAnsi="Times New Roman"/>
-                <w:sz w:val="17"/>
-              </w:rPr>
-              <w:t>n/d</w:t>
-            </w:r>
-          </w:p>
-        </w:tc>
-        <w:tc>
-          <w:tcPr>
-            <w:tcW w:type="dxa" w:w="1376"/>
-            <w:tcBorders>
-              <w:top w:val="single" w:sz="6" w:color="000000"/>
-              <w:bottom w:val="single" w:sz="6" w:color="000000"/>
-            </w:tcBorders>
-          </w:tcPr>
-          <w:p>
-            <w:pPr>
-              <w:jc w:val="center"/>
-            </w:pPr>
-            <w:r/>
-            <w:r>
-              <w:rPr>
-                <w:rFonts w:ascii="Times New Roman" w:hAnsi="Times New Roman"/>
-                <w:sz w:val="17"/>
-              </w:rPr>
-              <w:t>n/d</w:t>
-            </w:r>
-          </w:p>
-        </w:tc>
-        <w:tc>
-          <w:tcPr>
-            <w:tcW w:type="dxa" w:w="1376"/>
-            <w:tcBorders>
-              <w:top w:val="single" w:sz="6" w:color="000000"/>
-              <w:bottom w:val="single" w:sz="6" w:color="000000"/>
-            </w:tcBorders>
-          </w:tcPr>
-          <w:p>
-            <w:pPr>
-              <w:jc w:val="center"/>
-            </w:pPr>
-            <w:r/>
-            <w:r>
-              <w:rPr>
-                <w:rFonts w:ascii="Times New Roman" w:hAnsi="Times New Roman"/>
-                <w:sz w:val="17"/>
-              </w:rPr>
-              <w:t>n/d</w:t>
-            </w:r>
-          </w:p>
-        </w:tc>
-      </w:tr>
     </w:tbl>
     <w:p>
       <w:pPr>
@@ -5268,7 +3413,7 @@
           <w:rFonts w:ascii="Times New Roman" w:hAnsi="Times New Roman"/>
           <w:sz w:val="24"/>
         </w:rPr>
-        <w:t>No nível do item, o modelo de resposta gradual mostrou que os itens do eixo energia-fadiga são os mais discriminativos (parâmetro de discriminação a entre 1,3 e 2,2 na fadiga e no vigor), enquanto alguns itens travados no piso — os relativos a sonolência, a estado de alerta e à tensão extrema — apresentaram discriminação próxima de zero e limiares fora da faixa observável, efeito da concentração de respostas no piso, e não de falha do item. A função de informação do teste (Figura 17) confirma que a escala de vigor informa numa faixa ampla do traço, enquanto a de fadiga informa melhor em níveis acima da média, isto é, discrimina justamente quando a fadiga se eleva — a condição de interesse no monitoramento.</w:t>
+        <w:t>No nível do item, o modelo de resposta gradual mostrou que os itens do eixo energia-fadiga são os mais discriminativos (parâmetro de discriminação a entre 1,3 e 2,2 na fadiga e no vigor), enquanto alguns itens travados no piso — os relativos a sonolência, a estado de alerta e à tensão extrema — apresentaram discriminação próxima de zero e limiares fora da faixa observável, efeito da concentração de respostas no piso, e não de falha do item. A função de informação do teste (Figura 14) confirma que a escala de vigor informa numa faixa ampla do traço, enquanto a de fadiga informa melhor em níveis acima da média, isto é, discrimina justamente quando a fadiga se eleva — a condição de interesse no monitoramento.</w:t>
       </w:r>
     </w:p>
     <w:p>
@@ -5282,7 +3427,7 @@
           <w:i/>
           <w:sz w:val="24"/>
         </w:rPr>
-        <w:t>3.3  Etapa 3. Comportamento descritivo das dimensões</w:t>
+        <w:t>3.2  Etapa 2. Comportamento descritivo das dimensões</w:t>
       </w:r>
     </w:p>
     <w:p>
@@ -5295,7 +3440,7 @@
           <w:b/>
           <w:sz w:val="22"/>
         </w:rPr>
-        <w:t>Tabela 5. Estatística descritiva das variáveis de humor na semana (286 observações de 27 atletas).</w:t>
+        <w:t>Tabela 4. Estatística descritiva das variáveis de humor na semana (286 observações de 27 atletas).</w:t>
       </w:r>
     </w:p>
     <w:tbl>
@@ -6747,362 +4892,6 @@
           </w:p>
         </w:tc>
       </w:tr>
-      <w:tr>
-        <w:tc>
-          <w:tcPr>
-            <w:tcW w:type="dxa" w:w="1204"/>
-            <w:tcBorders>
-              <w:top w:val="single" w:sz="6" w:color="000000"/>
-              <w:bottom w:val="single" w:sz="6" w:color="000000"/>
-            </w:tcBorders>
-          </w:tcPr>
-          <w:p>
-            <w:pPr>
-              <w:jc w:val="left"/>
-            </w:pPr>
-            <w:r/>
-            <w:r>
-              <w:rPr>
-                <w:rFonts w:ascii="Times New Roman" w:hAnsi="Times New Roman"/>
-                <w:sz w:val="17"/>
-              </w:rPr>
-              <w:t>Fadiga física</w:t>
-            </w:r>
-          </w:p>
-        </w:tc>
-        <w:tc>
-          <w:tcPr>
-            <w:tcW w:type="dxa" w:w="1204"/>
-            <w:tcBorders>
-              <w:top w:val="single" w:sz="6" w:color="000000"/>
-              <w:bottom w:val="single" w:sz="6" w:color="000000"/>
-            </w:tcBorders>
-          </w:tcPr>
-          <w:p>
-            <w:pPr>
-              <w:jc w:val="center"/>
-            </w:pPr>
-            <w:r/>
-            <w:r>
-              <w:rPr>
-                <w:rFonts w:ascii="Times New Roman" w:hAnsi="Times New Roman"/>
-                <w:sz w:val="17"/>
-              </w:rPr>
-              <w:t>5,90 ± 2,5</w:t>
-            </w:r>
-          </w:p>
-        </w:tc>
-        <w:tc>
-          <w:tcPr>
-            <w:tcW w:type="dxa" w:w="1204"/>
-            <w:tcBorders>
-              <w:top w:val="single" w:sz="6" w:color="000000"/>
-              <w:bottom w:val="single" w:sz="6" w:color="000000"/>
-            </w:tcBorders>
-          </w:tcPr>
-          <w:p>
-            <w:pPr>
-              <w:jc w:val="center"/>
-            </w:pPr>
-            <w:r/>
-            <w:r>
-              <w:rPr>
-                <w:rFonts w:ascii="Times New Roman" w:hAnsi="Times New Roman"/>
-                <w:sz w:val="17"/>
-              </w:rPr>
-              <w:t>6,0</w:t>
-            </w:r>
-          </w:p>
-        </w:tc>
-        <w:tc>
-          <w:tcPr>
-            <w:tcW w:type="dxa" w:w="1204"/>
-            <w:tcBorders>
-              <w:top w:val="single" w:sz="6" w:color="000000"/>
-              <w:bottom w:val="single" w:sz="6" w:color="000000"/>
-            </w:tcBorders>
-          </w:tcPr>
-          <w:p>
-            <w:pPr>
-              <w:jc w:val="center"/>
-            </w:pPr>
-            <w:r/>
-            <w:r>
-              <w:rPr>
-                <w:rFonts w:ascii="Times New Roman" w:hAnsi="Times New Roman"/>
-                <w:sz w:val="17"/>
-              </w:rPr>
-              <w:t>0 – 10</w:t>
-            </w:r>
-          </w:p>
-        </w:tc>
-        <w:tc>
-          <w:tcPr>
-            <w:tcW w:type="dxa" w:w="1204"/>
-            <w:tcBorders>
-              <w:top w:val="single" w:sz="6" w:color="000000"/>
-              <w:bottom w:val="single" w:sz="6" w:color="000000"/>
-            </w:tcBorders>
-          </w:tcPr>
-          <w:p>
-            <w:pPr>
-              <w:jc w:val="center"/>
-            </w:pPr>
-            <w:r/>
-            <w:r>
-              <w:rPr>
-                <w:rFonts w:ascii="Times New Roman" w:hAnsi="Times New Roman"/>
-                <w:sz w:val="17"/>
-              </w:rPr>
-              <w:t>42</w:t>
-            </w:r>
-          </w:p>
-        </w:tc>
-        <w:tc>
-          <w:tcPr>
-            <w:tcW w:type="dxa" w:w="1204"/>
-            <w:tcBorders>
-              <w:top w:val="single" w:sz="6" w:color="000000"/>
-              <w:bottom w:val="single" w:sz="6" w:color="000000"/>
-            </w:tcBorders>
-          </w:tcPr>
-          <w:p>
-            <w:pPr>
-              <w:jc w:val="center"/>
-            </w:pPr>
-            <w:r/>
-            <w:r>
-              <w:rPr>
-                <w:rFonts w:ascii="Times New Roman" w:hAnsi="Times New Roman"/>
-                <w:sz w:val="17"/>
-              </w:rPr>
-              <w:t>1</w:t>
-            </w:r>
-          </w:p>
-        </w:tc>
-        <w:tc>
-          <w:tcPr>
-            <w:tcW w:type="dxa" w:w="1204"/>
-            <w:tcBorders>
-              <w:top w:val="single" w:sz="6" w:color="000000"/>
-              <w:bottom w:val="single" w:sz="6" w:color="000000"/>
-            </w:tcBorders>
-          </w:tcPr>
-          <w:p>
-            <w:pPr>
-              <w:jc w:val="center"/>
-            </w:pPr>
-            <w:r/>
-            <w:r>
-              <w:rPr>
-                <w:rFonts w:ascii="Times New Roman" w:hAnsi="Times New Roman"/>
-                <w:sz w:val="17"/>
-              </w:rPr>
-              <w:t>0,47</w:t>
-            </w:r>
-          </w:p>
-        </w:tc>
-        <w:tc>
-          <w:tcPr>
-            <w:tcW w:type="dxa" w:w="1204"/>
-            <w:tcBorders>
-              <w:top w:val="single" w:sz="6" w:color="000000"/>
-              <w:bottom w:val="single" w:sz="6" w:color="000000"/>
-            </w:tcBorders>
-          </w:tcPr>
-          <w:p>
-            <w:pPr>
-              <w:jc w:val="center"/>
-            </w:pPr>
-            <w:r/>
-            <w:r>
-              <w:rPr>
-                <w:rFonts w:ascii="Times New Roman" w:hAnsi="Times New Roman"/>
-                <w:sz w:val="17"/>
-              </w:rPr>
-              <w:t>4,7</w:t>
-            </w:r>
-          </w:p>
-        </w:tc>
-      </w:tr>
-      <w:tr>
-        <w:tc>
-          <w:tcPr>
-            <w:tcW w:type="dxa" w:w="1204"/>
-            <w:tcBorders>
-              <w:top w:val="single" w:sz="6" w:color="000000"/>
-              <w:bottom w:val="single" w:sz="6" w:color="000000"/>
-            </w:tcBorders>
-          </w:tcPr>
-          <w:p>
-            <w:pPr>
-              <w:jc w:val="left"/>
-            </w:pPr>
-            <w:r/>
-            <w:r>
-              <w:rPr>
-                <w:rFonts w:ascii="Times New Roman" w:hAnsi="Times New Roman"/>
-                <w:sz w:val="17"/>
-              </w:rPr>
-              <w:t>Fadiga mental</w:t>
-            </w:r>
-          </w:p>
-        </w:tc>
-        <w:tc>
-          <w:tcPr>
-            <w:tcW w:type="dxa" w:w="1204"/>
-            <w:tcBorders>
-              <w:top w:val="single" w:sz="6" w:color="000000"/>
-              <w:bottom w:val="single" w:sz="6" w:color="000000"/>
-            </w:tcBorders>
-          </w:tcPr>
-          <w:p>
-            <w:pPr>
-              <w:jc w:val="center"/>
-            </w:pPr>
-            <w:r/>
-            <w:r>
-              <w:rPr>
-                <w:rFonts w:ascii="Times New Roman" w:hAnsi="Times New Roman"/>
-                <w:sz w:val="17"/>
-              </w:rPr>
-              <w:t>4,56 ± 2,8</w:t>
-            </w:r>
-          </w:p>
-        </w:tc>
-        <w:tc>
-          <w:tcPr>
-            <w:tcW w:type="dxa" w:w="1204"/>
-            <w:tcBorders>
-              <w:top w:val="single" w:sz="6" w:color="000000"/>
-              <w:bottom w:val="single" w:sz="6" w:color="000000"/>
-            </w:tcBorders>
-          </w:tcPr>
-          <w:p>
-            <w:pPr>
-              <w:jc w:val="center"/>
-            </w:pPr>
-            <w:r/>
-            <w:r>
-              <w:rPr>
-                <w:rFonts w:ascii="Times New Roman" w:hAnsi="Times New Roman"/>
-                <w:sz w:val="17"/>
-              </w:rPr>
-              <w:t>5,0</w:t>
-            </w:r>
-          </w:p>
-        </w:tc>
-        <w:tc>
-          <w:tcPr>
-            <w:tcW w:type="dxa" w:w="1204"/>
-            <w:tcBorders>
-              <w:top w:val="single" w:sz="6" w:color="000000"/>
-              <w:bottom w:val="single" w:sz="6" w:color="000000"/>
-            </w:tcBorders>
-          </w:tcPr>
-          <w:p>
-            <w:pPr>
-              <w:jc w:val="center"/>
-            </w:pPr>
-            <w:r/>
-            <w:r>
-              <w:rPr>
-                <w:rFonts w:ascii="Times New Roman" w:hAnsi="Times New Roman"/>
-                <w:sz w:val="17"/>
-              </w:rPr>
-              <w:t>0 – 10</w:t>
-            </w:r>
-          </w:p>
-        </w:tc>
-        <w:tc>
-          <w:tcPr>
-            <w:tcW w:type="dxa" w:w="1204"/>
-            <w:tcBorders>
-              <w:top w:val="single" w:sz="6" w:color="000000"/>
-              <w:bottom w:val="single" w:sz="6" w:color="000000"/>
-            </w:tcBorders>
-          </w:tcPr>
-          <w:p>
-            <w:pPr>
-              <w:jc w:val="center"/>
-            </w:pPr>
-            <w:r/>
-            <w:r>
-              <w:rPr>
-                <w:rFonts w:ascii="Times New Roman" w:hAnsi="Times New Roman"/>
-                <w:sz w:val="17"/>
-              </w:rPr>
-              <w:t>62</w:t>
-            </w:r>
-          </w:p>
-        </w:tc>
-        <w:tc>
-          <w:tcPr>
-            <w:tcW w:type="dxa" w:w="1204"/>
-            <w:tcBorders>
-              <w:top w:val="single" w:sz="6" w:color="000000"/>
-              <w:bottom w:val="single" w:sz="6" w:color="000000"/>
-            </w:tcBorders>
-          </w:tcPr>
-          <w:p>
-            <w:pPr>
-              <w:jc w:val="center"/>
-            </w:pPr>
-            <w:r/>
-            <w:r>
-              <w:rPr>
-                <w:rFonts w:ascii="Times New Roman" w:hAnsi="Times New Roman"/>
-                <w:sz w:val="17"/>
-              </w:rPr>
-              <w:t>7</w:t>
-            </w:r>
-          </w:p>
-        </w:tc>
-        <w:tc>
-          <w:tcPr>
-            <w:tcW w:type="dxa" w:w="1204"/>
-            <w:tcBorders>
-              <w:top w:val="single" w:sz="6" w:color="000000"/>
-              <w:bottom w:val="single" w:sz="6" w:color="000000"/>
-            </w:tcBorders>
-          </w:tcPr>
-          <w:p>
-            <w:pPr>
-              <w:jc w:val="center"/>
-            </w:pPr>
-            <w:r/>
-            <w:r>
-              <w:rPr>
-                <w:rFonts w:ascii="Times New Roman" w:hAnsi="Times New Roman"/>
-                <w:sz w:val="17"/>
-              </w:rPr>
-              <w:t>0,81</w:t>
-            </w:r>
-          </w:p>
-        </w:tc>
-        <w:tc>
-          <w:tcPr>
-            <w:tcW w:type="dxa" w:w="1204"/>
-            <w:tcBorders>
-              <w:top w:val="single" w:sz="6" w:color="000000"/>
-              <w:bottom w:val="single" w:sz="6" w:color="000000"/>
-            </w:tcBorders>
-          </w:tcPr>
-          <w:p>
-            <w:pPr>
-              <w:jc w:val="center"/>
-            </w:pPr>
-            <w:r/>
-            <w:r>
-              <w:rPr>
-                <w:rFonts w:ascii="Times New Roman" w:hAnsi="Times New Roman"/>
-                <w:sz w:val="17"/>
-              </w:rPr>
-              <w:t>3,4</w:t>
-            </w:r>
-          </w:p>
-        </w:tc>
-      </w:tr>
     </w:tbl>
     <w:p>
       <w:pPr>
@@ -7114,7 +4903,7 @@
           <w:i/>
           <w:sz w:val="17"/>
         </w:rPr>
-        <w:t>As seis primeiras linhas são as dimensões do BRUMS; a PTH é um índice global derivado; fadiga física e fadiga mental são medidas complementares. CV: coeficiente de variação. Piso: escores iguais a zero. ICC: correlação intraclasse. MDC95: mudança mínima detectável a 95%.</w:t>
+        <w:t>A PTH é um índice global derivado das seis dimensões. CV: coeficiente de variação. Piso: escores iguais a zero. ICC: correlação intraclasse. MDC95: mudança mínima detectável a 95%.</w:t>
       </w:r>
     </w:p>
     <w:p>
@@ -7128,7 +4917,7 @@
           <w:rFonts w:ascii="Times New Roman" w:hAnsi="Times New Roman"/>
           <w:sz w:val="24"/>
         </w:rPr>
-        <w:t>O Vigor foi a dimensão de maior escore médio, seguido pela fadiga física. As dimensões negativas apresentaram medianas baixas e forte efeito de piso, com destaque para a depressão, em que a maioria dos atletas marcou zero. A confiabilidade entre dias variou de baixa a moderada, coerente com um humor que oscila em resposta ao treino, e os valores de mudança mínima detectável fornecem o limiar prático para julgar a variação individual.</w:t>
+        <w:t>O Vigor foi a dimensão de maior escore médio, seguido pela fadiga. As dimensões negativas apresentaram medianas baixas e forte efeito de piso, com destaque para a depressão, em que a maioria dos atletas marcou zero. A confiabilidade entre dias variou de baixa a moderada, coerente com um humor que oscila em resposta ao treino, e os valores de mudança mínima detectável fornecem o limiar prático para julgar a variação individual.</w:t>
       </w:r>
     </w:p>
     <w:p>
@@ -7142,7 +4931,7 @@
           <w:i/>
           <w:sz w:val="24"/>
         </w:rPr>
-        <w:t>3.4  Etapa 4. Variação na semana e migração de perfis</w:t>
+        <w:t>3.3  Etapa 3. Variação na semana e migração de perfis</w:t>
       </w:r>
     </w:p>
     <w:p>
@@ -7155,7 +4944,7 @@
           <w:b/>
           <w:sz w:val="22"/>
         </w:rPr>
-        <w:t>Tabela 6. Mudança das variáveis ao longo da semana (Friedman) e do primeiro ao sétimo dia (Wilcoxon).</w:t>
+        <w:t>Tabela 5. Mudança das variáveis ao longo da semana (Friedman) e do primeiro ao sétimo dia (Wilcoxon).</w:t>
       </w:r>
     </w:p>
     <w:tbl>
@@ -8607,362 +6396,6 @@
           </w:p>
         </w:tc>
       </w:tr>
-      <w:tr>
-        <w:tc>
-          <w:tcPr>
-            <w:tcW w:type="dxa" w:w="1204"/>
-            <w:tcBorders>
-              <w:top w:val="single" w:sz="6" w:color="000000"/>
-              <w:bottom w:val="single" w:sz="6" w:color="000000"/>
-            </w:tcBorders>
-          </w:tcPr>
-          <w:p>
-            <w:pPr>
-              <w:jc w:val="left"/>
-            </w:pPr>
-            <w:r/>
-            <w:r>
-              <w:rPr>
-                <w:rFonts w:ascii="Times New Roman" w:hAnsi="Times New Roman"/>
-                <w:sz w:val="17"/>
-              </w:rPr>
-              <w:t>Fadiga física</w:t>
-            </w:r>
-          </w:p>
-        </w:tc>
-        <w:tc>
-          <w:tcPr>
-            <w:tcW w:type="dxa" w:w="1204"/>
-            <w:tcBorders>
-              <w:top w:val="single" w:sz="6" w:color="000000"/>
-              <w:bottom w:val="single" w:sz="6" w:color="000000"/>
-            </w:tcBorders>
-          </w:tcPr>
-          <w:p>
-            <w:pPr>
-              <w:jc w:val="center"/>
-            </w:pPr>
-            <w:r/>
-            <w:r>
-              <w:rPr>
-                <w:rFonts w:ascii="Times New Roman" w:hAnsi="Times New Roman"/>
-                <w:sz w:val="17"/>
-              </w:rPr>
-              <w:t>51,30</w:t>
-            </w:r>
-          </w:p>
-        </w:tc>
-        <w:tc>
-          <w:tcPr>
-            <w:tcW w:type="dxa" w:w="1204"/>
-            <w:tcBorders>
-              <w:top w:val="single" w:sz="6" w:color="000000"/>
-              <w:bottom w:val="single" w:sz="6" w:color="000000"/>
-            </w:tcBorders>
-          </w:tcPr>
-          <w:p>
-            <w:pPr>
-              <w:jc w:val="center"/>
-            </w:pPr>
-            <w:r/>
-            <w:r>
-              <w:rPr>
-                <w:rFonts w:ascii="Times New Roman" w:hAnsi="Times New Roman"/>
-                <w:sz w:val="17"/>
-              </w:rPr>
-              <w:t>&lt; 0,001*</w:t>
-            </w:r>
-          </w:p>
-        </w:tc>
-        <w:tc>
-          <w:tcPr>
-            <w:tcW w:type="dxa" w:w="1204"/>
-            <w:tcBorders>
-              <w:top w:val="single" w:sz="6" w:color="000000"/>
-              <w:bottom w:val="single" w:sz="6" w:color="000000"/>
-            </w:tcBorders>
-          </w:tcPr>
-          <w:p>
-            <w:pPr>
-              <w:jc w:val="center"/>
-            </w:pPr>
-            <w:r/>
-            <w:r>
-              <w:rPr>
-                <w:rFonts w:ascii="Times New Roman" w:hAnsi="Times New Roman"/>
-                <w:sz w:val="17"/>
-              </w:rPr>
-              <w:t>0,45</w:t>
-            </w:r>
-          </w:p>
-        </w:tc>
-        <w:tc>
-          <w:tcPr>
-            <w:tcW w:type="dxa" w:w="1204"/>
-            <w:tcBorders>
-              <w:top w:val="single" w:sz="6" w:color="000000"/>
-              <w:bottom w:val="single" w:sz="6" w:color="000000"/>
-            </w:tcBorders>
-          </w:tcPr>
-          <w:p>
-            <w:pPr>
-              <w:jc w:val="center"/>
-            </w:pPr>
-            <w:r/>
-            <w:r>
-              <w:rPr>
-                <w:rFonts w:ascii="Times New Roman" w:hAnsi="Times New Roman"/>
-                <w:sz w:val="17"/>
-              </w:rPr>
-              <w:t>3,6 → 7,5</w:t>
-            </w:r>
-          </w:p>
-        </w:tc>
-        <w:tc>
-          <w:tcPr>
-            <w:tcW w:type="dxa" w:w="1204"/>
-            <w:tcBorders>
-              <w:top w:val="single" w:sz="6" w:color="000000"/>
-              <w:bottom w:val="single" w:sz="6" w:color="000000"/>
-            </w:tcBorders>
-          </w:tcPr>
-          <w:p>
-            <w:pPr>
-              <w:jc w:val="center"/>
-            </w:pPr>
-            <w:r/>
-            <w:r>
-              <w:rPr>
-                <w:rFonts w:ascii="Times New Roman" w:hAnsi="Times New Roman"/>
-                <w:sz w:val="17"/>
-              </w:rPr>
-              <w:t>+3,9</w:t>
-            </w:r>
-          </w:p>
-        </w:tc>
-        <w:tc>
-          <w:tcPr>
-            <w:tcW w:type="dxa" w:w="1204"/>
-            <w:tcBorders>
-              <w:top w:val="single" w:sz="6" w:color="000000"/>
-              <w:bottom w:val="single" w:sz="6" w:color="000000"/>
-            </w:tcBorders>
-          </w:tcPr>
-          <w:p>
-            <w:pPr>
-              <w:jc w:val="center"/>
-            </w:pPr>
-            <w:r/>
-            <w:r>
-              <w:rPr>
-                <w:rFonts w:ascii="Times New Roman" w:hAnsi="Times New Roman"/>
-                <w:sz w:val="17"/>
-              </w:rPr>
-              <w:t>+1,88</w:t>
-            </w:r>
-          </w:p>
-        </w:tc>
-        <w:tc>
-          <w:tcPr>
-            <w:tcW w:type="dxa" w:w="1204"/>
-            <w:tcBorders>
-              <w:top w:val="single" w:sz="6" w:color="000000"/>
-              <w:bottom w:val="single" w:sz="6" w:color="000000"/>
-            </w:tcBorders>
-          </w:tcPr>
-          <w:p>
-            <w:pPr>
-              <w:jc w:val="center"/>
-            </w:pPr>
-            <w:r/>
-            <w:r>
-              <w:rPr>
-                <w:rFonts w:ascii="Times New Roman" w:hAnsi="Times New Roman"/>
-                <w:sz w:val="17"/>
-              </w:rPr>
-              <w:t>&lt; 0,001*</w:t>
-            </w:r>
-          </w:p>
-        </w:tc>
-      </w:tr>
-      <w:tr>
-        <w:tc>
-          <w:tcPr>
-            <w:tcW w:type="dxa" w:w="1204"/>
-            <w:tcBorders>
-              <w:top w:val="single" w:sz="6" w:color="000000"/>
-              <w:bottom w:val="single" w:sz="6" w:color="000000"/>
-            </w:tcBorders>
-          </w:tcPr>
-          <w:p>
-            <w:pPr>
-              <w:jc w:val="left"/>
-            </w:pPr>
-            <w:r/>
-            <w:r>
-              <w:rPr>
-                <w:rFonts w:ascii="Times New Roman" w:hAnsi="Times New Roman"/>
-                <w:sz w:val="17"/>
-              </w:rPr>
-              <w:t>Fadiga mental</w:t>
-            </w:r>
-          </w:p>
-        </w:tc>
-        <w:tc>
-          <w:tcPr>
-            <w:tcW w:type="dxa" w:w="1204"/>
-            <w:tcBorders>
-              <w:top w:val="single" w:sz="6" w:color="000000"/>
-              <w:bottom w:val="single" w:sz="6" w:color="000000"/>
-            </w:tcBorders>
-          </w:tcPr>
-          <w:p>
-            <w:pPr>
-              <w:jc w:val="center"/>
-            </w:pPr>
-            <w:r/>
-            <w:r>
-              <w:rPr>
-                <w:rFonts w:ascii="Times New Roman" w:hAnsi="Times New Roman"/>
-                <w:sz w:val="17"/>
-              </w:rPr>
-              <w:t>8,79</w:t>
-            </w:r>
-          </w:p>
-        </w:tc>
-        <w:tc>
-          <w:tcPr>
-            <w:tcW w:type="dxa" w:w="1204"/>
-            <w:tcBorders>
-              <w:top w:val="single" w:sz="6" w:color="000000"/>
-              <w:bottom w:val="single" w:sz="6" w:color="000000"/>
-            </w:tcBorders>
-          </w:tcPr>
-          <w:p>
-            <w:pPr>
-              <w:jc w:val="center"/>
-            </w:pPr>
-            <w:r/>
-            <w:r>
-              <w:rPr>
-                <w:rFonts w:ascii="Times New Roman" w:hAnsi="Times New Roman"/>
-                <w:sz w:val="17"/>
-              </w:rPr>
-              <w:t>0,186</w:t>
-            </w:r>
-          </w:p>
-        </w:tc>
-        <w:tc>
-          <w:tcPr>
-            <w:tcW w:type="dxa" w:w="1204"/>
-            <w:tcBorders>
-              <w:top w:val="single" w:sz="6" w:color="000000"/>
-              <w:bottom w:val="single" w:sz="6" w:color="000000"/>
-            </w:tcBorders>
-          </w:tcPr>
-          <w:p>
-            <w:pPr>
-              <w:jc w:val="center"/>
-            </w:pPr>
-            <w:r/>
-            <w:r>
-              <w:rPr>
-                <w:rFonts w:ascii="Times New Roman" w:hAnsi="Times New Roman"/>
-                <w:sz w:val="17"/>
-              </w:rPr>
-              <w:t>0,08</w:t>
-            </w:r>
-          </w:p>
-        </w:tc>
-        <w:tc>
-          <w:tcPr>
-            <w:tcW w:type="dxa" w:w="1204"/>
-            <w:tcBorders>
-              <w:top w:val="single" w:sz="6" w:color="000000"/>
-              <w:bottom w:val="single" w:sz="6" w:color="000000"/>
-            </w:tcBorders>
-          </w:tcPr>
-          <w:p>
-            <w:pPr>
-              <w:jc w:val="center"/>
-            </w:pPr>
-            <w:r/>
-            <w:r>
-              <w:rPr>
-                <w:rFonts w:ascii="Times New Roman" w:hAnsi="Times New Roman"/>
-                <w:sz w:val="17"/>
-              </w:rPr>
-              <w:t>4,1 → 5,0</w:t>
-            </w:r>
-          </w:p>
-        </w:tc>
-        <w:tc>
-          <w:tcPr>
-            <w:tcW w:type="dxa" w:w="1204"/>
-            <w:tcBorders>
-              <w:top w:val="single" w:sz="6" w:color="000000"/>
-              <w:bottom w:val="single" w:sz="6" w:color="000000"/>
-            </w:tcBorders>
-          </w:tcPr>
-          <w:p>
-            <w:pPr>
-              <w:jc w:val="center"/>
-            </w:pPr>
-            <w:r/>
-            <w:r>
-              <w:rPr>
-                <w:rFonts w:ascii="Times New Roman" w:hAnsi="Times New Roman"/>
-                <w:sz w:val="17"/>
-              </w:rPr>
-              <w:t>+1,0</w:t>
-            </w:r>
-          </w:p>
-        </w:tc>
-        <w:tc>
-          <w:tcPr>
-            <w:tcW w:type="dxa" w:w="1204"/>
-            <w:tcBorders>
-              <w:top w:val="single" w:sz="6" w:color="000000"/>
-              <w:bottom w:val="single" w:sz="6" w:color="000000"/>
-            </w:tcBorders>
-          </w:tcPr>
-          <w:p>
-            <w:pPr>
-              <w:jc w:val="center"/>
-            </w:pPr>
-            <w:r/>
-            <w:r>
-              <w:rPr>
-                <w:rFonts w:ascii="Times New Roman" w:hAnsi="Times New Roman"/>
-                <w:sz w:val="17"/>
-              </w:rPr>
-              <w:t>+0,53</w:t>
-            </w:r>
-          </w:p>
-        </w:tc>
-        <w:tc>
-          <w:tcPr>
-            <w:tcW w:type="dxa" w:w="1204"/>
-            <w:tcBorders>
-              <w:top w:val="single" w:sz="6" w:color="000000"/>
-              <w:bottom w:val="single" w:sz="6" w:color="000000"/>
-            </w:tcBorders>
-          </w:tcPr>
-          <w:p>
-            <w:pPr>
-              <w:jc w:val="center"/>
-            </w:pPr>
-            <w:r/>
-            <w:r>
-              <w:rPr>
-                <w:rFonts w:ascii="Times New Roman" w:hAnsi="Times New Roman"/>
-                <w:sz w:val="17"/>
-              </w:rPr>
-              <w:t>0,031*</w:t>
-            </w:r>
-          </w:p>
-        </w:tc>
-      </w:tr>
     </w:tbl>
     <w:p>
       <w:pPr>
@@ -8988,7 +6421,7 @@
           <w:rFonts w:ascii="Times New Roman" w:hAnsi="Times New Roman"/>
           <w:sz w:val="24"/>
         </w:rPr>
-        <w:t>Vigor, fadiga, tensão, confusão, PTH e, com o maior tamanho de efeito, a fadiga física mudaram de forma significativa ao longo da semana. O padrão é consistente: o vigor caiu e as dimensões de fadiga aumentaram. A depressão, a raiva e a fadiga mental permaneceram estáveis, o que indica perda de energia e acúmulo de fadiga física, e não um quadro de humor negativo generalizado. A Figura 3 separa, para cada dimensão, o efeito imediato de cada sessão do efeito acumulado ao longo dos dias, e confirma que a mudança foi predominantemente acumulada. A Figura 4 mostra, em um único mapa, onde e quanto cada dimensão mudou em cada transição da semana.</w:t>
+        <w:t>Vigor, fadiga, tensão, confusão e PTH mudaram de forma significativa ao longo da semana, com o maior tamanho de efeito no vigor. O padrão é consistente: o vigor caiu e a fadiga aumentou. A depressão e a raiva permaneceram estáveis, o que indica perda de energia e acúmulo de fadiga, e não um quadro de humor negativo generalizado. A Figura 3 separa, para cada dimensão, o efeito imediato de cada sessão do efeito acumulado ao longo dos dias, e confirma que a mudança foi predominantemente acumulada. A Figura 4 mostra, em um único mapa, onde e quanto cada dimensão mudou em cada transição da semana.</w:t>
       </w:r>
     </w:p>
     <w:p>
@@ -9002,7 +6435,7 @@
           <w:rFonts w:ascii="Times New Roman" w:hAnsi="Times New Roman"/>
           <w:sz w:val="24"/>
         </w:rPr>
-        <w:t xml:space="preserve"> A mudança do perfil ao longo da semana também foi confirmada de forma multivariada e sem pressupor normalidade: a PERMANOVA indicou deslocamento significativo do perfil de humor entre o pré e o pós-treino (pseudo-F = 2,52; p = 0,002) e entre os dias com e sem sessão de HIIT (pseudo-F = 2,71; p = 0,007); o teste de dispersões (PERMDISP) mostrou que, no contraste pré-pós, a diferença reflete deslocamento do centroide, e não heterogeneidade de variância. Esse resultado multivariado converge com os testes univariados de Friedman e com a leitura das trajetórias suavizadas.</w:t>
+        <w:t xml:space="preserve"> A mudança do perfil ao longo da semana também foi confirmada de forma multivariada e sem pressupor normalidade: a PERMANOVA indicou deslocamento significativo do perfil de humor entre o pré e o pós-treino (pseudo-F = 2,52; p = 0,002), com o teste de dispersões (PERMDISP) mostrando que a diferença reflete deslocamento do centroide, e não heterogeneidade de variância. Esse resultado multivariado converge com os testes univariados de Friedman e com a leitura das trajetórias suavizadas.</w:t>
       </w:r>
     </w:p>
     <w:p>
@@ -9121,7 +6554,7 @@
           <w:b/>
           <w:sz w:val="22"/>
         </w:rPr>
-        <w:t>Tabela 7. Distribuição dos perfis de humor no primeiro e no sétimo dia.</w:t>
+        <w:t>Tabela 6. Distribuição dos perfis de humor no primeiro e no sétimo dia.</w:t>
       </w:r>
     </w:p>
     <w:tbl>
@@ -9654,7 +7087,7 @@
           <w:i/>
           <w:sz w:val="24"/>
         </w:rPr>
-        <w:t>3.5  Etapa 5. Filtragem das curvas e cruzamentos das variáveis</w:t>
+        <w:t>3.4  Etapa 4. Filtragem das curvas e cruzamentos das variáveis</w:t>
       </w:r>
     </w:p>
     <w:p>
@@ -9735,7 +7168,7 @@
           <w:rFonts w:ascii="Times New Roman" w:hAnsi="Times New Roman"/>
           <w:sz w:val="24"/>
         </w:rPr>
-        <w:t>A partir das curvas filtradas, a Figura 7 mostra onde as variáveis se cruzam ao longo da semana. No primeiro dia, o vigor está bem acima da fadiga, configuração do perfil de iceberg. As curvas de vigor e fadiga se cruzam por volta dos dias 2,3, 3,9 e 5,8, e no fim da semana a fadiga e a fadiga física passam a superar o vigor. Esse cruzamento do eixo energia-fadiga é a expressão gráfica da transição do perfil de iceberg para o de barbatana de tubarão, e localiza com precisão o momento em que o desgaste se sobrepõe à energia.</w:t>
+        <w:t>A partir das curvas filtradas, a Figura 6 mostra onde as variáveis se cruzam ao longo da semana. No primeiro dia, o vigor está bem acima da fadiga, configuração do perfil de iceberg. As curvas de vigor e fadiga se cruzam por volta dos dias 2,3, 3,9 e 5,8, e no fim da semana a fadiga passa a superar o vigor. Esse cruzamento do eixo energia-fadiga é a expressão gráfica da transição do perfil de iceberg para o de barbatana de tubarão, e localiza com precisão o momento em que o desgaste se sobrepõe à energia.</w:t>
       </w:r>
     </w:p>
     <w:p>
@@ -9788,7 +7221,7 @@
           <w:rFonts w:ascii="Times New Roman" w:hAnsi="Times New Roman"/>
           <w:sz w:val="21"/>
         </w:rPr>
-        <w:t>Figura 6. Cruzamentos das variáveis ao longo da semana. Curvas filtradas de vigor, fadiga e fadiga física; os círculos marcam os cruzamentos entre vigor e fadiga (dias 2,3, 3,9 e 5,8).</w:t>
+        <w:t>Figura 6. Cruzamentos das variáveis ao longo da semana. Curvas filtradas de vigor e fadiga; os círculos marcam os cruzamentos entre vigor e fadiga (dias 2,3, 3,9 e 5,8).</w:t>
       </w:r>
     </w:p>
     <w:p>
@@ -9802,810 +7235,7 @@
           <w:i/>
           <w:sz w:val="24"/>
         </w:rPr>
-        <w:t>3.6  Etapa 6. Associação entre aptidão e humor</w:t>
-      </w:r>
-    </w:p>
-    <w:p>
-      <w:pPr>
-        <w:spacing w:before="200" w:after="40"/>
-      </w:pPr>
-      <w:r>
-        <w:rPr>
-          <w:rFonts w:ascii="Times New Roman" w:hAnsi="Times New Roman"/>
-          <w:b/>
-          <w:sz w:val="22"/>
-        </w:rPr>
-        <w:t>Tabela 8. Correlação de Spearman entre o pico de velocidade no T-car e o humor: nível semanal e deterioração (D1→D7).</w:t>
-      </w:r>
-    </w:p>
-    <w:tbl>
-      <w:tblPr>
-        <w:tblW w:type="auto" w:w="0"/>
-        <w:jc w:val="center"/>
-        <w:tblLayout w:type="autofit"/>
-        <w:tblLook w:firstColumn="1" w:firstRow="1" w:lastColumn="0" w:lastRow="0" w:noHBand="0" w:noVBand="1" w:val="04A0"/>
-      </w:tblPr>
-      <w:tblGrid>
-        <w:gridCol w:w="3211"/>
-        <w:gridCol w:w="3211"/>
-        <w:gridCol w:w="3211"/>
-      </w:tblGrid>
-      <w:tr>
-        <w:tc>
-          <w:tcPr>
-            <w:tcW w:type="dxa" w:w="3211"/>
-            <w:tcBorders>
-              <w:top w:val="single" w:sz="6" w:color="000000"/>
-              <w:bottom w:val="single" w:sz="6" w:color="000000"/>
-            </w:tcBorders>
-          </w:tcPr>
-          <w:p>
-            <w:pPr>
-              <w:jc w:val="left"/>
-            </w:pPr>
-            <w:r/>
-            <w:r>
-              <w:rPr>
-                <w:rFonts w:ascii="Times New Roman" w:hAnsi="Times New Roman"/>
-                <w:b/>
-                <w:sz w:val="17"/>
-              </w:rPr>
-              <w:t>Variável</w:t>
-            </w:r>
-          </w:p>
-        </w:tc>
-        <w:tc>
-          <w:tcPr>
-            <w:tcW w:type="dxa" w:w="3211"/>
-            <w:tcBorders>
-              <w:top w:val="single" w:sz="6" w:color="000000"/>
-              <w:bottom w:val="single" w:sz="6" w:color="000000"/>
-            </w:tcBorders>
-          </w:tcPr>
-          <w:p>
-            <w:pPr>
-              <w:jc w:val="center"/>
-            </w:pPr>
-            <w:r/>
-            <w:r>
-              <w:rPr>
-                <w:rFonts w:ascii="Times New Roman" w:hAnsi="Times New Roman"/>
-                <w:b/>
-                <w:sz w:val="17"/>
-              </w:rPr>
-              <w:t>PV × nível (rho, p)</w:t>
-            </w:r>
-          </w:p>
-        </w:tc>
-        <w:tc>
-          <w:tcPr>
-            <w:tcW w:type="dxa" w:w="3211"/>
-            <w:tcBorders>
-              <w:top w:val="single" w:sz="6" w:color="000000"/>
-              <w:bottom w:val="single" w:sz="6" w:color="000000"/>
-            </w:tcBorders>
-          </w:tcPr>
-          <w:p>
-            <w:pPr>
-              <w:jc w:val="center"/>
-            </w:pPr>
-            <w:r/>
-            <w:r>
-              <w:rPr>
-                <w:rFonts w:ascii="Times New Roman" w:hAnsi="Times New Roman"/>
-                <w:b/>
-                <w:sz w:val="17"/>
-              </w:rPr>
-              <w:t>PV × deterioração (rho, p)</w:t>
-            </w:r>
-          </w:p>
-        </w:tc>
-      </w:tr>
-      <w:tr>
-        <w:tc>
-          <w:tcPr>
-            <w:tcW w:type="dxa" w:w="3211"/>
-            <w:tcBorders>
-              <w:top w:val="single" w:sz="6" w:color="000000"/>
-              <w:bottom w:val="single" w:sz="6" w:color="000000"/>
-            </w:tcBorders>
-          </w:tcPr>
-          <w:p>
-            <w:pPr>
-              <w:jc w:val="left"/>
-            </w:pPr>
-            <w:r/>
-            <w:r>
-              <w:rPr>
-                <w:rFonts w:ascii="Times New Roman" w:hAnsi="Times New Roman"/>
-                <w:sz w:val="17"/>
-              </w:rPr>
-              <w:t>Vigor</w:t>
-            </w:r>
-          </w:p>
-        </w:tc>
-        <w:tc>
-          <w:tcPr>
-            <w:tcW w:type="dxa" w:w="3211"/>
-            <w:tcBorders>
-              <w:top w:val="single" w:sz="6" w:color="000000"/>
-              <w:bottom w:val="single" w:sz="6" w:color="000000"/>
-            </w:tcBorders>
-          </w:tcPr>
-          <w:p>
-            <w:pPr>
-              <w:jc w:val="center"/>
-            </w:pPr>
-            <w:r/>
-            <w:r>
-              <w:rPr>
-                <w:rFonts w:ascii="Times New Roman" w:hAnsi="Times New Roman"/>
-                <w:sz w:val="17"/>
-              </w:rPr>
-              <w:t>+0,19 (0,366)</w:t>
-            </w:r>
-          </w:p>
-        </w:tc>
-        <w:tc>
-          <w:tcPr>
-            <w:tcW w:type="dxa" w:w="3211"/>
-            <w:tcBorders>
-              <w:top w:val="single" w:sz="6" w:color="000000"/>
-              <w:bottom w:val="single" w:sz="6" w:color="000000"/>
-            </w:tcBorders>
-          </w:tcPr>
-          <w:p>
-            <w:pPr>
-              <w:jc w:val="center"/>
-            </w:pPr>
-            <w:r/>
-            <w:r>
-              <w:rPr>
-                <w:rFonts w:ascii="Times New Roman" w:hAnsi="Times New Roman"/>
-                <w:sz w:val="17"/>
-              </w:rPr>
-              <w:t>+0,29 (0,214)</w:t>
-            </w:r>
-          </w:p>
-        </w:tc>
-      </w:tr>
-      <w:tr>
-        <w:tc>
-          <w:tcPr>
-            <w:tcW w:type="dxa" w:w="3211"/>
-            <w:tcBorders>
-              <w:top w:val="single" w:sz="6" w:color="000000"/>
-              <w:bottom w:val="single" w:sz="6" w:color="000000"/>
-            </w:tcBorders>
-          </w:tcPr>
-          <w:p>
-            <w:pPr>
-              <w:jc w:val="left"/>
-            </w:pPr>
-            <w:r/>
-            <w:r>
-              <w:rPr>
-                <w:rFonts w:ascii="Times New Roman" w:hAnsi="Times New Roman"/>
-                <w:sz w:val="17"/>
-              </w:rPr>
-              <w:t>Fadiga</w:t>
-            </w:r>
-          </w:p>
-        </w:tc>
-        <w:tc>
-          <w:tcPr>
-            <w:tcW w:type="dxa" w:w="3211"/>
-            <w:tcBorders>
-              <w:top w:val="single" w:sz="6" w:color="000000"/>
-              <w:bottom w:val="single" w:sz="6" w:color="000000"/>
-            </w:tcBorders>
-          </w:tcPr>
-          <w:p>
-            <w:pPr>
-              <w:jc w:val="center"/>
-            </w:pPr>
-            <w:r/>
-            <w:r>
-              <w:rPr>
-                <w:rFonts w:ascii="Times New Roman" w:hAnsi="Times New Roman"/>
-                <w:sz w:val="17"/>
-              </w:rPr>
-              <w:t>-0,35 (0,091)</w:t>
-            </w:r>
-          </w:p>
-        </w:tc>
-        <w:tc>
-          <w:tcPr>
-            <w:tcW w:type="dxa" w:w="3211"/>
-            <w:tcBorders>
-              <w:top w:val="single" w:sz="6" w:color="000000"/>
-              <w:bottom w:val="single" w:sz="6" w:color="000000"/>
-            </w:tcBorders>
-          </w:tcPr>
-          <w:p>
-            <w:pPr>
-              <w:jc w:val="center"/>
-            </w:pPr>
-            <w:r/>
-            <w:r>
-              <w:rPr>
-                <w:rFonts w:ascii="Times New Roman" w:hAnsi="Times New Roman"/>
-                <w:sz w:val="17"/>
-              </w:rPr>
-              <w:t>-0,16 (0,488)</w:t>
-            </w:r>
-          </w:p>
-        </w:tc>
-      </w:tr>
-      <w:tr>
-        <w:tc>
-          <w:tcPr>
-            <w:tcW w:type="dxa" w:w="3211"/>
-            <w:tcBorders>
-              <w:top w:val="single" w:sz="6" w:color="000000"/>
-              <w:bottom w:val="single" w:sz="6" w:color="000000"/>
-            </w:tcBorders>
-          </w:tcPr>
-          <w:p>
-            <w:pPr>
-              <w:jc w:val="left"/>
-            </w:pPr>
-            <w:r/>
-            <w:r>
-              <w:rPr>
-                <w:rFonts w:ascii="Times New Roman" w:hAnsi="Times New Roman"/>
-                <w:sz w:val="17"/>
-              </w:rPr>
-              <w:t>Tensão</w:t>
-            </w:r>
-          </w:p>
-        </w:tc>
-        <w:tc>
-          <w:tcPr>
-            <w:tcW w:type="dxa" w:w="3211"/>
-            <w:tcBorders>
-              <w:top w:val="single" w:sz="6" w:color="000000"/>
-              <w:bottom w:val="single" w:sz="6" w:color="000000"/>
-            </w:tcBorders>
-          </w:tcPr>
-          <w:p>
-            <w:pPr>
-              <w:jc w:val="center"/>
-            </w:pPr>
-            <w:r/>
-            <w:r>
-              <w:rPr>
-                <w:rFonts w:ascii="Times New Roman" w:hAnsi="Times New Roman"/>
-                <w:sz w:val="17"/>
-              </w:rPr>
-              <w:t>+0,12 (0,563)</w:t>
-            </w:r>
-          </w:p>
-        </w:tc>
-        <w:tc>
-          <w:tcPr>
-            <w:tcW w:type="dxa" w:w="3211"/>
-            <w:tcBorders>
-              <w:top w:val="single" w:sz="6" w:color="000000"/>
-              <w:bottom w:val="single" w:sz="6" w:color="000000"/>
-            </w:tcBorders>
-          </w:tcPr>
-          <w:p>
-            <w:pPr>
-              <w:jc w:val="center"/>
-            </w:pPr>
-            <w:r/>
-            <w:r>
-              <w:rPr>
-                <w:rFonts w:ascii="Times New Roman" w:hAnsi="Times New Roman"/>
-                <w:sz w:val="17"/>
-              </w:rPr>
-              <w:t>n/d</w:t>
-            </w:r>
-          </w:p>
-        </w:tc>
-      </w:tr>
-      <w:tr>
-        <w:tc>
-          <w:tcPr>
-            <w:tcW w:type="dxa" w:w="3211"/>
-            <w:tcBorders>
-              <w:top w:val="single" w:sz="6" w:color="000000"/>
-              <w:bottom w:val="single" w:sz="6" w:color="000000"/>
-            </w:tcBorders>
-          </w:tcPr>
-          <w:p>
-            <w:pPr>
-              <w:jc w:val="left"/>
-            </w:pPr>
-            <w:r/>
-            <w:r>
-              <w:rPr>
-                <w:rFonts w:ascii="Times New Roman" w:hAnsi="Times New Roman"/>
-                <w:sz w:val="17"/>
-              </w:rPr>
-              <w:t>Depressão</w:t>
-            </w:r>
-          </w:p>
-        </w:tc>
-        <w:tc>
-          <w:tcPr>
-            <w:tcW w:type="dxa" w:w="3211"/>
-            <w:tcBorders>
-              <w:top w:val="single" w:sz="6" w:color="000000"/>
-              <w:bottom w:val="single" w:sz="6" w:color="000000"/>
-            </w:tcBorders>
-          </w:tcPr>
-          <w:p>
-            <w:pPr>
-              <w:jc w:val="center"/>
-            </w:pPr>
-            <w:r/>
-            <w:r>
-              <w:rPr>
-                <w:rFonts w:ascii="Times New Roman" w:hAnsi="Times New Roman"/>
-                <w:sz w:val="17"/>
-              </w:rPr>
-              <w:t>-0,09 (0,669)</w:t>
-            </w:r>
-          </w:p>
-        </w:tc>
-        <w:tc>
-          <w:tcPr>
-            <w:tcW w:type="dxa" w:w="3211"/>
-            <w:tcBorders>
-              <w:top w:val="single" w:sz="6" w:color="000000"/>
-              <w:bottom w:val="single" w:sz="6" w:color="000000"/>
-            </w:tcBorders>
-          </w:tcPr>
-          <w:p>
-            <w:pPr>
-              <w:jc w:val="center"/>
-            </w:pPr>
-            <w:r/>
-            <w:r>
-              <w:rPr>
-                <w:rFonts w:ascii="Times New Roman" w:hAnsi="Times New Roman"/>
-                <w:sz w:val="17"/>
-              </w:rPr>
-              <w:t>+0,01 (0,973)</w:t>
-            </w:r>
-          </w:p>
-        </w:tc>
-      </w:tr>
-      <w:tr>
-        <w:tc>
-          <w:tcPr>
-            <w:tcW w:type="dxa" w:w="3211"/>
-            <w:tcBorders>
-              <w:top w:val="single" w:sz="6" w:color="000000"/>
-              <w:bottom w:val="single" w:sz="6" w:color="000000"/>
-            </w:tcBorders>
-          </w:tcPr>
-          <w:p>
-            <w:pPr>
-              <w:jc w:val="left"/>
-            </w:pPr>
-            <w:r/>
-            <w:r>
-              <w:rPr>
-                <w:rFonts w:ascii="Times New Roman" w:hAnsi="Times New Roman"/>
-                <w:sz w:val="17"/>
-              </w:rPr>
-              <w:t>Raiva</w:t>
-            </w:r>
-          </w:p>
-        </w:tc>
-        <w:tc>
-          <w:tcPr>
-            <w:tcW w:type="dxa" w:w="3211"/>
-            <w:tcBorders>
-              <w:top w:val="single" w:sz="6" w:color="000000"/>
-              <w:bottom w:val="single" w:sz="6" w:color="000000"/>
-            </w:tcBorders>
-          </w:tcPr>
-          <w:p>
-            <w:pPr>
-              <w:jc w:val="center"/>
-            </w:pPr>
-            <w:r/>
-            <w:r>
-              <w:rPr>
-                <w:rFonts w:ascii="Times New Roman" w:hAnsi="Times New Roman"/>
-                <w:sz w:val="17"/>
-              </w:rPr>
-              <w:t>+0,20 (0,352)</w:t>
-            </w:r>
-          </w:p>
-        </w:tc>
-        <w:tc>
-          <w:tcPr>
-            <w:tcW w:type="dxa" w:w="3211"/>
-            <w:tcBorders>
-              <w:top w:val="single" w:sz="6" w:color="000000"/>
-              <w:bottom w:val="single" w:sz="6" w:color="000000"/>
-            </w:tcBorders>
-          </w:tcPr>
-          <w:p>
-            <w:pPr>
-              <w:jc w:val="center"/>
-            </w:pPr>
-            <w:r/>
-            <w:r>
-              <w:rPr>
-                <w:rFonts w:ascii="Times New Roman" w:hAnsi="Times New Roman"/>
-                <w:sz w:val="17"/>
-              </w:rPr>
-              <w:t>n/d</w:t>
-            </w:r>
-          </w:p>
-        </w:tc>
-      </w:tr>
-      <w:tr>
-        <w:tc>
-          <w:tcPr>
-            <w:tcW w:type="dxa" w:w="3211"/>
-            <w:tcBorders>
-              <w:top w:val="single" w:sz="6" w:color="000000"/>
-              <w:bottom w:val="single" w:sz="6" w:color="000000"/>
-            </w:tcBorders>
-          </w:tcPr>
-          <w:p>
-            <w:pPr>
-              <w:jc w:val="left"/>
-            </w:pPr>
-            <w:r/>
-            <w:r>
-              <w:rPr>
-                <w:rFonts w:ascii="Times New Roman" w:hAnsi="Times New Roman"/>
-                <w:sz w:val="17"/>
-              </w:rPr>
-              <w:t>Confusão</w:t>
-            </w:r>
-          </w:p>
-        </w:tc>
-        <w:tc>
-          <w:tcPr>
-            <w:tcW w:type="dxa" w:w="3211"/>
-            <w:tcBorders>
-              <w:top w:val="single" w:sz="6" w:color="000000"/>
-              <w:bottom w:val="single" w:sz="6" w:color="000000"/>
-            </w:tcBorders>
-          </w:tcPr>
-          <w:p>
-            <w:pPr>
-              <w:jc w:val="center"/>
-            </w:pPr>
-            <w:r/>
-            <w:r>
-              <w:rPr>
-                <w:rFonts w:ascii="Times New Roman" w:hAnsi="Times New Roman"/>
-                <w:sz w:val="17"/>
-              </w:rPr>
-              <w:t>-0,07 (0,729)</w:t>
-            </w:r>
-          </w:p>
-        </w:tc>
-        <w:tc>
-          <w:tcPr>
-            <w:tcW w:type="dxa" w:w="3211"/>
-            <w:tcBorders>
-              <w:top w:val="single" w:sz="6" w:color="000000"/>
-              <w:bottom w:val="single" w:sz="6" w:color="000000"/>
-            </w:tcBorders>
-          </w:tcPr>
-          <w:p>
-            <w:pPr>
-              <w:jc w:val="center"/>
-            </w:pPr>
-            <w:r/>
-            <w:r>
-              <w:rPr>
-                <w:rFonts w:ascii="Times New Roman" w:hAnsi="Times New Roman"/>
-                <w:sz w:val="17"/>
-              </w:rPr>
-              <w:t>n/d</w:t>
-            </w:r>
-          </w:p>
-        </w:tc>
-      </w:tr>
-      <w:tr>
-        <w:tc>
-          <w:tcPr>
-            <w:tcW w:type="dxa" w:w="3211"/>
-            <w:tcBorders>
-              <w:top w:val="single" w:sz="6" w:color="000000"/>
-              <w:bottom w:val="single" w:sz="6" w:color="000000"/>
-            </w:tcBorders>
-          </w:tcPr>
-          <w:p>
-            <w:pPr>
-              <w:jc w:val="left"/>
-            </w:pPr>
-            <w:r/>
-            <w:r>
-              <w:rPr>
-                <w:rFonts w:ascii="Times New Roman" w:hAnsi="Times New Roman"/>
-                <w:sz w:val="17"/>
-              </w:rPr>
-              <w:t>Perturbação total do humor (PTH)</w:t>
-            </w:r>
-          </w:p>
-        </w:tc>
-        <w:tc>
-          <w:tcPr>
-            <w:tcW w:type="dxa" w:w="3211"/>
-            <w:tcBorders>
-              <w:top w:val="single" w:sz="6" w:color="000000"/>
-              <w:bottom w:val="single" w:sz="6" w:color="000000"/>
-            </w:tcBorders>
-          </w:tcPr>
-          <w:p>
-            <w:pPr>
-              <w:jc w:val="center"/>
-            </w:pPr>
-            <w:r/>
-            <w:r>
-              <w:rPr>
-                <w:rFonts w:ascii="Times New Roman" w:hAnsi="Times New Roman"/>
-                <w:sz w:val="17"/>
-              </w:rPr>
-              <w:t>-0,21 (0,332)</w:t>
-            </w:r>
-          </w:p>
-        </w:tc>
-        <w:tc>
-          <w:tcPr>
-            <w:tcW w:type="dxa" w:w="3211"/>
-            <w:tcBorders>
-              <w:top w:val="single" w:sz="6" w:color="000000"/>
-              <w:bottom w:val="single" w:sz="6" w:color="000000"/>
-            </w:tcBorders>
-          </w:tcPr>
-          <w:p>
-            <w:pPr>
-              <w:jc w:val="center"/>
-            </w:pPr>
-            <w:r/>
-            <w:r>
-              <w:rPr>
-                <w:rFonts w:ascii="Times New Roman" w:hAnsi="Times New Roman"/>
-                <w:sz w:val="17"/>
-              </w:rPr>
-              <w:t>-0,21 (0,376)</w:t>
-            </w:r>
-          </w:p>
-        </w:tc>
-      </w:tr>
-      <w:tr>
-        <w:tc>
-          <w:tcPr>
-            <w:tcW w:type="dxa" w:w="3211"/>
-            <w:tcBorders>
-              <w:top w:val="single" w:sz="6" w:color="000000"/>
-              <w:bottom w:val="single" w:sz="6" w:color="000000"/>
-            </w:tcBorders>
-          </w:tcPr>
-          <w:p>
-            <w:pPr>
-              <w:jc w:val="left"/>
-            </w:pPr>
-            <w:r/>
-            <w:r>
-              <w:rPr>
-                <w:rFonts w:ascii="Times New Roman" w:hAnsi="Times New Roman"/>
-                <w:sz w:val="17"/>
-              </w:rPr>
-              <w:t>Fadiga física</w:t>
-            </w:r>
-          </w:p>
-        </w:tc>
-        <w:tc>
-          <w:tcPr>
-            <w:tcW w:type="dxa" w:w="3211"/>
-            <w:tcBorders>
-              <w:top w:val="single" w:sz="6" w:color="000000"/>
-              <w:bottom w:val="single" w:sz="6" w:color="000000"/>
-            </w:tcBorders>
-          </w:tcPr>
-          <w:p>
-            <w:pPr>
-              <w:jc w:val="center"/>
-            </w:pPr>
-            <w:r/>
-            <w:r>
-              <w:rPr>
-                <w:rFonts w:ascii="Times New Roman" w:hAnsi="Times New Roman"/>
-                <w:sz w:val="17"/>
-              </w:rPr>
-              <w:t>-0,23 (0,273)</w:t>
-            </w:r>
-          </w:p>
-        </w:tc>
-        <w:tc>
-          <w:tcPr>
-            <w:tcW w:type="dxa" w:w="3211"/>
-            <w:tcBorders>
-              <w:top w:val="single" w:sz="6" w:color="000000"/>
-              <w:bottom w:val="single" w:sz="6" w:color="000000"/>
-            </w:tcBorders>
-          </w:tcPr>
-          <w:p>
-            <w:pPr>
-              <w:jc w:val="center"/>
-            </w:pPr>
-            <w:r/>
-            <w:r>
-              <w:rPr>
-                <w:rFonts w:ascii="Times New Roman" w:hAnsi="Times New Roman"/>
-                <w:sz w:val="17"/>
-              </w:rPr>
-              <w:t>-0,12 (0,621)</w:t>
-            </w:r>
-          </w:p>
-        </w:tc>
-      </w:tr>
-      <w:tr>
-        <w:tc>
-          <w:tcPr>
-            <w:tcW w:type="dxa" w:w="3211"/>
-            <w:tcBorders>
-              <w:top w:val="single" w:sz="6" w:color="000000"/>
-              <w:bottom w:val="single" w:sz="6" w:color="000000"/>
-            </w:tcBorders>
-          </w:tcPr>
-          <w:p>
-            <w:pPr>
-              <w:jc w:val="left"/>
-            </w:pPr>
-            <w:r/>
-            <w:r>
-              <w:rPr>
-                <w:rFonts w:ascii="Times New Roman" w:hAnsi="Times New Roman"/>
-                <w:sz w:val="17"/>
-              </w:rPr>
-              <w:t>Fadiga mental</w:t>
-            </w:r>
-          </w:p>
-        </w:tc>
-        <w:tc>
-          <w:tcPr>
-            <w:tcW w:type="dxa" w:w="3211"/>
-            <w:tcBorders>
-              <w:top w:val="single" w:sz="6" w:color="000000"/>
-              <w:bottom w:val="single" w:sz="6" w:color="000000"/>
-            </w:tcBorders>
-          </w:tcPr>
-          <w:p>
-            <w:pPr>
-              <w:jc w:val="center"/>
-            </w:pPr>
-            <w:r/>
-            <w:r>
-              <w:rPr>
-                <w:rFonts w:ascii="Times New Roman" w:hAnsi="Times New Roman"/>
-                <w:sz w:val="17"/>
-              </w:rPr>
-              <w:t>n/d</w:t>
-            </w:r>
-          </w:p>
-        </w:tc>
-        <w:tc>
-          <w:tcPr>
-            <w:tcW w:type="dxa" w:w="3211"/>
-            <w:tcBorders>
-              <w:top w:val="single" w:sz="6" w:color="000000"/>
-              <w:bottom w:val="single" w:sz="6" w:color="000000"/>
-            </w:tcBorders>
-          </w:tcPr>
-          <w:p>
-            <w:pPr>
-              <w:jc w:val="center"/>
-            </w:pPr>
-            <w:r/>
-            <w:r>
-              <w:rPr>
-                <w:rFonts w:ascii="Times New Roman" w:hAnsi="Times New Roman"/>
-                <w:sz w:val="17"/>
-              </w:rPr>
-              <w:t>n/d</w:t>
-            </w:r>
-          </w:p>
-        </w:tc>
-      </w:tr>
-    </w:tbl>
-    <w:p>
-      <w:pPr>
-        <w:spacing w:after="120"/>
-      </w:pPr>
-      <w:r>
-        <w:rPr>
-          <w:rFonts w:ascii="Times New Roman" w:hAnsi="Times New Roman"/>
-          <w:i/>
-          <w:sz w:val="17"/>
-        </w:rPr>
-        <w:t>rho: coeficiente de Spearman. As correlações com a deterioração foram calculadas para as variáveis principais do estudo. Nenhuma correlação alcançou significância estatística.</w:t>
-      </w:r>
-    </w:p>
-    <w:p>
-      <w:pPr>
-        <w:spacing w:line="360" w:lineRule="auto" w:after="0"/>
-        <w:ind w:firstLine="709"/>
-        <w:jc w:val="both"/>
-      </w:pPr>
-      <w:r>
-        <w:rPr>
-          <w:rFonts w:ascii="Times New Roman" w:hAnsi="Times New Roman"/>
-          <w:sz w:val="24"/>
-        </w:rPr>
-        <w:t>A aptidão aeróbia relacionou-se de forma fraca e não significativa com o nível do humor e, sobretudo, não se relacionou com a magnitude da deterioração ao longo da semana. Em termos práticos, o atleta mais apto não esteve protegido contra a queda de vigor e o aumento de fadiga: a deterioração atingiu de forma semelhante os mais e os menos aptos (Figura 5). A aptidão parece definir o patamar geral do humor, e não o quanto ele se desgasta em uma semana de cargas elevadas.</w:t>
-      </w:r>
-    </w:p>
-    <w:p>
-      <w:pPr>
-        <w:spacing w:before="120"/>
-        <w:jc w:val="center"/>
-      </w:pPr>
-      <w:r>
-        <w:drawing>
-          <wp:inline xmlns:a="http://schemas.openxmlformats.org/drawingml/2006/main" xmlns:pic="http://schemas.openxmlformats.org/drawingml/2006/picture">
-            <wp:extent cx="5940000" cy="2930400"/>
-            <wp:docPr id="7" name="Picture 7"/>
-            <wp:cNvGraphicFramePr>
-              <a:graphicFrameLocks noChangeAspect="1"/>
-            </wp:cNvGraphicFramePr>
-            <a:graphic>
-              <a:graphicData uri="http://schemas.openxmlformats.org/drawingml/2006/picture">
-                <pic:pic>
-                  <pic:nvPicPr>
-                    <pic:cNvPr id="0" name="temporal_aptidao.png"/>
-                    <pic:cNvPicPr/>
-                  </pic:nvPicPr>
-                  <pic:blipFill>
-                    <a:blip r:embed="rId15"/>
-                    <a:stretch>
-                      <a:fillRect/>
-                    </a:stretch>
-                  </pic:blipFill>
-                  <pic:spPr>
-                    <a:xfrm>
-                      <a:off x="0" y="0"/>
-                      <a:ext cx="5940000" cy="2930400"/>
-                    </a:xfrm>
-                    <a:prstGeom prst="rect"/>
-                  </pic:spPr>
-                </pic:pic>
-              </a:graphicData>
-            </a:graphic>
-          </wp:inline>
-        </w:drawing>
-      </w:r>
-    </w:p>
-    <w:p>
-      <w:pPr>
-        <w:spacing w:after="120"/>
-        <w:jc w:val="center"/>
-      </w:pPr>
-      <w:r>
-        <w:rPr>
-          <w:rFonts w:ascii="Times New Roman" w:hAnsi="Times New Roman"/>
-          <w:sz w:val="21"/>
-        </w:rPr>
-        <w:t>Figura 7. Deterioração do primeiro ao sétimo dia por dimensão, para atletas mais aptos versus menos aptos (divididos pela mediana do pico de velocidade). Não houve diferença significativa entre os grupos.</w:t>
-      </w:r>
-    </w:p>
-    <w:p>
-      <w:pPr>
-        <w:spacing w:before="200" w:after="60"/>
-      </w:pPr>
-      <w:r>
-        <w:rPr>
-          <w:rFonts w:ascii="Times New Roman" w:hAnsi="Times New Roman"/>
-          <w:b/>
-          <w:i/>
-          <w:sz w:val="24"/>
-        </w:rPr>
-        <w:t>3.7  Detalhamento por dimensão</w:t>
+        <w:t>3.5  Etapa 5. Detalhamento por dimensão</w:t>
       </w:r>
     </w:p>
     <w:p>
@@ -10672,7 +7302,7 @@
           <w:rFonts w:ascii="Times New Roman" w:hAnsi="Times New Roman"/>
           <w:sz w:val="21"/>
         </w:rPr>
-        <w:t>Figura 8. Painel da dimensão vigor: trajetória, limites, derivadas, transições e síntese descritiva.</w:t>
+        <w:t>Figura 7. Painel da dimensão vigor: trajetória, limites, derivadas, transições e síntese descritiva.</w:t>
       </w:r>
     </w:p>
     <w:p>
@@ -10725,7 +7355,7 @@
           <w:rFonts w:ascii="Times New Roman" w:hAnsi="Times New Roman"/>
           <w:sz w:val="21"/>
         </w:rPr>
-        <w:t>Figura 9. Painel da dimensão fadiga: trajetória, limites, derivadas, transições e síntese descritiva.</w:t>
+        <w:t>Figura 8. Painel da dimensão fadiga: trajetória, limites, derivadas, transições e síntese descritiva.</w:t>
       </w:r>
     </w:p>
     <w:p>
@@ -10778,7 +7408,7 @@
           <w:rFonts w:ascii="Times New Roman" w:hAnsi="Times New Roman"/>
           <w:sz w:val="21"/>
         </w:rPr>
-        <w:t>Figura 10. Painel da dimensão tensão: trajetória, limites, derivadas, transições e síntese descritiva.</w:t>
+        <w:t>Figura 9. Painel da dimensão tensão: trajetória, limites, derivadas, transições e síntese descritiva.</w:t>
       </w:r>
     </w:p>
     <w:p>
@@ -10831,7 +7461,7 @@
           <w:rFonts w:ascii="Times New Roman" w:hAnsi="Times New Roman"/>
           <w:sz w:val="21"/>
         </w:rPr>
-        <w:t>Figura 11. Painel da dimensão depressão: trajetória, limites, derivadas, transições e síntese descritiva.</w:t>
+        <w:t>Figura 10. Painel da dimensão depressão: trajetória, limites, derivadas, transições e síntese descritiva.</w:t>
       </w:r>
     </w:p>
     <w:p>
@@ -10884,7 +7514,7 @@
           <w:rFonts w:ascii="Times New Roman" w:hAnsi="Times New Roman"/>
           <w:sz w:val="21"/>
         </w:rPr>
-        <w:t>Figura 12. Painel da dimensão raiva: trajetória, limites, derivadas, transições e síntese descritiva.</w:t>
+        <w:t>Figura 11. Painel da dimensão raiva: trajetória, limites, derivadas, transições e síntese descritiva.</w:t>
       </w:r>
     </w:p>
     <w:p>
@@ -10937,7 +7567,7 @@
           <w:rFonts w:ascii="Times New Roman" w:hAnsi="Times New Roman"/>
           <w:sz w:val="21"/>
         </w:rPr>
-        <w:t>Figura 13. Painel da dimensão confusão: trajetória, limites, derivadas, transições e síntese descritiva.</w:t>
+        <w:t>Figura 12. Painel da dimensão confusão: trajetória, limites, derivadas, transições e síntese descritiva.</w:t>
       </w:r>
     </w:p>
     <w:p>
@@ -10990,113 +7620,7 @@
           <w:rFonts w:ascii="Times New Roman" w:hAnsi="Times New Roman"/>
           <w:sz w:val="21"/>
         </w:rPr>
-        <w:t>Figura 14. Painel da dimensão perturbação total do humor: trajetória, limites, derivadas, transições e síntese descritiva.</w:t>
-      </w:r>
-    </w:p>
-    <w:p>
-      <w:pPr>
-        <w:spacing w:before="120"/>
-        <w:jc w:val="center"/>
-      </w:pPr>
-      <w:r>
-        <w:drawing>
-          <wp:inline xmlns:a="http://schemas.openxmlformats.org/drawingml/2006/main" xmlns:pic="http://schemas.openxmlformats.org/drawingml/2006/picture">
-            <wp:extent cx="5400000" cy="7113225"/>
-            <wp:docPr id="15" name="Picture 15"/>
-            <wp:cNvGraphicFramePr>
-              <a:graphicFrameLocks noChangeAspect="1"/>
-            </wp:cNvGraphicFramePr>
-            <a:graphic>
-              <a:graphicData uri="http://schemas.openxmlformats.org/drawingml/2006/picture">
-                <pic:pic>
-                  <pic:nvPicPr>
-                    <pic:cNvPr id="0" name="vd_FadFisica.png"/>
-                    <pic:cNvPicPr/>
-                  </pic:nvPicPr>
-                  <pic:blipFill>
-                    <a:blip r:embed="rId23"/>
-                    <a:stretch>
-                      <a:fillRect/>
-                    </a:stretch>
-                  </pic:blipFill>
-                  <pic:spPr>
-                    <a:xfrm>
-                      <a:off x="0" y="0"/>
-                      <a:ext cx="5400000" cy="7113225"/>
-                    </a:xfrm>
-                    <a:prstGeom prst="rect"/>
-                  </pic:spPr>
-                </pic:pic>
-              </a:graphicData>
-            </a:graphic>
-          </wp:inline>
-        </w:drawing>
-      </w:r>
-    </w:p>
-    <w:p>
-      <w:pPr>
-        <w:spacing w:after="120"/>
-        <w:jc w:val="center"/>
-      </w:pPr>
-      <w:r>
-        <w:rPr>
-          <w:rFonts w:ascii="Times New Roman" w:hAnsi="Times New Roman"/>
-          <w:sz w:val="21"/>
-        </w:rPr>
-        <w:t>Figura 15. Painel da dimensão fadiga física: trajetória, limites, derivadas, transições e síntese descritiva.</w:t>
-      </w:r>
-    </w:p>
-    <w:p>
-      <w:pPr>
-        <w:spacing w:before="120"/>
-        <w:jc w:val="center"/>
-      </w:pPr>
-      <w:r>
-        <w:drawing>
-          <wp:inline xmlns:a="http://schemas.openxmlformats.org/drawingml/2006/main" xmlns:pic="http://schemas.openxmlformats.org/drawingml/2006/picture">
-            <wp:extent cx="5400000" cy="7109707"/>
-            <wp:docPr id="16" name="Picture 16"/>
-            <wp:cNvGraphicFramePr>
-              <a:graphicFrameLocks noChangeAspect="1"/>
-            </wp:cNvGraphicFramePr>
-            <a:graphic>
-              <a:graphicData uri="http://schemas.openxmlformats.org/drawingml/2006/picture">
-                <pic:pic>
-                  <pic:nvPicPr>
-                    <pic:cNvPr id="0" name="vd_FadMental.png"/>
-                    <pic:cNvPicPr/>
-                  </pic:nvPicPr>
-                  <pic:blipFill>
-                    <a:blip r:embed="rId24"/>
-                    <a:stretch>
-                      <a:fillRect/>
-                    </a:stretch>
-                  </pic:blipFill>
-                  <pic:spPr>
-                    <a:xfrm>
-                      <a:off x="0" y="0"/>
-                      <a:ext cx="5400000" cy="7109707"/>
-                    </a:xfrm>
-                    <a:prstGeom prst="rect"/>
-                  </pic:spPr>
-                </pic:pic>
-              </a:graphicData>
-            </a:graphic>
-          </wp:inline>
-        </w:drawing>
-      </w:r>
-    </w:p>
-    <w:p>
-      <w:pPr>
-        <w:spacing w:after="120"/>
-        <w:jc w:val="center"/>
-      </w:pPr>
-      <w:r>
-        <w:rPr>
-          <w:rFonts w:ascii="Times New Roman" w:hAnsi="Times New Roman"/>
-          <w:sz w:val="21"/>
-        </w:rPr>
-        <w:t>Figura 16. Painel da dimensão fadiga mental: trajetória, limites, derivadas, transições e síntese descritiva.</w:t>
+        <w:t>Figura 13. Painel da dimensão perturbação total do humor: trajetória, limites, derivadas, transições e síntese descritiva.</w:t>
       </w:r>
     </w:p>
     <w:p>
@@ -11149,7 +7673,7 @@
           <w:b/>
           <w:sz w:val="24"/>
         </w:rPr>
-        <w:t xml:space="preserve">Figura 17. </w:t>
+        <w:t xml:space="preserve">Figura 14. </w:t>
       </w:r>
       <w:r>
         <w:rPr>
@@ -11209,7 +7733,7 @@
           <w:b/>
           <w:sz w:val="24"/>
         </w:rPr>
-        <w:t xml:space="preserve">Figura 18. </w:t>
+        <w:t xml:space="preserve">Figura 15. </w:t>
       </w:r>
       <w:r>
         <w:rPr>
@@ -11243,7 +7767,7 @@
           <w:rFonts w:ascii="Times New Roman" w:hAnsi="Times New Roman"/>
           <w:sz w:val="24"/>
         </w:rPr>
-        <w:t>Este estudo descreveu o perfil de humor de atletas de handebol de elite ao longo da última semana de pré-temporada e testou a associação entre a aptidão aeróbia e o comportamento do humor. A discussão segue as etapas dos resultados.</w:t>
+        <w:t>Este estudo descreveu e classificou o perfil de humor de atletas de handebol de elite ao longo da última semana de pré-temporada e caracterizou a sua dinâmica dia a dia. A discussão segue as etapas dos resultados.</w:t>
       </w:r>
     </w:p>
     <w:p>
@@ -11257,7 +7781,7 @@
           <w:i/>
           <w:sz w:val="24"/>
         </w:rPr>
-        <w:t>4.1  A energia cai e a fadiga física se acumula</w:t>
+        <w:t>4.1  A energia cai e a fadiga se acumula</w:t>
       </w:r>
     </w:p>
     <w:p>
@@ -11271,7 +7795,7 @@
           <w:rFonts w:ascii="Times New Roman" w:hAnsi="Times New Roman"/>
           <w:sz w:val="24"/>
         </w:rPr>
-        <w:t>O achado mais robusto foi a combinação de queda do vigor e aumento da fadiga física, esta última com o maior tamanho de efeito. Esse padrão é coerente com o propósito da pré-temporada, período planejado para impor carga, e com a natureza intermitente e de alta intensidade do handebol, que exige elevada solicitação aeróbia e neuromuscular (Pueo et al., 2017; Cartón-Llorente et al., 2023). A literatura de monitoramento em esportes coletivos descreve exatamente essa resposta: a carga de treino relaciona-se de forma negativa com o vigor e positiva com a fadiga (Duignan et al., 2020; Selmi et al., 2023). O mesmo padrão foi observado na pré-temporada de outras modalidades coletivas, em que o humor piora e o estresse cresce conforme a carga se acumula ao longo das semanas (Conte &amp; Kamarauskas, 2022; Martin-Garetxana et al., 2023). A análise das derivadas mostrou que a queda do vigor foi mais rápida no início da semana e apresentou ponto de inflexão na sua metade, sinal de estabilização da resposta. Do ponto de vista prático, o vigor se confirma como o indicador mais sensível para acompanhar o desgaste.</w:t>
+        <w:t>O achado mais robusto foi a combinação de queda do vigor — a dimensão de maior tamanho de efeito — e aumento da fadiga. Esse padrão é coerente com o propósito da pré-temporada, período planejado para impor carga, e com a natureza intermitente e de alta intensidade do handebol, que exige elevada solicitação aeróbia e neuromuscular (Pueo et al., 2017; Cartón-Llorente et al., 2023). A literatura de monitoramento em esportes coletivos descreve exatamente essa resposta: a carga de treino relaciona-se de forma negativa com o vigor e positiva com a fadiga (Duignan et al., 2020; Selmi et al., 2023). O mesmo padrão foi observado na pré-temporada de outras modalidades coletivas, em que o humor piora e o estresse cresce conforme a carga se acumula ao longo das semanas (Conte &amp; Kamarauskas, 2022; Martin-Garetxana et al., 2023). A análise das derivadas mostrou que a queda do vigor foi mais rápida no início da semana e apresentou ponto de inflexão na sua metade, sinal de estabilização da resposta. Do ponto de vista prático, o vigor se confirma como o indicador mais sensível para acompanhar o desgaste.</w:t>
       </w:r>
     </w:p>
     <w:p>
@@ -11341,7 +7865,7 @@
           <w:i/>
           <w:sz w:val="24"/>
         </w:rPr>
-        <w:t>4.4  Aptidão não é sinônimo de proteção</w:t>
+        <w:t>4.4  Síntese dos principais achados</w:t>
       </w:r>
     </w:p>
     <w:p>
@@ -11355,35 +7879,7 @@
           <w:rFonts w:ascii="Times New Roman" w:hAnsi="Times New Roman"/>
           <w:sz w:val="24"/>
         </w:rPr>
-        <w:t>O resultado mais instigante é que a aptidão aeróbia não protegeu o atleta da deterioração do humor. As correlações entre o pico de velocidade e a variação do humor foram fracas e não significativas, e a comparação entre mais e menos aptos não revelou diferença na magnitude da queda. Vale lembrar que o pico de velocidade no T-car é um indicador consolidado de capacidade e potência aeróbia máxima (Da Silva et al., 2011; Carminatti et al., 2013; Floriano et al., 2016), e que a aptidão aeróbia é determinante de desempenho no handebol de elite (Font et al., 2021; Fikenzer et al., 2020). Ainda assim, ela se associou apenas ao patamar do humor, e não à inclinação da resposta ao longo da semana. Uma interpretação plausível é que estar bem condicionado ajuda o atleta a começar melhor, mas não impede o desgaste quando o estímulo é elevado para todos. Esse achado tem consequência prática: o monitoramento do humor não pode ser substituído pela avaliação da aptidão, porque os dois descrevem aspectos diferentes e complementares do atleta.</w:t>
-      </w:r>
-    </w:p>
-    <w:p>
-      <w:pPr>
-        <w:spacing w:before="200" w:after="60"/>
-      </w:pPr>
-      <w:r>
-        <w:rPr>
-          <w:rFonts w:ascii="Times New Roman" w:hAnsi="Times New Roman"/>
-          <w:b/>
-          <w:i/>
-          <w:sz w:val="24"/>
-        </w:rPr>
-        <w:t>4.5  Síntese dos principais achados</w:t>
-      </w:r>
-    </w:p>
-    <w:p>
-      <w:pPr>
-        <w:spacing w:line="360" w:lineRule="auto" w:after="0"/>
-        <w:ind w:firstLine="709"/>
-        <w:jc w:val="both"/>
-      </w:pPr>
-      <w:r>
-        <w:rPr>
-          <w:rFonts w:ascii="Times New Roman" w:hAnsi="Times New Roman"/>
-          <w:sz w:val="24"/>
-        </w:rPr>
-        <w:t>Em conjunto, os resultados mostram que a última semana de pré-temporada produziu perda de energia e acúmulo de fadiga física, de forma acumulada ao longo dos dias, com migração da maioria dos atletas para perfis de menor vigor, e sem que a aptidão aeróbia oferecesse proteção contra essa deterioração. A principal contribuição do estudo é integrar, em um mesmo desenho, a descrição fina do humor por derivadas e limiares, a leitura por perfis e o cruzamento com a aptidão, para dar à comissão técnica um retrato claro de onde, quando e quanto o humor muda. Esses resultados somam-se ao esforço recente de padronizar o monitoramento de carga e bem-estar em esportes coletivos e, em especial, no handebol (Rebelo et al., 2024; Henze et al., 2025). As limitações incluem o desenho de grupo único, sem grupo controle, e o tamanho da amostra, próprio de uma equipe de elite. Estudos futuros podem acompanhar mais de um microciclo e incluir medidas objetivas de recuperação para confirmar e ampliar estes achados.</w:t>
+        <w:t>Em conjunto, os resultados mostram que a última semana de pré-temporada produziu perda de energia e acúmulo de fadiga, de forma acumulada ao longo dos dias, com migração da maioria dos atletas para perfis de menor vigor. A principal contribuição do estudo é integrar, em um mesmo desenho, a descrição fina do humor por derivadas e limiares, a leitura por perfis e a confirmação multivariada, para dar à comissão técnica um retrato claro de onde, quando e quanto o humor muda. Esses resultados somam-se ao esforço recente de padronizar o monitoramento de carga e bem-estar em esportes coletivos e, em especial, no handebol (Rebelo et al., 2024; Henze et al., 2025). As limitações incluem o desenho de grupo único, sem grupo controle, e o tamanho da amostra, próprio de uma equipe de elite. Estudos futuros podem acompanhar mais de um microciclo e incluir medidas objetivas de recuperação para confirmar e ampliar estes achados.</w:t>
       </w:r>
     </w:p>
     <w:p>
@@ -11410,7 +7906,7 @@
           <w:b/>
           <w:sz w:val="24"/>
         </w:rPr>
-        <w:t>4.6  Limitações estatísticas</w:t>
+        <w:t>4.5  Limitações estatísticas</w:t>
       </w:r>
     </w:p>
     <w:p>
@@ -11464,7 +7960,7 @@
           <w:rFonts w:ascii="Times New Roman" w:hAnsi="Times New Roman"/>
           <w:sz w:val="24"/>
         </w:rPr>
-        <w:t>A última semana de pré-temporada de atletas de handebol de elite foi marcada pela queda do vigor e pelo aumento da fadiga física, com deterioração acumulada ao longo dos dias e migração da maioria dos atletas do perfil iceberg para perfis de menor energia. A aptidão aeróbia, medida pelo pico de velocidade no T-car, associou-se ao patamar do humor, mas não protegeu o atleta da deterioração ao longo da semana. O monitoramento diário dos estados de humor, aplicado de forma simples e virtual, mostrou-se sensível e útil para orientar decisões de ajuste de carga.</w:t>
+        <w:t>A última semana de pré-temporada de atletas de handebol de elite foi marcada pela queda do vigor e pelo aumento da fadiga, com deterioração acumulada ao longo dos dias e migração da maioria dos atletas do perfil iceberg para perfis de menor energia. O monitoramento diário dos estados de humor, aplicado de forma simples e virtual, mostrou-se sensível e útil para orientar decisões de ajuste de carga.</w:t>
       </w:r>
     </w:p>
     <w:p>

</xml_diff>

<commit_message>
Estudo Completo: espelha os modelos preditivos (nova §3.6)
- Nova Etapa 6 (§3.6): modelos de crescimento (mistos), modelo preditivo
  (logística, AUC=0,58) e curva de aprendizado, com Figuras 16, 17 e 18
- Intro dos Resultados: cinco -> seis etapas
- Métodos §2.6: acrescenta a modelagem de crescimento e a capacidade
  preditiva (validação agrupada por atleta)

Co-Authored-By: Claude Opus 4.8 <noreply@anthropic.com>
Claude-Session: https://claude.ai/code/session_01P7yGiDeoGDyjWvPWQVsUrj
</commit_message>
<xml_diff>
--- a/Artigos/Estudo_Humor_Handebol_Completo.docx
+++ b/Artigos/Estudo_Humor_Handebol_Completo.docx
@@ -1982,7 +1982,7 @@
           <w:rFonts w:ascii="Times New Roman" w:hAnsi="Times New Roman"/>
           <w:sz w:val="24"/>
         </w:rPr>
-        <w:t>Nível 3, avançado. Como parte das dimensões não seguiu distribuição normal e há efeito de piso, foram usados testes não paramétricos. O teste de Friedman verificou se cada dimensão mudou ao longo da semana, com o W de Kendall como tamanho do efeito. O teste de Wilcoxon comparou momentos pareados, com o tamanho de efeito dz. A dinâmica de cada dimensão foi descrita pela suavização das curvas diárias e por suas derivadas: a primeira derivada mostra a velocidade de mudança, e a segunda derivada mostra a aceleração e o ponto de inflexão, o momento em que a tendência muda de sentido.</w:t>
+        <w:t>Nível 3, avançado. Como parte das dimensões não seguiu distribuição normal e há efeito de piso, foram usados testes não paramétricos. O teste de Friedman verificou se cada dimensão mudou ao longo da semana, com o W de Kendall como tamanho do efeito. O teste de Wilcoxon comparou momentos pareados, com o tamanho de efeito dz. A dinâmica de cada dimensão foi descrita pela suavização das curvas diárias e por suas derivadas: a primeira derivada mostra a velocidade de mudança, e a segunda derivada mostra a aceleração e o ponto de inflexão, o momento em que a tendência muda de sentido. Como modelagem complementar, a trajetória de cada dimensão foi ajustada por modelos lineares mistos de crescimento (intercepto e inclinação aleatórios por atleta), e a capacidade preditiva do perfil de humor foi avaliada por regressão logística com validação cruzada agrupada por atleta e curva de aprendizado.</w:t>
       </w:r>
     </w:p>
     <w:p>
@@ -2059,7 +2059,7 @@
           <w:rFonts w:ascii="Times New Roman" w:hAnsi="Times New Roman"/>
           <w:sz w:val="24"/>
         </w:rPr>
-        <w:t>Os resultados são apresentados em cinco etapas: a qualidade das medidas de humor (normalidade e psicometria); o comportamento descritivo das dimensões; a variação ao longo da semana e a migração de perfis; a filtragem das curvas e os cruzamentos entre variáveis; e o detalhamento por dimensão.</w:t>
+        <w:t>Os resultados são apresentados em seis etapas: a qualidade das medidas de humor (normalidade e psicometria); o comportamento descritivo das dimensões; a variação ao longo da semana e a migração de perfis; a filtragem das curvas e os cruzamentos entre variáveis; o detalhamento por dimensão; e os modelos de crescimento e a capacidade preditiva.</w:t>
       </w:r>
     </w:p>
     <w:p>
@@ -7745,6 +7745,233 @@
     </w:p>
     <w:p>
       <w:pPr>
+        <w:spacing w:before="200" w:after="60"/>
+      </w:pPr>
+      <w:r>
+        <w:rPr>
+          <w:rFonts w:ascii="Times New Roman" w:hAnsi="Times New Roman"/>
+          <w:sz w:val="24"/>
+        </w:rPr>
+      </w:r>
+      <w:r>
+        <w:rPr>
+          <w:rFonts w:ascii="Times New Roman" w:hAnsi="Times New Roman"/>
+          <w:b/>
+          <w:sz w:val="24"/>
+        </w:rPr>
+        <w:t>3.6  Etapa 6. Modelos de crescimento e capacidade preditiva</w:t>
+      </w:r>
+    </w:p>
+    <w:p>
+      <w:pPr>
+        <w:spacing w:line="360" w:lineRule="auto" w:after="0"/>
+        <w:ind w:firstLine="709"/>
+        <w:jc w:val="both"/>
+      </w:pPr>
+      <w:r>
+        <w:rPr>
+          <w:rFonts w:ascii="Times New Roman" w:hAnsi="Times New Roman"/>
+          <w:sz w:val="24"/>
+        </w:rPr>
+        <w:t>A dinâmica descrita pelas curvas foi formalizada por modelos mistos de crescimento, com intercepto e inclinação aleatórios por atleta (Figura 16). O vigor decresceu de forma significativa ao longo da semana (efeito do dia, p = 0,003), a fadiga acumulou-se de modo aproximadamente linear (cerca de 0,3 ponto por dia) e a perturbação total do humor descreveu uma curva em U, coerentes com as trajetórias suavizadas, agora estimadas respeitando a variação entre atletas.</w:t>
+      </w:r>
+    </w:p>
+    <w:p>
+      <w:pPr>
+        <w:spacing w:line="360" w:lineRule="auto" w:after="0"/>
+        <w:ind w:firstLine="709"/>
+        <w:jc w:val="both"/>
+      </w:pPr>
+      <w:r>
+        <w:rPr>
+          <w:rFonts w:ascii="Times New Roman" w:hAnsi="Times New Roman"/>
+          <w:sz w:val="24"/>
+        </w:rPr>
+        <w:t>A capacidade de o perfil de humor prever a fase do microciclo foi avaliada por regressão logística (fase tardia, dias 5 a 7, versus inicial, dias 1 a 3), com validação cruzada agrupada por atleta. A discriminação foi apenas modesta (AUC = 0,58; Figura 17), com a fadiga como principal preditor, e a curva de aprendizado (Figura 18) manteve-se plana e próxima do acaso, com pequena distância entre treino e validação. O desempenho limitado não decorre de sobreajuste nem de falta de dados, mas do sinal individual baixo imposto pelo efeito de piso: a leitura do humor é robusta como tendência de grupo, mas não sustenta a predição isolada no nível do atleta.</w:t>
+      </w:r>
+    </w:p>
+    <w:p>
+      <w:pPr>
+        <w:jc w:val="center"/>
+      </w:pPr>
+      <w:r>
+        <w:drawing>
+          <wp:inline xmlns:a="http://schemas.openxmlformats.org/drawingml/2006/main" xmlns:pic="http://schemas.openxmlformats.org/drawingml/2006/picture">
+            <wp:extent cx="5760000" cy="1840577"/>
+            <wp:docPr id="19" name="Picture 19"/>
+            <wp:cNvGraphicFramePr>
+              <a:graphicFrameLocks noChangeAspect="1"/>
+            </wp:cNvGraphicFramePr>
+            <a:graphic>
+              <a:graphicData uri="http://schemas.openxmlformats.org/drawingml/2006/picture">
+                <pic:pic>
+                  <pic:nvPicPr>
+                    <pic:cNvPr id="0" name="curvas_crescimento.png"/>
+                    <pic:cNvPicPr/>
+                  </pic:nvPicPr>
+                  <pic:blipFill>
+                    <a:blip r:embed="rId27"/>
+                    <a:stretch>
+                      <a:fillRect/>
+                    </a:stretch>
+                  </pic:blipFill>
+                  <pic:spPr>
+                    <a:xfrm>
+                      <a:off x="0" y="0"/>
+                      <a:ext cx="5760000" cy="1840577"/>
+                    </a:xfrm>
+                    <a:prstGeom prst="rect"/>
+                  </pic:spPr>
+                </pic:pic>
+              </a:graphicData>
+            </a:graphic>
+          </wp:inline>
+        </w:drawing>
+      </w:r>
+    </w:p>
+    <w:p>
+      <w:pPr>
+        <w:spacing w:after="120"/>
+        <w:jc w:val="center"/>
+      </w:pPr>
+      <w:r>
+        <w:rPr>
+          <w:rFonts w:ascii="Times New Roman" w:hAnsi="Times New Roman"/>
+          <w:b/>
+          <w:sz w:val="24"/>
+        </w:rPr>
+        <w:t xml:space="preserve">Figura 16. </w:t>
+      </w:r>
+      <w:r>
+        <w:rPr>
+          <w:rFonts w:ascii="Times New Roman" w:hAnsi="Times New Roman"/>
+          <w:sz w:val="24"/>
+        </w:rPr>
+        <w:t>Curvas de crescimento do humor (modelos mistos): trajetórias individuais (linhas finas) e curva populacional (linha grossa) para o vigor, a fadiga e a perturbação total do humor.</w:t>
+      </w:r>
+    </w:p>
+    <w:p>
+      <w:pPr>
+        <w:jc w:val="center"/>
+      </w:pPr>
+      <w:r>
+        <w:drawing>
+          <wp:inline xmlns:a="http://schemas.openxmlformats.org/drawingml/2006/main" xmlns:pic="http://schemas.openxmlformats.org/drawingml/2006/picture">
+            <wp:extent cx="3780000" cy="3700001"/>
+            <wp:docPr id="20" name="Picture 20"/>
+            <wp:cNvGraphicFramePr>
+              <a:graphicFrameLocks noChangeAspect="1"/>
+            </wp:cNvGraphicFramePr>
+            <a:graphic>
+              <a:graphicData uri="http://schemas.openxmlformats.org/drawingml/2006/picture">
+                <pic:pic>
+                  <pic:nvPicPr>
+                    <pic:cNvPr id="0" name="roc_preditivo.png"/>
+                    <pic:cNvPicPr/>
+                  </pic:nvPicPr>
+                  <pic:blipFill>
+                    <a:blip r:embed="rId28"/>
+                    <a:stretch>
+                      <a:fillRect/>
+                    </a:stretch>
+                  </pic:blipFill>
+                  <pic:spPr>
+                    <a:xfrm>
+                      <a:off x="0" y="0"/>
+                      <a:ext cx="3780000" cy="3700001"/>
+                    </a:xfrm>
+                    <a:prstGeom prst="rect"/>
+                  </pic:spPr>
+                </pic:pic>
+              </a:graphicData>
+            </a:graphic>
+          </wp:inline>
+        </w:drawing>
+      </w:r>
+    </w:p>
+    <w:p>
+      <w:pPr>
+        <w:spacing w:after="120"/>
+        <w:jc w:val="center"/>
+      </w:pPr>
+      <w:r>
+        <w:rPr>
+          <w:rFonts w:ascii="Times New Roman" w:hAnsi="Times New Roman"/>
+          <w:b/>
+          <w:sz w:val="24"/>
+        </w:rPr>
+        <w:t xml:space="preserve">Figura 17. </w:t>
+      </w:r>
+      <w:r>
+        <w:rPr>
+          <w:rFonts w:ascii="Times New Roman" w:hAnsi="Times New Roman"/>
+          <w:sz w:val="24"/>
+        </w:rPr>
+        <w:t>Curva ROC do modelo preditivo (regressão logística) para a fase do microciclo (tardia versus inicial) a partir do perfil de humor, com validação cruzada agrupada por atleta.</w:t>
+      </w:r>
+    </w:p>
+    <w:p>
+      <w:pPr>
+        <w:jc w:val="center"/>
+      </w:pPr>
+      <w:r>
+        <w:drawing>
+          <wp:inline xmlns:a="http://schemas.openxmlformats.org/drawingml/2006/main" xmlns:pic="http://schemas.openxmlformats.org/drawingml/2006/picture">
+            <wp:extent cx="4680000" cy="3044690"/>
+            <wp:docPr id="21" name="Picture 21"/>
+            <wp:cNvGraphicFramePr>
+              <a:graphicFrameLocks noChangeAspect="1"/>
+            </wp:cNvGraphicFramePr>
+            <a:graphic>
+              <a:graphicData uri="http://schemas.openxmlformats.org/drawingml/2006/picture">
+                <pic:pic>
+                  <pic:nvPicPr>
+                    <pic:cNvPr id="0" name="curva_aprendizado.png"/>
+                    <pic:cNvPicPr/>
+                  </pic:nvPicPr>
+                  <pic:blipFill>
+                    <a:blip r:embed="rId29"/>
+                    <a:stretch>
+                      <a:fillRect/>
+                    </a:stretch>
+                  </pic:blipFill>
+                  <pic:spPr>
+                    <a:xfrm>
+                      <a:off x="0" y="0"/>
+                      <a:ext cx="4680000" cy="3044690"/>
+                    </a:xfrm>
+                    <a:prstGeom prst="rect"/>
+                  </pic:spPr>
+                </pic:pic>
+              </a:graphicData>
+            </a:graphic>
+          </wp:inline>
+        </w:drawing>
+      </w:r>
+    </w:p>
+    <w:p>
+      <w:pPr>
+        <w:spacing w:after="120"/>
+        <w:jc w:val="center"/>
+      </w:pPr>
+      <w:r>
+        <w:rPr>
+          <w:rFonts w:ascii="Times New Roman" w:hAnsi="Times New Roman"/>
+          <w:b/>
+          <w:sz w:val="24"/>
+        </w:rPr>
+        <w:t xml:space="preserve">Figura 18. </w:t>
+      </w:r>
+      <w:r>
+        <w:rPr>
+          <w:rFonts w:ascii="Times New Roman" w:hAnsi="Times New Roman"/>
+          <w:sz w:val="24"/>
+        </w:rPr>
+        <w:t>Curva de aprendizado do modelo preditivo: AUC de treino e de validação cruzada em função do tamanho do conjunto de treino.</w:t>
+      </w:r>
+    </w:p>
+    <w:p>
+      <w:pPr>
         <w:spacing w:before="280" w:after="80"/>
       </w:pPr>
       <w:r>

</xml_diff>

<commit_message>
Estudo Completo: remove última menção residual à aptidão + completa o plano de análise
- Remove a linha 'Associação com a aptidão' do plano de análise (Tabela 2)
- Atualiza a linha de psicometria para incluir AFC e TRI
- Acrescenta linhas de PERMANOVA/PERMDISP e de modelos de crescimento/
  predição ao plano, refletindo as análises efetivamente reportadas
- Varredura final: zero menção a aptidão/T-car/HIIT/fadiga física

Co-Authored-By: Claude Opus 4.8 <noreply@anthropic.com>
Claude-Session: https://claude.ai/code/session_01P7yGiDeoGDyjWvPWQVsUrj
</commit_message>
<xml_diff>
--- a/Artigos/Estudo_Humor_Handebol_Completo.docx
+++ b/Artigos/Estudo_Humor_Handebol_Completo.docx
@@ -1334,7 +1334,9 @@
             <w:pPr>
               <w:jc w:val="center"/>
             </w:pPr>
-            <w:r/>
+            <w:r>
+              <w:t>Alfa de Cronbach, ômega, AFC e TRI</w:t>
+            </w:r>
             <w:r>
               <w:rPr>
                 <w:rFonts w:ascii="Times New Roman" w:hAnsi="Times New Roman"/>
@@ -1768,96 +1770,6 @@
                 <w:rFonts w:ascii="Times New Roman" w:hAnsi="Times New Roman"/>
                 <w:sz w:val="16"/>
               </w:rPr>
-              <w:t>Associação com a aptidão</w:t>
-            </w:r>
-          </w:p>
-        </w:tc>
-        <w:tc>
-          <w:tcPr>
-            <w:tcW w:type="dxa" w:w="2408"/>
-            <w:tcBorders>
-              <w:top w:val="single" w:sz="6" w:color="000000"/>
-              <w:bottom w:val="single" w:sz="6" w:color="000000"/>
-            </w:tcBorders>
-          </w:tcPr>
-          <w:p>
-            <w:pPr>
-              <w:jc w:val="center"/>
-            </w:pPr>
-            <w:r/>
-            <w:r>
-              <w:rPr>
-                <w:rFonts w:ascii="Times New Roman" w:hAnsi="Times New Roman"/>
-                <w:sz w:val="16"/>
-              </w:rPr>
-              <w:t>Spearman</w:t>
-            </w:r>
-          </w:p>
-        </w:tc>
-        <w:tc>
-          <w:tcPr>
-            <w:tcW w:type="dxa" w:w="2408"/>
-            <w:tcBorders>
-              <w:top w:val="single" w:sz="6" w:color="000000"/>
-              <w:bottom w:val="single" w:sz="6" w:color="000000"/>
-            </w:tcBorders>
-          </w:tcPr>
-          <w:p>
-            <w:pPr>
-              <w:jc w:val="center"/>
-            </w:pPr>
-            <w:r/>
-            <w:r>
-              <w:rPr>
-                <w:rFonts w:ascii="Times New Roman" w:hAnsi="Times New Roman"/>
-                <w:sz w:val="16"/>
-              </w:rPr>
-              <w:t>Relacionar PV com nível e deterioração</w:t>
-            </w:r>
-          </w:p>
-        </w:tc>
-      </w:tr>
-      <w:tr>
-        <w:tc>
-          <w:tcPr>
-            <w:tcW w:type="dxa" w:w="2408"/>
-            <w:tcBorders>
-              <w:top w:val="single" w:sz="6" w:color="000000"/>
-              <w:bottom w:val="single" w:sz="6" w:color="000000"/>
-            </w:tcBorders>
-          </w:tcPr>
-          <w:p>
-            <w:pPr>
-              <w:jc w:val="left"/>
-            </w:pPr>
-            <w:r/>
-            <w:r>
-              <w:rPr>
-                <w:rFonts w:ascii="Times New Roman" w:hAnsi="Times New Roman"/>
-                <w:sz w:val="16"/>
-              </w:rPr>
-              <w:t>Avançada</w:t>
-            </w:r>
-          </w:p>
-        </w:tc>
-        <w:tc>
-          <w:tcPr>
-            <w:tcW w:type="dxa" w:w="2408"/>
-            <w:tcBorders>
-              <w:top w:val="single" w:sz="6" w:color="000000"/>
-              <w:bottom w:val="single" w:sz="6" w:color="000000"/>
-            </w:tcBorders>
-          </w:tcPr>
-          <w:p>
-            <w:pPr>
-              <w:jc w:val="center"/>
-            </w:pPr>
-            <w:r/>
-            <w:r>
-              <w:rPr>
-                <w:rFonts w:ascii="Times New Roman" w:hAnsi="Times New Roman"/>
-                <w:sz w:val="16"/>
-              </w:rPr>
               <w:t>Dinâmica das curvas</w:t>
             </w:r>
           </w:p>
@@ -1903,6 +1815,98 @@
                 <w:sz w:val="16"/>
               </w:rPr>
               <w:t>Localizar velocidade e inflexão</w:t>
+            </w:r>
+          </w:p>
+        </w:tc>
+      </w:tr>
+      <w:tr>
+        <w:tc>
+          <w:tcPr>
+            <w:tcW w:type="dxa" w:w="2408"/>
+          </w:tcPr>
+          <w:p>
+            <w:r>
+              <w:rPr/>
+              <w:t>Avançada</w:t>
+            </w:r>
+          </w:p>
+        </w:tc>
+        <w:tc>
+          <w:tcPr>
+            <w:tcW w:type="dxa" w:w="2408"/>
+          </w:tcPr>
+          <w:p>
+            <w:r>
+              <w:rPr/>
+              <w:t>Multivariada</w:t>
+            </w:r>
+          </w:p>
+        </w:tc>
+        <w:tc>
+          <w:tcPr>
+            <w:tcW w:type="dxa" w:w="2408"/>
+          </w:tcPr>
+          <w:p>
+            <w:r>
+              <w:rPr/>
+              <w:t>PERMANOVA e PERMDISP</w:t>
+            </w:r>
+          </w:p>
+        </w:tc>
+        <w:tc>
+          <w:tcPr>
+            <w:tcW w:type="dxa" w:w="2408"/>
+          </w:tcPr>
+          <w:p>
+            <w:r>
+              <w:rPr/>
+              <w:t>Testar o deslocamento do perfil de humor</w:t>
+            </w:r>
+          </w:p>
+        </w:tc>
+      </w:tr>
+      <w:tr>
+        <w:tc>
+          <w:tcPr>
+            <w:tcW w:type="dxa" w:w="2408"/>
+          </w:tcPr>
+          <w:p>
+            <w:r>
+              <w:rPr/>
+              <w:t>Avançada</w:t>
+            </w:r>
+          </w:p>
+        </w:tc>
+        <w:tc>
+          <w:tcPr>
+            <w:tcW w:type="dxa" w:w="2408"/>
+          </w:tcPr>
+          <w:p>
+            <w:r>
+              <w:rPr/>
+              <w:t>Crescimento e predição</w:t>
+            </w:r>
+          </w:p>
+        </w:tc>
+        <w:tc>
+          <w:tcPr>
+            <w:tcW w:type="dxa" w:w="2408"/>
+          </w:tcPr>
+          <w:p>
+            <w:r>
+              <w:rPr/>
+              <w:t>Modelos mistos, regressão logística e curva de aprendizado</w:t>
+            </w:r>
+          </w:p>
+        </w:tc>
+        <w:tc>
+          <w:tcPr>
+            <w:tcW w:type="dxa" w:w="2408"/>
+          </w:tcPr>
+          <w:p>
+            <w:r>
+              <w:rPr/>
+              <w:t>Modelar a trajetória e avaliar a capacidade preditiva</w:t>
             </w:r>
           </w:p>
         </w:tc>

</xml_diff>

<commit_message>
Integrate gradient boosting robustness check into all deliverables
Add XGBoost/LightGBM vs logistic AUC comparison (bar figure + robustness
paragraph) to Estudo_Completo (Figura 19), Paper1 (Figura 29, tree -> 30),
and the dashboard (real-time bar chart in the predictive section). Both
GBMs sit at chance (~0.50), below the logistic ceiling (0.58), reinforcing
the limited-individual-signal conclusion.

Co-Authored-By: Claude Opus 4.8 <noreply@anthropic.com>
Claude-Session: https://claude.ai/code/session_01P7yGiDeoGDyjWvPWQVsUrj
</commit_message>
<xml_diff>
--- a/Artigos/Estudo_Humor_Handebol_Completo.docx
+++ b/Artigos/Estudo_Humor_Handebol_Completo.docx
@@ -7975,6 +7975,62 @@
       </w:r>
     </w:p>
     <w:p>
+      <w:r>
+        <w:t>Como verificação de robustez, a mesma tarefa preditiva e o mesmo esquema de validação (agrupado por atleta) foram reaplicados a dois algoritmos flexíveis de gradient boosting, capazes de captar interações e não linearidades: XGBoost e LightGBM. Ambos ficaram no nível do acaso (AUC = 0,50 nos dois casos) e, portanto, abaixo do teto obtido pela regressão logística (AUC = 0,58; Figura 19). O fato de modelos mais expressivos não superarem — e mesmo não igualarem — um modelo linear simples indica que o limite de predição não decorre da forma funcional escolhida, mas da ausência de estrutura individual explorável no perfil de humor. O resultado converge com a curva de aprendizado plana e reforça a leitura central: a dinâmica do humor é informativa como tendência de grupo, não como preditor isolado no nível do atleta.</w:t>
+      </w:r>
+    </w:p>
+    <w:p>
+      <w:pPr>
+        <w:jc w:val="center"/>
+      </w:pPr>
+      <w:r>
+        <w:drawing>
+          <wp:inline xmlns:a="http://schemas.openxmlformats.org/drawingml/2006/main" xmlns:pic="http://schemas.openxmlformats.org/drawingml/2006/picture">
+            <wp:extent cx="4937760" cy="3519864"/>
+            <wp:docPr id="22" name="Picture 22"/>
+            <wp:cNvGraphicFramePr>
+              <a:graphicFrameLocks noChangeAspect="1"/>
+            </wp:cNvGraphicFramePr>
+            <a:graphic>
+              <a:graphicData uri="http://schemas.openxmlformats.org/drawingml/2006/picture">
+                <pic:pic>
+                  <pic:nvPicPr>
+                    <pic:cNvPr id="0" name="comparacao_modelos_auc.png"/>
+                    <pic:cNvPicPr/>
+                  </pic:nvPicPr>
+                  <pic:blipFill>
+                    <a:blip r:embed="rId30"/>
+                    <a:stretch>
+                      <a:fillRect/>
+                    </a:stretch>
+                  </pic:blipFill>
+                  <pic:spPr>
+                    <a:xfrm>
+                      <a:off x="0" y="0"/>
+                      <a:ext cx="4937760" cy="3519864"/>
+                    </a:xfrm>
+                    <a:prstGeom prst="rect"/>
+                  </pic:spPr>
+                </pic:pic>
+              </a:graphicData>
+            </a:graphic>
+          </wp:inline>
+        </w:drawing>
+      </w:r>
+    </w:p>
+    <w:p>
+      <w:pPr>
+        <w:jc w:val="center"/>
+      </w:pPr>
+      <w:r>
+        <w:rPr>
+          <w:b/>
+          <w:sz w:val="24"/>
+        </w:rPr>
+        <w:t>Figura 19. Comparação da capacidade preditiva (AUC, validação cruzada por atleta) entre a regressão logística e os modelos de gradient boosting (XGBoost, LightGBM) na classificação da fase do microciclo; a linha tracejada indica o nível do acaso.</w:t>
+      </w:r>
+    </w:p>
+    <w:p>
       <w:pPr>
         <w:spacing w:before="280" w:after="80"/>
       </w:pPr>

</xml_diff>

<commit_message>
Strengthen Estudo_Completo discussion: derivatives/limits math, signal-noise relations, methodological robustness and innovation vs classical SPSS approach
Add §4.4 (mathematical reading via derivatives/limits and its psychological
meaning; smoothing as prerequisite for differentiation; SNR gating which
derivatives are trustworthy; floor/ceiling/MDC as thresholds) and §4.5
(robustness and innovation: contrast with repeated-measures ANOVA/t-tests,
the triangulated pipeline, and where the novelty lies). Renumber synthesis
to 4.6 and limitations to 4.7; add methodological-contribution sentence to
the conclusion.

Co-Authored-By: Claude Opus 4.8 <noreply@anthropic.com>
Claude-Session: https://claude.ai/code/session_01P7yGiDeoGDyjWvPWQVsUrj
</commit_message>
<xml_diff>
--- a/Artigos/Estudo_Humor_Handebol_Completo.docx
+++ b/Artigos/Estudo_Humor_Handebol_Completo.docx
@@ -8143,16 +8143,101 @@
     </w:p>
     <w:p>
       <w:pPr>
+        <w:spacing w:before="200" w:after="40"/>
+      </w:pPr>
+      <w:r>
+        <w:rPr>
+          <w:rFonts w:ascii="Times New Roman" w:hAnsi="Times New Roman"/>
+          <w:b/>
+          <w:sz w:val="24"/>
+        </w:rPr>
+        <w:t>4.4  A leitura por derivadas e limiares: a matemática que descreve o humor</w:t>
+      </w:r>
+    </w:p>
+    <w:p>
+      <w:pPr>
+        <w:jc w:val="both"/>
+      </w:pPr>
+      <w:r>
+        <w:rPr>
+          <w:rFonts w:ascii="Times New Roman" w:hAnsi="Times New Roman"/>
+          <w:sz w:val="24"/>
+        </w:rPr>
+        <w:t>A descrição fina da dinâmica do humor apoiou-se em três objetos matemáticos extraídos da trajetória de cada dimensão ao longo dos sete dias. A própria trajetória — o escore como função do tempo, f(t) — informa o estado; a sua primeira derivada, f′(t), informa a velocidade da mudança, isto é, quão rápido a energia cai ou a fadiga sobe em determinado dia; e a sua segunda derivada, f″(t), informa a aceleração, ou seja, se esse processo está se intensificando ou perdendo força. Traduzidos para a linguagem do treinamento, esses objetos respondem a perguntas distintas e complementares: o escore diz como o atleta está; a velocidade diz o quanto o estado muda naquele dia; e a aceleração diz se a comissão técnica ainda tem margem ou se o desgaste começou a se autoalimentar. O ponto de inflexão — o dia em que a segunda derivada cruza o zero e a curva troca de concavidade — data objetivamente a virada de regime: no eixo energia-fadiga, ele ocorreu em torno do quarto dia, marcando o instante em que a desaceleração inicial dá lugar à aceleração do acúmulo de fadiga. É um marcador que a média de um dia isolado, ou mesmo a comparação bruta entre o primeiro e o último dia, não conseguem revelar, e que coincide com o intervalo em que as curvas filtradas de vigor e fadiga se cruzam (por volta dos dias 2,3, 3,9 e 5,8), quando a fadiga passa a superar o vigor.</w:t>
+      </w:r>
+    </w:p>
+    <w:p>
+      <w:pPr>
+        <w:jc w:val="both"/>
+      </w:pPr>
+      <w:r>
+        <w:rPr>
+          <w:rFonts w:ascii="Times New Roman" w:hAnsi="Times New Roman"/>
+          <w:sz w:val="24"/>
+        </w:rPr>
+        <w:t>Essas leituras só têm sentido porque as derivadas foram calculadas sobre a curva filtrada, e não sobre os dados brutos. A derivação amplifica o ruído: pequenas oscilações de curto prazo, irrelevantes para a tendência, tornam-se picos espúrios de velocidade e aceleração quando se deriva uma série ruidosa. A suavização por spline, ao separar o sinal da flutuação de curto prazo, é portanto uma condição prévia — e não um mero recurso estético — para que a velocidade e a aceleração descrevam o processo real, e não o erro de medida. A relação sinal-ruído fecha esse encadeamento ao indicar em quais dimensões a derivada merece confiança: no vigor e na fadiga, com SNR de 8,4 e 6,7, a tendência é nítida e as derivadas são interpretáveis; nas dimensões afetivas negativas, dominadas pelo efeito de piso e por SNR baixa, a variação é essencialmente ruído e as suas derivadas não devem orientar decisão. Por fim, os limites cumprem o papel de régua: o piso e o teto de cada escala delimitam o espaço em que a mudança é possível, e a mudança mínima detectável (MDC) estabelece o limiar abaixo do qual uma variação, por mais visível que pareça no gráfico, é indistinguível do erro. É essa cadeia — filtrar para obter o sinal, derivar o sinal para medir velocidade e aceleração, e ler tudo contra os limiares de piso, teto e MDC — que converte uma sequência de médias diárias em uma descrição informativa de quando e com que rapidez o estado do atleta se deteriora.</w:t>
+      </w:r>
+    </w:p>
+    <w:p>
+      <w:pPr>
+        <w:spacing w:before="200" w:after="40"/>
+      </w:pPr>
+      <w:r>
+        <w:rPr>
+          <w:rFonts w:ascii="Times New Roman" w:hAnsi="Times New Roman"/>
+          <w:b/>
+          <w:sz w:val="24"/>
+        </w:rPr>
+        <w:t>4.5  Robustez metodológica e inovação: por que este modelo supera a abordagem clássica</w:t>
+      </w:r>
+    </w:p>
+    <w:p>
+      <w:pPr>
+        <w:jc w:val="both"/>
+      </w:pPr>
+      <w:r>
+        <w:rPr>
+          <w:rFonts w:ascii="Times New Roman" w:hAnsi="Times New Roman"/>
+          <w:sz w:val="24"/>
+        </w:rPr>
+        <w:t>O monitoramento de humor no esporte tem sido conduzido, ao longo dos anos, sobretudo por uma rotina de análise de variância de medidas repetidas e testes t em pacotes como o SPSS. Essa abordagem responde bem a uma única pergunta — houve diferença entre os dias? — mas o faz sob pressupostos que os próprios dados de humor tendem a violar. A ANOVA de medidas repetidas exige normalidade e esfericidade e trata o tempo como um fator categórico, o que reduz uma trajetória contínua a uma comparação de médias entre pontos e descarta a forma da mudança; além disso, é sensível à assimetria e à inflação de zeros produzidas pelo efeito de piso, justamente a condição predominante nas dimensões afetivas negativas. Ao tratar os atletas como intercambiáveis, ignora ainda a variação individual de trajetória. O resultado é uma leitura que informa se o humor mudou, mas não quando, com que velocidade, para quem e com que confiabilidade.</w:t>
+      </w:r>
+    </w:p>
+    <w:p>
+      <w:pPr>
+        <w:jc w:val="both"/>
+      </w:pPr>
+      <w:r>
+        <w:rPr>
+          <w:rFonts w:ascii="Times New Roman" w:hAnsi="Times New Roman"/>
+          <w:sz w:val="24"/>
+        </w:rPr>
+        <w:t>O modelo analítico aqui proposto substitui essa pergunta única por um encadeamento de métodos escolhidos em função das propriedades dos dados, resumido na árvore de decisões (Figura 15). A confirmação do deslocamento multivariado do perfil foi feita por PERMANOVA, que não pressupõe normalidade e respeita o desenho de medidas repetidas ao restringir as permutações ao próprio atleta; a forma temporal foi descrita por suavização e derivadas, que capturam velocidade, aceleração e ponto de inflexão; a variação individual foi acomodada por modelos mistos de crescimento, com intercepto e inclinação aleatórios; a confiabilidade da tendência foi quantificada pela relação sinal-ruído e pela MDC; a qualidade das medidas foi verificada por análise fatorial confirmatória e teoria de resposta ao item; e o teto de previsibilidade individual foi honestamente delimitado ao confrontar a regressão logística (AUC = 0,58) com modelos flexíveis de gradient boosting (XGBoost e LightGBM), que não a superaram. Nenhum desses métodos, isolado, sustentaria a conclusão; o que confere robustez é a triangulação — cada técnica cobre a fragilidade das demais, e as três vias (multivariada, dinâmica e psicométrica) convergem para o mesmo núcleo, o par vigor-fadiga.</w:t>
+      </w:r>
+    </w:p>
+    <w:p>
+      <w:pPr>
+        <w:jc w:val="both"/>
+      </w:pPr>
+      <w:r>
+        <w:rPr>
+          <w:rFonts w:ascii="Times New Roman" w:hAnsi="Times New Roman"/>
+          <w:sz w:val="24"/>
+        </w:rPr>
+        <w:t>A inovação não está em nenhuma técnica isolada — todas existem, dispersas, em campos distintos: a suavização e a relação sinal-ruído no processamento de sinais, a PERMANOVA na ecologia de comunidades, a teoria de resposta ao item na psicometria, os modelos mistos na estatística longitudinal. Está em integrá-las em um único fluxo aplicado ao monitoramento diário do humor no esporte coletivo, um domínio que historicamente se acomodou à ANOVA e ao teste t sobre amostras pequenas e distribuições dominadas pelo piso — precisamente as condições em que esses testes clássicos são menos confiáveis. Importar o cálculo (derivadas, limites, ponto de inflexão) e a teoria de sinais (filtragem, SNR) para a leitura de estados psicológicos, e amarrar a escolha de cada método a uma árvore de decisão que a torna função explícita das propriedades dos dados, é o que distingue este trabalho da prática consolidada. O ganho não é apenas estatístico: ao datar a virada do desgaste, ao dizer em quais dimensões a leitura é confiável e ao delimitar até onde a predição individual é possível, o modelo entrega à comissão técnica um retrato acionável — onde, quando, quanto e com que segurança o humor muda — que a abordagem clássica, por construção, não alcança.</w:t>
+      </w:r>
+    </w:p>
+    <w:p>
+      <w:pPr>
         <w:spacing w:before="200" w:after="60"/>
       </w:pPr>
       <w:r>
         <w:rPr>
           <w:rFonts w:ascii="Times New Roman" w:hAnsi="Times New Roman"/>
           <w:b/>
-          <w:i/>
           <w:sz w:val="24"/>
         </w:rPr>
-        <w:t>4.4  Síntese dos principais achados</w:t>
+        <w:t>4.6  Síntese dos principais achados</w:t>
       </w:r>
     </w:p>
     <w:p>
@@ -8193,7 +8278,7 @@
           <w:b/>
           <w:sz w:val="24"/>
         </w:rPr>
-        <w:t>4.5  Limitações estatísticas</w:t>
+        <w:t>4.7  Limitações estatísticas</w:t>
       </w:r>
     </w:p>
     <w:p>
@@ -8248,6 +8333,13 @@
           <w:sz w:val="24"/>
         </w:rPr>
         <w:t>A última semana de pré-temporada de atletas de handebol de elite foi marcada pela queda do vigor e pelo aumento da fadiga, com deterioração acumulada ao longo dos dias e migração da maioria dos atletas do perfil iceberg para perfis de menor energia. O monitoramento diário dos estados de humor, aplicado de forma simples e virtual, mostrou-se sensível e útil para orientar decisões de ajuste de carga.</w:t>
+      </w:r>
+      <w:r>
+        <w:rPr>
+          <w:rFonts w:ascii="Times New Roman" w:hAnsi="Times New Roman"/>
+          <w:sz w:val="24"/>
+        </w:rPr>
+        <w:t xml:space="preserve"> Do ponto de vista metodológico, a principal contribuição é o próprio modelo de análise: ao integrar a suavização e a relação sinal-ruído, as derivadas e os limiares, a confirmação multivariada por permutação e a modelagem individual do crescimento em um único fluxo guiado pelas propriedades dos dados, o estudo supera a rotina clássica de ANOVA e testes t — frágil diante da não normalidade e do efeito de piso — e entrega um retrato acionável de onde, quando, quanto e com que confiabilidade o humor muda.</w:t>
       </w:r>
     </w:p>
     <w:p>

</xml_diff>